<commit_message>
docs: agregar Seccion 2 (Arquitectura Tecnica, Diagramas draw.io/Mermaid y UML) al Informe Final DOCX
</commit_message>
<xml_diff>
--- a/doc/INFORME_FINAL_REFUGUIA_PARTE2.docx
+++ b/doc/INFORME_FINAL_REFUGUIA_PARTE2.docx
@@ -1290,6 +1290,1950 @@
         </w:tc>
       </w:tr>
     </w:tbl>
+    <w:p>
+      <w:pPr>
+        <w:spacing w:before="360" w:after="200"/>
+      </w:pPr>
+      <w:r>
+        <w:rPr>
+          <w:rFonts w:ascii="Arial" w:hAnsi="Arial"/>
+          <w:b/>
+          <w:color w:val="1E3A8A"/>
+          <w:sz w:val="32"/>
+        </w:rPr>
+        <w:t>Sección 2 · Arquitectura Técnica del Sistema</w:t>
+      </w:r>
+    </w:p>
+    <w:p>
+      <w:pPr>
+        <w:spacing w:before="200" w:after="80"/>
+      </w:pPr>
+      <w:r>
+        <w:rPr>
+          <w:rFonts w:ascii="Arial" w:hAnsi="Arial"/>
+          <w:b/>
+          <w:color w:val="0D9488"/>
+          <w:sz w:val="25"/>
+        </w:rPr>
+        <w:t>2.1 Diagrama de Arquitectura General del Sistema</w:t>
+      </w:r>
+    </w:p>
+    <w:p>
+      <w:pPr>
+        <w:spacing w:line="276" w:lineRule="auto" w:after="160"/>
+      </w:pPr>
+      <w:r>
+        <w:rPr>
+          <w:rFonts w:ascii="Arial" w:hAnsi="Arial"/>
+          <w:color w:val="0F172A"/>
+          <w:sz w:val="19"/>
+        </w:rPr>
+        <w:t>La arquitectura de RefuGuía está diseñada bajo un paradigma desacoplado y 100% On-Premise para escenarios de contingencia y desastre natural. Distingue con claridad los componentes basados en Inteligencia Artificial Generativa y Visión por Computadora de aquellos gobernados por lógica transaccional determinista tradicional y auditoría criptográfica inmutable.</w:t>
+      </w:r>
+    </w:p>
+    <w:tbl>
+      <w:tblPr>
+        <w:tblW w:type="auto" w:w="0"/>
+        <w:jc w:val="center"/>
+        <w:tblLook w:firstColumn="1" w:firstRow="1" w:lastColumn="0" w:lastRow="0" w:noHBand="0" w:noVBand="1" w:val="04A0"/>
+      </w:tblPr>
+      <w:tblGrid>
+        <w:gridCol w:w="9360"/>
+      </w:tblGrid>
+      <w:tr>
+        <w:tc>
+          <w:tcPr>
+            <w:tcW w:type="dxa" w:w="9360"/>
+            <w:shd w:fill="0F172A"/>
+            <w:tcMar>
+              <w:top w:w="120" w:type="dxa"/>
+              <w:bottom w:w="120" w:type="dxa"/>
+              <w:left w:w="160" w:type="dxa"/>
+              <w:right w:w="160" w:type="dxa"/>
+            </w:tcMar>
+          </w:tcPr>
+          <w:p>
+            <w:pPr>
+              <w:spacing w:after="80"/>
+            </w:pPr>
+            <w:r>
+              <w:rPr>
+                <w:rFonts w:ascii="Arial" w:hAnsi="Arial"/>
+                <w:b/>
+                <w:color w:val="38BDF8"/>
+                <w:sz w:val="18"/>
+              </w:rPr>
+              <w:t>📌 DIAGRAMA DE ARQUITECTURA GENERAL (DRAW.IO / MERMAID) (Compatible con draw.io &amp; Mermaid):</w:t>
+            </w:r>
+          </w:p>
+          <w:p>
+            <w:pPr>
+              <w:spacing w:line="252" w:lineRule="auto" w:after="0"/>
+            </w:pPr>
+            <w:r>
+              <w:rPr>
+                <w:rFonts w:ascii="Courier New" w:hAnsi="Courier New"/>
+                <w:color w:val="CBD5E1"/>
+                <w:sz w:val="16"/>
+              </w:rPr>
+              <w:t>graph TD</w:t>
+              <w:br/>
+              <w:t xml:space="preserve">    subgraph FRONTEND ["CAPA DE PRESENTACIÓN (Lógica Tradicional)"]</w:t>
+              <w:br/>
+              <w:t xml:space="preserve">        UI["SPA Vue.js 3 + Vite + SweetAlert2"]</w:t>
+              <w:br/>
+              <w:t xml:space="preserve">        ROUTER["Vue Router con Guardias RBAC"]</w:t>
+              <w:br/>
+              <w:t xml:space="preserve">        USER_ACTORS["Usuarios: Coordinadora / Rescatista / Damnificada / Adoptante"]</w:t>
+              <w:br/>
+              <w:t xml:space="preserve">    end</w:t>
+              <w:br/>
+              <w:br/>
+              <w:t xml:space="preserve">    subgraph BACKEND ["CAPA DE APLICACIÓN &amp; NEGOCIO (Laravel 11 REST API)"]</w:t>
+              <w:br/>
+              <w:t xml:space="preserve">        AUTH_SANCTUM["Auth &amp; Control de Sesiones RBAC"]</w:t>
+              <w:br/>
+              <w:t xml:space="preserve">        MCP_SERVER["Servidor MCP 2026.1 (Model Context Protocol)"]</w:t>
+              <w:br/>
+              <w:t xml:space="preserve">        PET_CTRL["Controlador de Mascotas &amp; Ingesta"]</w:t>
+              <w:br/>
+              <w:t xml:space="preserve">        CLINIC_CTRL["Auditor Clínico SHA-256 &amp; Bloqueo QR"]</w:t>
+              <w:br/>
+              <w:t xml:space="preserve">        MATCH_CTRL["Motor de Reencuentro &amp; Emparejamiento"]</w:t>
+              <w:br/>
+              <w:t xml:space="preserve">    end</w:t>
+              <w:br/>
+              <w:br/>
+              <w:t xml:space="preserve">    subgraph AI_LOCAL ["CAPA DE INTELIGENCIA ARTIFICIAL (100% On-Premise)"]</w:t>
+              <w:br/>
+              <w:t xml:space="preserve">        OLLAMA_SLM["SLM Qwen 2.5:1.5B (NLP, JSON, Embeddings)"]</w:t>
+              <w:br/>
+              <w:t xml:space="preserve">        OLLAMA_VLM["VLM Moondream:latest (Peritaje Visual de Píxeles)"]</w:t>
+              <w:br/>
+              <w:t xml:space="preserve">        CHROMA_DB["Base de Datos Vectorial ChromaDB v2 (K-NN Cosine)"]</w:t>
+              <w:br/>
+              <w:t xml:space="preserve">    end</w:t>
+              <w:br/>
+              <w:br/>
+              <w:t xml:space="preserve">    subgraph STORAGE ["CAPA DE PERSISTENCIA &amp; MEMORIA"]</w:t>
+              <w:br/>
+              <w:t xml:space="preserve">        MYSQL_DB[("MySQL 8.0 Relacional: Mascotas, Usuarios, Fármacos")]</w:t>
+              <w:br/>
+              <w:t xml:space="preserve">        DISK_MD[("Sistema de Archivos: Skills Markdown .md")]</w:t>
+              <w:br/>
+              <w:t xml:space="preserve">        CHROMA_STORE[("Chroma Vectors Storage: Colección refuguia_pets")]</w:t>
+              <w:br/>
+              <w:t xml:space="preserve">    end</w:t>
+              <w:br/>
+              <w:br/>
+              <w:t xml:space="preserve">    USER_ACTORS --&gt; UI</w:t>
+              <w:br/>
+              <w:t xml:space="preserve">    UI --&gt; ROUTER</w:t>
+              <w:br/>
+              <w:t xml:space="preserve">    ROUTER --&gt; PET_CTRL</w:t>
+              <w:br/>
+              <w:t xml:space="preserve">    ROUTER --&gt; CLINIC_CTRL</w:t>
+              <w:br/>
+              <w:t xml:space="preserve">    ROUTER --&gt; MATCH_CTRL</w:t>
+              <w:br/>
+              <w:t xml:space="preserve">    </w:t>
+              <w:br/>
+              <w:t xml:space="preserve">    PET_CTRL --&gt; MCP_SERVER</w:t>
+              <w:br/>
+              <w:t xml:space="preserve">    MATCH_CTRL --&gt; MCP_SERVER</w:t>
+              <w:br/>
+              <w:t xml:space="preserve">    CLINIC_CTRL --&gt; MYSQL_DB</w:t>
+              <w:br/>
+              <w:t xml:space="preserve">    </w:t>
+              <w:br/>
+              <w:t xml:space="preserve">    MCP_SERVER --&gt; OLLAMA_SLM</w:t>
+              <w:br/>
+              <w:t xml:space="preserve">    MCP_SERVER --&gt; OLLAMA_VLM</w:t>
+              <w:br/>
+              <w:t xml:space="preserve">    MCP_SERVER --&gt; CHROMA_DB</w:t>
+              <w:br/>
+              <w:t xml:space="preserve">    </w:t>
+              <w:br/>
+              <w:t xml:space="preserve">    PET_CTRL --&gt; MYSQL_DB</w:t>
+              <w:br/>
+              <w:t xml:space="preserve">    MCP_SERVER --&gt; DISK_MD</w:t>
+              <w:br/>
+              <w:t xml:space="preserve">    CHROMA_DB --&gt; CHROMA_STORE</w:t>
+            </w:r>
+          </w:p>
+        </w:tc>
+      </w:tr>
+    </w:tbl>
+    <w:p>
+      <w:pPr>
+        <w:spacing w:after="120"/>
+      </w:pPr>
+    </w:p>
+    <w:p>
+      <w:pPr>
+        <w:spacing w:before="160" w:after="80"/>
+      </w:pPr>
+      <w:r>
+        <w:rPr>
+          <w:rFonts w:ascii="Arial" w:hAnsi="Arial"/>
+          <w:b/>
+          <w:color w:val="1E3A8A"/>
+          <w:sz w:val="20"/>
+        </w:rPr>
+        <w:t>Tabla 2.1: Clasificación de Componentes Tecnológicos y Flujo de Memoria</w:t>
+      </w:r>
+    </w:p>
+    <w:tbl>
+      <w:tblPr>
+        <w:tblW w:type="auto" w:w="0"/>
+        <w:jc w:val="center"/>
+        <w:tblLayout w:type="fixed"/>
+        <w:tblLook w:firstColumn="1" w:firstRow="1" w:lastColumn="0" w:lastRow="0" w:noHBand="0" w:noVBand="1" w:val="04A0"/>
+      </w:tblPr>
+      <w:tblGrid>
+        <w:gridCol w:w="2340"/>
+        <w:gridCol w:w="2340"/>
+        <w:gridCol w:w="2340"/>
+        <w:gridCol w:w="2340"/>
+      </w:tblGrid>
+      <w:tr>
+        <w:tc>
+          <w:tcPr>
+            <w:tcW w:type="dxa" w:w="2304"/>
+            <w:shd w:fill="1E3A8A"/>
+            <w:tcMar>
+              <w:top w:w="100" w:type="dxa"/>
+              <w:bottom w:w="100" w:type="dxa"/>
+              <w:left w:w="120" w:type="dxa"/>
+              <w:right w:w="120" w:type="dxa"/>
+            </w:tcMar>
+          </w:tcPr>
+          <w:p>
+            <w:r>
+              <w:rPr>
+                <w:rFonts w:ascii="Arial" w:hAnsi="Arial"/>
+                <w:b/>
+                <w:color w:val="FFFFFF"/>
+                <w:sz w:val="18"/>
+              </w:rPr>
+              <w:t>Componente del Sistema</w:t>
+            </w:r>
+          </w:p>
+        </w:tc>
+        <w:tc>
+          <w:tcPr>
+            <w:tcW w:type="dxa" w:w="2160"/>
+            <w:shd w:fill="1E3A8A"/>
+            <w:tcMar>
+              <w:top w:w="100" w:type="dxa"/>
+              <w:bottom w:w="100" w:type="dxa"/>
+              <w:left w:w="120" w:type="dxa"/>
+              <w:right w:w="120" w:type="dxa"/>
+            </w:tcMar>
+          </w:tcPr>
+          <w:p>
+            <w:r>
+              <w:rPr>
+                <w:rFonts w:ascii="Arial" w:hAnsi="Arial"/>
+                <w:b/>
+                <w:color w:val="FFFFFF"/>
+                <w:sz w:val="18"/>
+              </w:rPr>
+              <w:t>Naturaleza (IA vs Tradicional)</w:t>
+            </w:r>
+          </w:p>
+        </w:tc>
+        <w:tc>
+          <w:tcPr>
+            <w:tcW w:type="dxa" w:w="2304"/>
+            <w:shd w:fill="1E3A8A"/>
+            <w:tcMar>
+              <w:top w:w="100" w:type="dxa"/>
+              <w:bottom w:w="100" w:type="dxa"/>
+              <w:left w:w="120" w:type="dxa"/>
+              <w:right w:w="120" w:type="dxa"/>
+            </w:tcMar>
+          </w:tcPr>
+          <w:p>
+            <w:r>
+              <w:rPr>
+                <w:rFonts w:ascii="Arial" w:hAnsi="Arial"/>
+                <w:b/>
+                <w:color w:val="FFFFFF"/>
+                <w:sz w:val="18"/>
+              </w:rPr>
+              <w:t>Tecnología / Motor</w:t>
+            </w:r>
+          </w:p>
+        </w:tc>
+        <w:tc>
+          <w:tcPr>
+            <w:tcW w:type="dxa" w:w="2592"/>
+            <w:shd w:fill="1E3A8A"/>
+            <w:tcMar>
+              <w:top w:w="100" w:type="dxa"/>
+              <w:bottom w:w="100" w:type="dxa"/>
+              <w:left w:w="120" w:type="dxa"/>
+              <w:right w:w="120" w:type="dxa"/>
+            </w:tcMar>
+          </w:tcPr>
+          <w:p>
+            <w:r>
+              <w:rPr>
+                <w:rFonts w:ascii="Arial" w:hAnsi="Arial"/>
+                <w:b/>
+                <w:color w:val="FFFFFF"/>
+                <w:sz w:val="18"/>
+              </w:rPr>
+              <w:t>Ubicación de Memoria Persistente</w:t>
+            </w:r>
+          </w:p>
+        </w:tc>
+      </w:tr>
+      <w:tr>
+        <w:tc>
+          <w:tcPr>
+            <w:tcW w:type="dxa" w:w="2304"/>
+            <w:shd w:fill="F8FAFC"/>
+            <w:tcMar>
+              <w:top w:w="80" w:type="dxa"/>
+              <w:bottom w:w="80" w:type="dxa"/>
+              <w:left w:w="120" w:type="dxa"/>
+              <w:right w:w="120" w:type="dxa"/>
+            </w:tcMar>
+          </w:tcPr>
+          <w:p>
+            <w:r>
+              <w:rPr>
+                <w:rFonts w:ascii="Arial" w:hAnsi="Arial"/>
+                <w:b/>
+                <w:color w:val="0F172A"/>
+                <w:sz w:val="17"/>
+              </w:rPr>
+              <w:t>Ingesta NLP &amp; Extracción JSON</w:t>
+            </w:r>
+          </w:p>
+        </w:tc>
+        <w:tc>
+          <w:tcPr>
+            <w:tcW w:type="dxa" w:w="2160"/>
+            <w:shd w:fill="F8FAFC"/>
+            <w:tcMar>
+              <w:top w:w="80" w:type="dxa"/>
+              <w:bottom w:w="80" w:type="dxa"/>
+              <w:left w:w="120" w:type="dxa"/>
+              <w:right w:w="120" w:type="dxa"/>
+            </w:tcMar>
+          </w:tcPr>
+          <w:p>
+            <w:r>
+              <w:rPr>
+                <w:rFonts w:ascii="Arial" w:hAnsi="Arial"/>
+                <w:color w:val="0F172A"/>
+                <w:sz w:val="17"/>
+              </w:rPr>
+              <w:t>Inteligencia Artificial (SLM)</w:t>
+            </w:r>
+          </w:p>
+        </w:tc>
+        <w:tc>
+          <w:tcPr>
+            <w:tcW w:type="dxa" w:w="2304"/>
+            <w:shd w:fill="F8FAFC"/>
+            <w:tcMar>
+              <w:top w:w="80" w:type="dxa"/>
+              <w:bottom w:w="80" w:type="dxa"/>
+              <w:left w:w="120" w:type="dxa"/>
+              <w:right w:w="120" w:type="dxa"/>
+            </w:tcMar>
+          </w:tcPr>
+          <w:p>
+            <w:r>
+              <w:rPr>
+                <w:rFonts w:ascii="Arial" w:hAnsi="Arial"/>
+                <w:color w:val="0F172A"/>
+                <w:sz w:val="17"/>
+              </w:rPr>
+              <w:t>Qwen 2.5:1.5B (Ollama Local)</w:t>
+            </w:r>
+          </w:p>
+        </w:tc>
+        <w:tc>
+          <w:tcPr>
+            <w:tcW w:type="dxa" w:w="2592"/>
+            <w:shd w:fill="F8FAFC"/>
+            <w:tcMar>
+              <w:top w:w="80" w:type="dxa"/>
+              <w:bottom w:w="80" w:type="dxa"/>
+              <w:left w:w="120" w:type="dxa"/>
+              <w:right w:w="120" w:type="dxa"/>
+            </w:tcMar>
+          </w:tcPr>
+          <w:p>
+            <w:r>
+              <w:rPr>
+                <w:rFonts w:ascii="Arial" w:hAnsi="Arial"/>
+                <w:color w:val="0F172A"/>
+                <w:sz w:val="17"/>
+              </w:rPr>
+              <w:t>Sin estado en memoria RAM; estructura persistida en MySQL.</w:t>
+            </w:r>
+          </w:p>
+        </w:tc>
+      </w:tr>
+      <w:tr>
+        <w:tc>
+          <w:tcPr>
+            <w:tcW w:type="dxa" w:w="2304"/>
+            <w:shd w:fill="FFFFFF"/>
+            <w:tcMar>
+              <w:top w:w="80" w:type="dxa"/>
+              <w:bottom w:w="80" w:type="dxa"/>
+              <w:left w:w="120" w:type="dxa"/>
+              <w:right w:w="120" w:type="dxa"/>
+            </w:tcMar>
+          </w:tcPr>
+          <w:p>
+            <w:r>
+              <w:rPr>
+                <w:rFonts w:ascii="Arial" w:hAnsi="Arial"/>
+                <w:b/>
+                <w:color w:val="0F172A"/>
+                <w:sz w:val="17"/>
+              </w:rPr>
+              <w:t>Peritaje Visual de Fotografías</w:t>
+            </w:r>
+          </w:p>
+        </w:tc>
+        <w:tc>
+          <w:tcPr>
+            <w:tcW w:type="dxa" w:w="2160"/>
+            <w:shd w:fill="FFFFFF"/>
+            <w:tcMar>
+              <w:top w:w="80" w:type="dxa"/>
+              <w:bottom w:w="80" w:type="dxa"/>
+              <w:left w:w="120" w:type="dxa"/>
+              <w:right w:w="120" w:type="dxa"/>
+            </w:tcMar>
+          </w:tcPr>
+          <w:p>
+            <w:r>
+              <w:rPr>
+                <w:rFonts w:ascii="Arial" w:hAnsi="Arial"/>
+                <w:color w:val="0F172A"/>
+                <w:sz w:val="17"/>
+              </w:rPr>
+              <w:t>Inteligencia Artificial (VLM)</w:t>
+            </w:r>
+          </w:p>
+        </w:tc>
+        <w:tc>
+          <w:tcPr>
+            <w:tcW w:type="dxa" w:w="2304"/>
+            <w:shd w:fill="FFFFFF"/>
+            <w:tcMar>
+              <w:top w:w="80" w:type="dxa"/>
+              <w:bottom w:w="80" w:type="dxa"/>
+              <w:left w:w="120" w:type="dxa"/>
+              <w:right w:w="120" w:type="dxa"/>
+            </w:tcMar>
+          </w:tcPr>
+          <w:p>
+            <w:r>
+              <w:rPr>
+                <w:rFonts w:ascii="Arial" w:hAnsi="Arial"/>
+                <w:color w:val="0F172A"/>
+                <w:sz w:val="17"/>
+              </w:rPr>
+              <w:t>Moondream:latest (1.4B ViT+Phi)</w:t>
+            </w:r>
+          </w:p>
+        </w:tc>
+        <w:tc>
+          <w:tcPr>
+            <w:tcW w:type="dxa" w:w="2592"/>
+            <w:shd w:fill="FFFFFF"/>
+            <w:tcMar>
+              <w:top w:w="80" w:type="dxa"/>
+              <w:bottom w:w="80" w:type="dxa"/>
+              <w:left w:w="120" w:type="dxa"/>
+              <w:right w:w="120" w:type="dxa"/>
+            </w:tcMar>
+          </w:tcPr>
+          <w:p>
+            <w:r>
+              <w:rPr>
+                <w:rFonts w:ascii="Arial" w:hAnsi="Arial"/>
+                <w:color w:val="0F172A"/>
+                <w:sz w:val="17"/>
+              </w:rPr>
+              <w:t>Inferencia en memoria GPU/CPU; dictamen guardado en MySQL.</w:t>
+            </w:r>
+          </w:p>
+        </w:tc>
+      </w:tr>
+      <w:tr>
+        <w:tc>
+          <w:tcPr>
+            <w:tcW w:type="dxa" w:w="2304"/>
+            <w:shd w:fill="F8FAFC"/>
+            <w:tcMar>
+              <w:top w:w="80" w:type="dxa"/>
+              <w:bottom w:w="80" w:type="dxa"/>
+              <w:left w:w="120" w:type="dxa"/>
+              <w:right w:w="120" w:type="dxa"/>
+            </w:tcMar>
+          </w:tcPr>
+          <w:p>
+            <w:r>
+              <w:rPr>
+                <w:rFonts w:ascii="Arial" w:hAnsi="Arial"/>
+                <w:b/>
+                <w:color w:val="0F172A"/>
+                <w:sz w:val="17"/>
+              </w:rPr>
+              <w:t>Búsqueda Semántica K-NN</w:t>
+            </w:r>
+          </w:p>
+        </w:tc>
+        <w:tc>
+          <w:tcPr>
+            <w:tcW w:type="dxa" w:w="2160"/>
+            <w:shd w:fill="F8FAFC"/>
+            <w:tcMar>
+              <w:top w:w="80" w:type="dxa"/>
+              <w:bottom w:w="80" w:type="dxa"/>
+              <w:left w:w="120" w:type="dxa"/>
+              <w:right w:w="120" w:type="dxa"/>
+            </w:tcMar>
+          </w:tcPr>
+          <w:p>
+            <w:r>
+              <w:rPr>
+                <w:rFonts w:ascii="Arial" w:hAnsi="Arial"/>
+                <w:color w:val="0F172A"/>
+                <w:sz w:val="17"/>
+              </w:rPr>
+              <w:t>Inteligencia Artificial (RAG)</w:t>
+            </w:r>
+          </w:p>
+        </w:tc>
+        <w:tc>
+          <w:tcPr>
+            <w:tcW w:type="dxa" w:w="2304"/>
+            <w:shd w:fill="F8FAFC"/>
+            <w:tcMar>
+              <w:top w:w="80" w:type="dxa"/>
+              <w:bottom w:w="80" w:type="dxa"/>
+              <w:left w:w="120" w:type="dxa"/>
+              <w:right w:w="120" w:type="dxa"/>
+            </w:tcMar>
+          </w:tcPr>
+          <w:p>
+            <w:r>
+              <w:rPr>
+                <w:rFonts w:ascii="Arial" w:hAnsi="Arial"/>
+                <w:color w:val="0F172A"/>
+                <w:sz w:val="17"/>
+              </w:rPr>
+              <w:t>ChromaDB v2 (Cosine Distance)</w:t>
+            </w:r>
+          </w:p>
+        </w:tc>
+        <w:tc>
+          <w:tcPr>
+            <w:tcW w:type="dxa" w:w="2592"/>
+            <w:shd w:fill="F8FAFC"/>
+            <w:tcMar>
+              <w:top w:w="80" w:type="dxa"/>
+              <w:bottom w:w="80" w:type="dxa"/>
+              <w:left w:w="120" w:type="dxa"/>
+              <w:right w:w="120" w:type="dxa"/>
+            </w:tcMar>
+          </w:tcPr>
+          <w:p>
+            <w:r>
+              <w:rPr>
+                <w:rFonts w:ascii="Arial" w:hAnsi="Arial"/>
+                <w:color w:val="0F172A"/>
+                <w:sz w:val="17"/>
+              </w:rPr>
+              <w:t>Espacio vectorial persistido en disco (sqlite3/chroma_data).</w:t>
+            </w:r>
+          </w:p>
+        </w:tc>
+      </w:tr>
+      <w:tr>
+        <w:tc>
+          <w:tcPr>
+            <w:tcW w:type="dxa" w:w="2304"/>
+            <w:shd w:fill="FFFFFF"/>
+            <w:tcMar>
+              <w:top w:w="80" w:type="dxa"/>
+              <w:bottom w:w="80" w:type="dxa"/>
+              <w:left w:w="120" w:type="dxa"/>
+              <w:right w:w="120" w:type="dxa"/>
+            </w:tcMar>
+          </w:tcPr>
+          <w:p>
+            <w:r>
+              <w:rPr>
+                <w:rFonts w:ascii="Arial" w:hAnsi="Arial"/>
+                <w:b/>
+                <w:color w:val="0F172A"/>
+                <w:sz w:val="17"/>
+              </w:rPr>
+              <w:t>Auditoría de Fármacos &amp; Hashes</w:t>
+            </w:r>
+          </w:p>
+        </w:tc>
+        <w:tc>
+          <w:tcPr>
+            <w:tcW w:type="dxa" w:w="2160"/>
+            <w:shd w:fill="FFFFFF"/>
+            <w:tcMar>
+              <w:top w:w="80" w:type="dxa"/>
+              <w:bottom w:w="80" w:type="dxa"/>
+              <w:left w:w="120" w:type="dxa"/>
+              <w:right w:w="120" w:type="dxa"/>
+            </w:tcMar>
+          </w:tcPr>
+          <w:p>
+            <w:r>
+              <w:rPr>
+                <w:rFonts w:ascii="Arial" w:hAnsi="Arial"/>
+                <w:color w:val="0F172A"/>
+                <w:sz w:val="17"/>
+              </w:rPr>
+              <w:t>Lógica Tradicional / Cripto</w:t>
+            </w:r>
+          </w:p>
+        </w:tc>
+        <w:tc>
+          <w:tcPr>
+            <w:tcW w:type="dxa" w:w="2304"/>
+            <w:shd w:fill="FFFFFF"/>
+            <w:tcMar>
+              <w:top w:w="80" w:type="dxa"/>
+              <w:bottom w:w="80" w:type="dxa"/>
+              <w:left w:w="120" w:type="dxa"/>
+              <w:right w:w="120" w:type="dxa"/>
+            </w:tcMar>
+          </w:tcPr>
+          <w:p>
+            <w:r>
+              <w:rPr>
+                <w:rFonts w:ascii="Arial" w:hAnsi="Arial"/>
+                <w:color w:val="0F172A"/>
+                <w:sz w:val="17"/>
+              </w:rPr>
+              <w:t>PHP 8.2 / SHA-256 Chaining</w:t>
+            </w:r>
+          </w:p>
+        </w:tc>
+        <w:tc>
+          <w:tcPr>
+            <w:tcW w:type="dxa" w:w="2592"/>
+            <w:shd w:fill="FFFFFF"/>
+            <w:tcMar>
+              <w:top w:w="80" w:type="dxa"/>
+              <w:bottom w:w="80" w:type="dxa"/>
+              <w:left w:w="120" w:type="dxa"/>
+              <w:right w:w="120" w:type="dxa"/>
+            </w:tcMar>
+          </w:tcPr>
+          <w:p>
+            <w:r>
+              <w:rPr>
+                <w:rFonts w:ascii="Arial" w:hAnsi="Arial"/>
+                <w:color w:val="0F172A"/>
+                <w:sz w:val="17"/>
+              </w:rPr>
+              <w:t>MySQL 8.0 (Campos hash_sha256 inmutables).</w:t>
+            </w:r>
+          </w:p>
+        </w:tc>
+      </w:tr>
+      <w:tr>
+        <w:tc>
+          <w:tcPr>
+            <w:tcW w:type="dxa" w:w="2304"/>
+            <w:shd w:fill="F8FAFC"/>
+            <w:tcMar>
+              <w:top w:w="80" w:type="dxa"/>
+              <w:bottom w:w="80" w:type="dxa"/>
+              <w:left w:w="120" w:type="dxa"/>
+              <w:right w:w="120" w:type="dxa"/>
+            </w:tcMar>
+          </w:tcPr>
+          <w:p>
+            <w:r>
+              <w:rPr>
+                <w:rFonts w:ascii="Arial" w:hAnsi="Arial"/>
+                <w:b/>
+                <w:color w:val="0F172A"/>
+                <w:sz w:val="17"/>
+              </w:rPr>
+              <w:t>Control de Acceso RBAC &amp; Menú</w:t>
+            </w:r>
+          </w:p>
+        </w:tc>
+        <w:tc>
+          <w:tcPr>
+            <w:tcW w:type="dxa" w:w="2160"/>
+            <w:shd w:fill="F8FAFC"/>
+            <w:tcMar>
+              <w:top w:w="80" w:type="dxa"/>
+              <w:bottom w:w="80" w:type="dxa"/>
+              <w:left w:w="120" w:type="dxa"/>
+              <w:right w:w="120" w:type="dxa"/>
+            </w:tcMar>
+          </w:tcPr>
+          <w:p>
+            <w:r>
+              <w:rPr>
+                <w:rFonts w:ascii="Arial" w:hAnsi="Arial"/>
+                <w:color w:val="0F172A"/>
+                <w:sz w:val="17"/>
+              </w:rPr>
+              <w:t>Lógica Tradicional</w:t>
+            </w:r>
+          </w:p>
+        </w:tc>
+        <w:tc>
+          <w:tcPr>
+            <w:tcW w:type="dxa" w:w="2304"/>
+            <w:shd w:fill="F8FAFC"/>
+            <w:tcMar>
+              <w:top w:w="80" w:type="dxa"/>
+              <w:bottom w:w="80" w:type="dxa"/>
+              <w:left w:w="120" w:type="dxa"/>
+              <w:right w:w="120" w:type="dxa"/>
+            </w:tcMar>
+          </w:tcPr>
+          <w:p>
+            <w:r>
+              <w:rPr>
+                <w:rFonts w:ascii="Arial" w:hAnsi="Arial"/>
+                <w:color w:val="0F172A"/>
+                <w:sz w:val="17"/>
+              </w:rPr>
+              <w:t>Laravel Sanctum / Vue Router Guards</w:t>
+            </w:r>
+          </w:p>
+        </w:tc>
+        <w:tc>
+          <w:tcPr>
+            <w:tcW w:type="dxa" w:w="2592"/>
+            <w:shd w:fill="F8FAFC"/>
+            <w:tcMar>
+              <w:top w:w="80" w:type="dxa"/>
+              <w:bottom w:w="80" w:type="dxa"/>
+              <w:left w:w="120" w:type="dxa"/>
+              <w:right w:w="120" w:type="dxa"/>
+            </w:tcMar>
+          </w:tcPr>
+          <w:p>
+            <w:r>
+              <w:rPr>
+                <w:rFonts w:ascii="Arial" w:hAnsi="Arial"/>
+                <w:color w:val="0F172A"/>
+                <w:sz w:val="17"/>
+              </w:rPr>
+              <w:t>MySQL 8.0 (Tablas users, roles) y LocalStorage.</w:t>
+            </w:r>
+          </w:p>
+        </w:tc>
+      </w:tr>
+    </w:tbl>
+    <w:p>
+      <w:pPr>
+        <w:spacing w:after="160"/>
+      </w:pPr>
+    </w:p>
+    <w:p>
+      <w:pPr>
+        <w:spacing w:before="240" w:after="80"/>
+      </w:pPr>
+      <w:r>
+        <w:rPr>
+          <w:rFonts w:ascii="Arial" w:hAnsi="Arial"/>
+          <w:b/>
+          <w:color w:val="0D9488"/>
+          <w:sz w:val="25"/>
+        </w:rPr>
+        <w:t>2.2 Diagrama de Flujo de Agentes (Orquestación Multi-Agente &amp; Protocolo MCP)</w:t>
+      </w:r>
+    </w:p>
+    <w:p>
+      <w:pPr>
+        <w:spacing w:line="276" w:lineRule="auto" w:after="160"/>
+      </w:pPr>
+      <w:r>
+        <w:rPr>
+          <w:rFonts w:ascii="Arial" w:hAnsi="Arial"/>
+          <w:color w:val="0F172A"/>
+          <w:sz w:val="19"/>
+        </w:rPr>
+        <w:t>El sistema opera bajo una Red de Agentes Especializados coordinados por el Servidor MCP (Model Context Protocol 2026.1). Cada agente posee una responsabilidad atómica, un esquema de entrada/salida formalizado en Markdown (.md) y se comunica a través del MCP Dispatcher:</w:t>
+      </w:r>
+    </w:p>
+    <w:tbl>
+      <w:tblPr>
+        <w:tblW w:type="auto" w:w="0"/>
+        <w:jc w:val="center"/>
+        <w:tblLook w:firstColumn="1" w:firstRow="1" w:lastColumn="0" w:lastRow="0" w:noHBand="0" w:noVBand="1" w:val="04A0"/>
+      </w:tblPr>
+      <w:tblGrid>
+        <w:gridCol w:w="9360"/>
+      </w:tblGrid>
+      <w:tr>
+        <w:tc>
+          <w:tcPr>
+            <w:tcW w:type="dxa" w:w="9360"/>
+            <w:shd w:fill="0F172A"/>
+            <w:tcMar>
+              <w:top w:w="120" w:type="dxa"/>
+              <w:bottom w:w="120" w:type="dxa"/>
+              <w:left w:w="160" w:type="dxa"/>
+              <w:right w:w="160" w:type="dxa"/>
+            </w:tcMar>
+          </w:tcPr>
+          <w:p>
+            <w:pPr>
+              <w:spacing w:after="80"/>
+            </w:pPr>
+            <w:r>
+              <w:rPr>
+                <w:rFonts w:ascii="Arial" w:hAnsi="Arial"/>
+                <w:b/>
+                <w:color w:val="38BDF8"/>
+                <w:sz w:val="18"/>
+              </w:rPr>
+              <w:t>📌 DIAGRAMA DE SECUENCIA MULTI-AGENTE (MCP 2026.1) (Compatible con draw.io &amp; Mermaid):</w:t>
+            </w:r>
+          </w:p>
+          <w:p>
+            <w:pPr>
+              <w:spacing w:line="252" w:lineRule="auto" w:after="0"/>
+            </w:pPr>
+            <w:r>
+              <w:rPr>
+                <w:rFonts w:ascii="Courier New" w:hAnsi="Courier New"/>
+                <w:color w:val="CBD5E1"/>
+                <w:sz w:val="16"/>
+              </w:rPr>
+              <w:t>sequenceDiagram</w:t>
+              <w:br/>
+              <w:t xml:space="preserve">    autonumber</w:t>
+              <w:br/>
+              <w:t xml:space="preserve">    actor Usuario as Damnificada / Rescatista</w:t>
+              <w:br/>
+              <w:t xml:space="preserve">    participant UI as Chat / Portal Vue.js</w:t>
+              <w:br/>
+              <w:t xml:space="preserve">    participant MCP as Servidor MCP (Dispatcher)</w:t>
+              <w:br/>
+              <w:t xml:space="preserve">    participant A_NLP as Agente_NLP_Ingesta (Qwen 2.5)</w:t>
+              <w:br/>
+              <w:t xml:space="preserve">    participant A_VLM as Agente_Peritaje_Visual (Moondream)</w:t>
+              <w:br/>
+              <w:t xml:space="preserve">    participant A_MATCH as Agente_Matchmaker (ChromaDB)</w:t>
+              <w:br/>
+              <w:t xml:space="preserve">    participant A_AUDIT as Agente_Auditor_Legal (Regla 15d)</w:t>
+              <w:br/>
+              <w:t xml:space="preserve">    participant DB as MySQL &amp; ChromaDB</w:t>
+              <w:br/>
+              <w:br/>
+              <w:t xml:space="preserve">    Usuario-&gt;&gt;UI: Envía relato ("Perdí a Toby en Catia") + Foto</w:t>
+              <w:br/>
+              <w:t xml:space="preserve">    UI-&gt;&gt;MCP: POST /api/pets/report-citizen</w:t>
+              <w:br/>
+              <w:t xml:space="preserve">    </w:t>
+              <w:br/>
+              <w:t xml:space="preserve">    rect rgb(240, 249, 255)</w:t>
+              <w:br/>
+              <w:t xml:space="preserve">        note over MCP, A_NLP: 1. Fase de Ingesta &amp; Sanitización</w:t>
+              <w:br/>
+              <w:t xml:space="preserve">        MCP-&gt;&gt;A_NLP: sanitizeInput() + extractEntities()</w:t>
+              <w:br/>
+              <w:t xml:space="preserve">        A_NLP--&gt;&gt;MCP: JSON {species: "canine", breed: "Mestizo", color: "Negro"}</w:t>
+              <w:br/>
+              <w:t xml:space="preserve">    end</w:t>
+              <w:br/>
+              <w:br/>
+              <w:t xml:space="preserve">    rect rgb(254, 243, 199)</w:t>
+              <w:br/>
+              <w:t xml:space="preserve">        note over MCP, A_VLM: 2. Fase de Peritaje Visual</w:t>
+              <w:br/>
+              <w:t xml:space="preserve">        MCP-&gt;&gt;A_VLM: analyzePetImage(photo_url)</w:t>
+              <w:br/>
+              <w:t xml:space="preserve">        A_VLM--&gt;&gt;MCP: Dictamen {manto: "bicolor negro/blanco", orejas: "semicaídas"}</w:t>
+              <w:br/>
+              <w:t xml:space="preserve">    end</w:t>
+              <w:br/>
+              <w:br/>
+              <w:t xml:space="preserve">    MCP-&gt;&gt;DB: Persistir Mascota + Indexar Vector (ChromaDB)</w:t>
+              <w:br/>
+              <w:br/>
+              <w:t xml:space="preserve">    rect rgb(236, 253, 245)</w:t>
+              <w:br/>
+              <w:t xml:space="preserve">        note over MCP, A_MATCH: 3. Fase de Emparejamiento Vectorial K-NN</w:t>
+              <w:br/>
+              <w:t xml:space="preserve">        MCP-&gt;&gt;A_MATCH: skill_calcular_similitud_vectorial(lost_id, found_id)</w:t>
+              <w:br/>
+              <w:t xml:space="preserve">        A_MATCH-&gt;&gt;A_VLM: comparePetPhotos(foto_lost, foto_found)</w:t>
+              <w:br/>
+              <w:t xml:space="preserve">        A_VLM--&gt;&gt;A_MATCH: Score Visual 100%</w:t>
+              <w:br/>
+              <w:t xml:space="preserve">        A_MATCH--&gt;&gt;MCP: Similitud Global 98.5% (Match Confirmado)</w:t>
+              <w:br/>
+              <w:t xml:space="preserve">    end</w:t>
+              <w:br/>
+              <w:br/>
+              <w:t xml:space="preserve">    rect rgb(254, 226, 226)</w:t>
+              <w:br/>
+              <w:t xml:space="preserve">        note over MCP, A_AUDIT: 4. Fase de Auditoría Legal &amp; Adopción</w:t>
+              <w:br/>
+              <w:t xml:space="preserve">        MCP-&gt;&gt;A_AUDIT: skill_verificar_periodo_gracia(pet_id)</w:t>
+              <w:br/>
+              <w:t xml:space="preserve">        A_AUDIT--&gt;&gt;MCP: Bloqueo: Faltan X días para cumplir período de 15d</w:t>
+              <w:br/>
+              <w:t xml:space="preserve">    end</w:t>
+              <w:br/>
+              <w:br/>
+              <w:t xml:space="preserve">    MCP--&gt;&gt;UI: Respuesta Multimodal Estructurada + Notificación de Match</w:t>
+              <w:br/>
+              <w:t xml:space="preserve">    UI--&gt;&gt;Usuario: Muestra tarjeta de coincidencia sin tecnicismos</w:t>
+            </w:r>
+          </w:p>
+        </w:tc>
+      </w:tr>
+    </w:tbl>
+    <w:p>
+      <w:pPr>
+        <w:spacing w:after="120"/>
+      </w:pPr>
+    </w:p>
+    <w:p>
+      <w:pPr>
+        <w:spacing w:before="160" w:after="80"/>
+      </w:pPr>
+      <w:r>
+        <w:rPr>
+          <w:rFonts w:ascii="Arial" w:hAnsi="Arial"/>
+          <w:b/>
+          <w:color w:val="1E3A8A"/>
+          <w:sz w:val="20"/>
+        </w:rPr>
+        <w:t>Tabla 2.2: Catálogo de Agentes, Decisiones y Protocolo de Comunicación</w:t>
+      </w:r>
+    </w:p>
+    <w:tbl>
+      <w:tblPr>
+        <w:tblW w:type="auto" w:w="0"/>
+        <w:jc w:val="center"/>
+        <w:tblLayout w:type="fixed"/>
+        <w:tblLook w:firstColumn="1" w:firstRow="1" w:lastColumn="0" w:lastRow="0" w:noHBand="0" w:noVBand="1" w:val="04A0"/>
+      </w:tblPr>
+      <w:tblGrid>
+        <w:gridCol w:w="2340"/>
+        <w:gridCol w:w="2340"/>
+        <w:gridCol w:w="2340"/>
+        <w:gridCol w:w="2340"/>
+      </w:tblGrid>
+      <w:tr>
+        <w:tc>
+          <w:tcPr>
+            <w:tcW w:type="dxa" w:w="2160"/>
+            <w:shd w:fill="1E3A8A"/>
+            <w:tcMar>
+              <w:top w:w="100" w:type="dxa"/>
+              <w:bottom w:w="100" w:type="dxa"/>
+              <w:left w:w="120" w:type="dxa"/>
+              <w:right w:w="120" w:type="dxa"/>
+            </w:tcMar>
+          </w:tcPr>
+          <w:p>
+            <w:r>
+              <w:rPr>
+                <w:rFonts w:ascii="Arial" w:hAnsi="Arial"/>
+                <w:b/>
+                <w:color w:val="FFFFFF"/>
+                <w:sz w:val="18"/>
+              </w:rPr>
+              <w:t>Agente MCP</w:t>
+            </w:r>
+          </w:p>
+        </w:tc>
+        <w:tc>
+          <w:tcPr>
+            <w:tcW w:type="dxa" w:w="2304"/>
+            <w:shd w:fill="1E3A8A"/>
+            <w:tcMar>
+              <w:top w:w="100" w:type="dxa"/>
+              <w:bottom w:w="100" w:type="dxa"/>
+              <w:left w:w="120" w:type="dxa"/>
+              <w:right w:w="120" w:type="dxa"/>
+            </w:tcMar>
+          </w:tcPr>
+          <w:p>
+            <w:r>
+              <w:rPr>
+                <w:rFonts w:ascii="Arial" w:hAnsi="Arial"/>
+                <w:b/>
+                <w:color w:val="FFFFFF"/>
+                <w:sz w:val="18"/>
+              </w:rPr>
+              <w:t>Skill Ejecutada</w:t>
+            </w:r>
+          </w:p>
+        </w:tc>
+        <w:tc>
+          <w:tcPr>
+            <w:tcW w:type="dxa" w:w="3168"/>
+            <w:shd w:fill="1E3A8A"/>
+            <w:tcMar>
+              <w:top w:w="100" w:type="dxa"/>
+              <w:bottom w:w="100" w:type="dxa"/>
+              <w:left w:w="120" w:type="dxa"/>
+              <w:right w:w="120" w:type="dxa"/>
+            </w:tcMar>
+          </w:tcPr>
+          <w:p>
+            <w:r>
+              <w:rPr>
+                <w:rFonts w:ascii="Arial" w:hAnsi="Arial"/>
+                <w:b/>
+                <w:color w:val="FFFFFF"/>
+                <w:sz w:val="18"/>
+              </w:rPr>
+              <w:t>Decisión o Tarea Crítica que Resuelve</w:t>
+            </w:r>
+          </w:p>
+        </w:tc>
+        <w:tc>
+          <w:tcPr>
+            <w:tcW w:type="dxa" w:w="1728"/>
+            <w:shd w:fill="1E3A8A"/>
+            <w:tcMar>
+              <w:top w:w="100" w:type="dxa"/>
+              <w:bottom w:w="100" w:type="dxa"/>
+              <w:left w:w="120" w:type="dxa"/>
+              <w:right w:w="120" w:type="dxa"/>
+            </w:tcMar>
+          </w:tcPr>
+          <w:p>
+            <w:r>
+              <w:rPr>
+                <w:rFonts w:ascii="Arial" w:hAnsi="Arial"/>
+                <w:b/>
+                <w:color w:val="FFFFFF"/>
+                <w:sz w:val="18"/>
+              </w:rPr>
+              <w:t>Protocolo y Formato</w:t>
+            </w:r>
+          </w:p>
+        </w:tc>
+      </w:tr>
+      <w:tr>
+        <w:tc>
+          <w:tcPr>
+            <w:tcW w:type="dxa" w:w="2160"/>
+            <w:shd w:fill="F8FAFC"/>
+            <w:tcMar>
+              <w:top w:w="80" w:type="dxa"/>
+              <w:bottom w:w="80" w:type="dxa"/>
+              <w:left w:w="120" w:type="dxa"/>
+              <w:right w:w="120" w:type="dxa"/>
+            </w:tcMar>
+          </w:tcPr>
+          <w:p>
+            <w:r>
+              <w:rPr>
+                <w:rFonts w:ascii="Arial" w:hAnsi="Arial"/>
+                <w:b/>
+                <w:color w:val="0F172A"/>
+                <w:sz w:val="17"/>
+              </w:rPr>
+              <w:t>Agente_NLP_Ingesta</w:t>
+            </w:r>
+          </w:p>
+        </w:tc>
+        <w:tc>
+          <w:tcPr>
+            <w:tcW w:type="dxa" w:w="2304"/>
+            <w:shd w:fill="F8FAFC"/>
+            <w:tcMar>
+              <w:top w:w="80" w:type="dxa"/>
+              <w:bottom w:w="80" w:type="dxa"/>
+              <w:left w:w="120" w:type="dxa"/>
+              <w:right w:w="120" w:type="dxa"/>
+            </w:tcMar>
+          </w:tcPr>
+          <w:p>
+            <w:r>
+              <w:rPr>
+                <w:rFonts w:ascii="Arial" w:hAnsi="Arial"/>
+                <w:color w:val="0F172A"/>
+                <w:sz w:val="17"/>
+              </w:rPr>
+              <w:t>skill_extraer_entidades_nlp</w:t>
+            </w:r>
+          </w:p>
+        </w:tc>
+        <w:tc>
+          <w:tcPr>
+            <w:tcW w:type="dxa" w:w="3168"/>
+            <w:shd w:fill="F8FAFC"/>
+            <w:tcMar>
+              <w:top w:w="80" w:type="dxa"/>
+              <w:bottom w:w="80" w:type="dxa"/>
+              <w:left w:w="120" w:type="dxa"/>
+              <w:right w:w="120" w:type="dxa"/>
+            </w:tcMar>
+          </w:tcPr>
+          <w:p>
+            <w:r>
+              <w:rPr>
+                <w:rFonts w:ascii="Arial" w:hAnsi="Arial"/>
+                <w:color w:val="0F172A"/>
+                <w:sz w:val="17"/>
+              </w:rPr>
+              <w:t>Sanitiza prompts contra inyecciones y extrae rasgos clínicos/físicos en JSON.</w:t>
+            </w:r>
+          </w:p>
+        </w:tc>
+        <w:tc>
+          <w:tcPr>
+            <w:tcW w:type="dxa" w:w="1728"/>
+            <w:shd w:fill="F8FAFC"/>
+            <w:tcMar>
+              <w:top w:w="80" w:type="dxa"/>
+              <w:bottom w:w="80" w:type="dxa"/>
+              <w:left w:w="120" w:type="dxa"/>
+              <w:right w:w="120" w:type="dxa"/>
+            </w:tcMar>
+          </w:tcPr>
+          <w:p>
+            <w:r>
+              <w:rPr>
+                <w:rFonts w:ascii="Arial" w:hAnsi="Arial"/>
+                <w:color w:val="0F172A"/>
+                <w:sz w:val="17"/>
+              </w:rPr>
+              <w:t>MCP JSON-RPC / Qwen 2.5</w:t>
+            </w:r>
+          </w:p>
+        </w:tc>
+      </w:tr>
+      <w:tr>
+        <w:tc>
+          <w:tcPr>
+            <w:tcW w:type="dxa" w:w="2160"/>
+            <w:shd w:fill="FFFFFF"/>
+            <w:tcMar>
+              <w:top w:w="80" w:type="dxa"/>
+              <w:bottom w:w="80" w:type="dxa"/>
+              <w:left w:w="120" w:type="dxa"/>
+              <w:right w:w="120" w:type="dxa"/>
+            </w:tcMar>
+          </w:tcPr>
+          <w:p>
+            <w:r>
+              <w:rPr>
+                <w:rFonts w:ascii="Arial" w:hAnsi="Arial"/>
+                <w:b/>
+                <w:color w:val="0F172A"/>
+                <w:sz w:val="17"/>
+              </w:rPr>
+              <w:t>Agente_Peritaje_Visual</w:t>
+            </w:r>
+          </w:p>
+        </w:tc>
+        <w:tc>
+          <w:tcPr>
+            <w:tcW w:type="dxa" w:w="2304"/>
+            <w:shd w:fill="FFFFFF"/>
+            <w:tcMar>
+              <w:top w:w="80" w:type="dxa"/>
+              <w:bottom w:w="80" w:type="dxa"/>
+              <w:left w:w="120" w:type="dxa"/>
+              <w:right w:w="120" w:type="dxa"/>
+            </w:tcMar>
+          </w:tcPr>
+          <w:p>
+            <w:r>
+              <w:rPr>
+                <w:rFonts w:ascii="Arial" w:hAnsi="Arial"/>
+                <w:color w:val="0F172A"/>
+                <w:sz w:val="17"/>
+              </w:rPr>
+              <w:t>skill_peritaje_visual_moondream</w:t>
+            </w:r>
+          </w:p>
+        </w:tc>
+        <w:tc>
+          <w:tcPr>
+            <w:tcW w:type="dxa" w:w="3168"/>
+            <w:shd w:fill="FFFFFF"/>
+            <w:tcMar>
+              <w:top w:w="80" w:type="dxa"/>
+              <w:bottom w:w="80" w:type="dxa"/>
+              <w:left w:w="120" w:type="dxa"/>
+              <w:right w:w="120" w:type="dxa"/>
+            </w:tcMar>
+          </w:tcPr>
+          <w:p>
+            <w:r>
+              <w:rPr>
+                <w:rFonts w:ascii="Arial" w:hAnsi="Arial"/>
+                <w:color w:val="0F172A"/>
+                <w:sz w:val="17"/>
+              </w:rPr>
+              <w:t>Examina fotos píxel a píxel para identificar manto, hocico y orejas.</w:t>
+            </w:r>
+          </w:p>
+        </w:tc>
+        <w:tc>
+          <w:tcPr>
+            <w:tcW w:type="dxa" w:w="1728"/>
+            <w:shd w:fill="FFFFFF"/>
+            <w:tcMar>
+              <w:top w:w="80" w:type="dxa"/>
+              <w:bottom w:w="80" w:type="dxa"/>
+              <w:left w:w="120" w:type="dxa"/>
+              <w:right w:w="120" w:type="dxa"/>
+            </w:tcMar>
+          </w:tcPr>
+          <w:p>
+            <w:r>
+              <w:rPr>
+                <w:rFonts w:ascii="Arial" w:hAnsi="Arial"/>
+                <w:color w:val="0F172A"/>
+                <w:sz w:val="17"/>
+              </w:rPr>
+              <w:t>MCP JSON-RPC / Moondream</w:t>
+            </w:r>
+          </w:p>
+        </w:tc>
+      </w:tr>
+      <w:tr>
+        <w:tc>
+          <w:tcPr>
+            <w:tcW w:type="dxa" w:w="2160"/>
+            <w:shd w:fill="F8FAFC"/>
+            <w:tcMar>
+              <w:top w:w="80" w:type="dxa"/>
+              <w:bottom w:w="80" w:type="dxa"/>
+              <w:left w:w="120" w:type="dxa"/>
+              <w:right w:w="120" w:type="dxa"/>
+            </w:tcMar>
+          </w:tcPr>
+          <w:p>
+            <w:r>
+              <w:rPr>
+                <w:rFonts w:ascii="Arial" w:hAnsi="Arial"/>
+                <w:b/>
+                <w:color w:val="0F172A"/>
+                <w:sz w:val="17"/>
+              </w:rPr>
+              <w:t>Agente_Matchmaker</w:t>
+            </w:r>
+          </w:p>
+        </w:tc>
+        <w:tc>
+          <w:tcPr>
+            <w:tcW w:type="dxa" w:w="2304"/>
+            <w:shd w:fill="F8FAFC"/>
+            <w:tcMar>
+              <w:top w:w="80" w:type="dxa"/>
+              <w:bottom w:w="80" w:type="dxa"/>
+              <w:left w:w="120" w:type="dxa"/>
+              <w:right w:w="120" w:type="dxa"/>
+            </w:tcMar>
+          </w:tcPr>
+          <w:p>
+            <w:r>
+              <w:rPr>
+                <w:rFonts w:ascii="Arial" w:hAnsi="Arial"/>
+                <w:color w:val="0F172A"/>
+                <w:sz w:val="17"/>
+              </w:rPr>
+              <w:t>skill_calcular_similitud_vectorial</w:t>
+            </w:r>
+          </w:p>
+        </w:tc>
+        <w:tc>
+          <w:tcPr>
+            <w:tcW w:type="dxa" w:w="3168"/>
+            <w:shd w:fill="F8FAFC"/>
+            <w:tcMar>
+              <w:top w:w="80" w:type="dxa"/>
+              <w:bottom w:w="80" w:type="dxa"/>
+              <w:left w:w="120" w:type="dxa"/>
+              <w:right w:w="120" w:type="dxa"/>
+            </w:tcMar>
+          </w:tcPr>
+          <w:p>
+            <w:r>
+              <w:rPr>
+                <w:rFonts w:ascii="Arial" w:hAnsi="Arial"/>
+                <w:color w:val="0F172A"/>
+                <w:sz w:val="17"/>
+              </w:rPr>
+              <w:t>Calcula similitud híbrida: 40% visual + 30% semántica + 30% Haversine.</w:t>
+            </w:r>
+          </w:p>
+        </w:tc>
+        <w:tc>
+          <w:tcPr>
+            <w:tcW w:type="dxa" w:w="1728"/>
+            <w:shd w:fill="F8FAFC"/>
+            <w:tcMar>
+              <w:top w:w="80" w:type="dxa"/>
+              <w:bottom w:w="80" w:type="dxa"/>
+              <w:left w:w="120" w:type="dxa"/>
+              <w:right w:w="120" w:type="dxa"/>
+            </w:tcMar>
+          </w:tcPr>
+          <w:p>
+            <w:r>
+              <w:rPr>
+                <w:rFonts w:ascii="Arial" w:hAnsi="Arial"/>
+                <w:color w:val="0F172A"/>
+                <w:sz w:val="17"/>
+              </w:rPr>
+              <w:t>MCP Tool / ChromaDB</w:t>
+            </w:r>
+          </w:p>
+        </w:tc>
+      </w:tr>
+      <w:tr>
+        <w:tc>
+          <w:tcPr>
+            <w:tcW w:type="dxa" w:w="2160"/>
+            <w:shd w:fill="FFFFFF"/>
+            <w:tcMar>
+              <w:top w:w="80" w:type="dxa"/>
+              <w:bottom w:w="80" w:type="dxa"/>
+              <w:left w:w="120" w:type="dxa"/>
+              <w:right w:w="120" w:type="dxa"/>
+            </w:tcMar>
+          </w:tcPr>
+          <w:p>
+            <w:r>
+              <w:rPr>
+                <w:rFonts w:ascii="Arial" w:hAnsi="Arial"/>
+                <w:b/>
+                <w:color w:val="0F172A"/>
+                <w:sz w:val="17"/>
+              </w:rPr>
+              <w:t>Agente_Auditor_Legal</w:t>
+            </w:r>
+          </w:p>
+        </w:tc>
+        <w:tc>
+          <w:tcPr>
+            <w:tcW w:type="dxa" w:w="2304"/>
+            <w:shd w:fill="FFFFFF"/>
+            <w:tcMar>
+              <w:top w:w="80" w:type="dxa"/>
+              <w:bottom w:w="80" w:type="dxa"/>
+              <w:left w:w="120" w:type="dxa"/>
+              <w:right w:w="120" w:type="dxa"/>
+            </w:tcMar>
+          </w:tcPr>
+          <w:p>
+            <w:r>
+              <w:rPr>
+                <w:rFonts w:ascii="Arial" w:hAnsi="Arial"/>
+                <w:color w:val="0F172A"/>
+                <w:sz w:val="17"/>
+              </w:rPr>
+              <w:t>skill_verificar_periodo_gracia</w:t>
+            </w:r>
+          </w:p>
+        </w:tc>
+        <w:tc>
+          <w:tcPr>
+            <w:tcW w:type="dxa" w:w="3168"/>
+            <w:shd w:fill="FFFFFF"/>
+            <w:tcMar>
+              <w:top w:w="80" w:type="dxa"/>
+              <w:bottom w:w="80" w:type="dxa"/>
+              <w:left w:w="120" w:type="dxa"/>
+              <w:right w:w="120" w:type="dxa"/>
+            </w:tcMar>
+          </w:tcPr>
+          <w:p>
+            <w:r>
+              <w:rPr>
+                <w:rFonts w:ascii="Arial" w:hAnsi="Arial"/>
+                <w:color w:val="0F172A"/>
+                <w:sz w:val="17"/>
+              </w:rPr>
+              <w:t>Aplica el Hard Stop de 15 días continuos antes de habilitar adopción.</w:t>
+            </w:r>
+          </w:p>
+        </w:tc>
+        <w:tc>
+          <w:tcPr>
+            <w:tcW w:type="dxa" w:w="1728"/>
+            <w:shd w:fill="FFFFFF"/>
+            <w:tcMar>
+              <w:top w:w="80" w:type="dxa"/>
+              <w:bottom w:w="80" w:type="dxa"/>
+              <w:left w:w="120" w:type="dxa"/>
+              <w:right w:w="120" w:type="dxa"/>
+            </w:tcMar>
+          </w:tcPr>
+          <w:p>
+            <w:r>
+              <w:rPr>
+                <w:rFonts w:ascii="Arial" w:hAnsi="Arial"/>
+                <w:color w:val="0F172A"/>
+                <w:sz w:val="17"/>
+              </w:rPr>
+              <w:t>MCP Tool / Regla PHP</w:t>
+            </w:r>
+          </w:p>
+        </w:tc>
+      </w:tr>
+      <w:tr>
+        <w:tc>
+          <w:tcPr>
+            <w:tcW w:type="dxa" w:w="2160"/>
+            <w:shd w:fill="F8FAFC"/>
+            <w:tcMar>
+              <w:top w:w="80" w:type="dxa"/>
+              <w:bottom w:w="80" w:type="dxa"/>
+              <w:left w:w="120" w:type="dxa"/>
+              <w:right w:w="120" w:type="dxa"/>
+            </w:tcMar>
+          </w:tcPr>
+          <w:p>
+            <w:r>
+              <w:rPr>
+                <w:rFonts w:ascii="Arial" w:hAnsi="Arial"/>
+                <w:b/>
+                <w:color w:val="0F172A"/>
+                <w:sz w:val="17"/>
+              </w:rPr>
+              <w:t>Agente_Triaje_Adopcion</w:t>
+            </w:r>
+          </w:p>
+        </w:tc>
+        <w:tc>
+          <w:tcPr>
+            <w:tcW w:type="dxa" w:w="2304"/>
+            <w:shd w:fill="F8FAFC"/>
+            <w:tcMar>
+              <w:top w:w="80" w:type="dxa"/>
+              <w:bottom w:w="80" w:type="dxa"/>
+              <w:left w:w="120" w:type="dxa"/>
+              <w:right w:w="120" w:type="dxa"/>
+            </w:tcMar>
+          </w:tcPr>
+          <w:p>
+            <w:r>
+              <w:rPr>
+                <w:rFonts w:ascii="Arial" w:hAnsi="Arial"/>
+                <w:color w:val="0F172A"/>
+                <w:sz w:val="17"/>
+              </w:rPr>
+              <w:t>skill_evaluar_compatibilidad_adopcion</w:t>
+            </w:r>
+          </w:p>
+        </w:tc>
+        <w:tc>
+          <w:tcPr>
+            <w:tcW w:type="dxa" w:w="3168"/>
+            <w:shd w:fill="F8FAFC"/>
+            <w:tcMar>
+              <w:top w:w="80" w:type="dxa"/>
+              <w:bottom w:w="80" w:type="dxa"/>
+              <w:left w:w="120" w:type="dxa"/>
+              <w:right w:w="120" w:type="dxa"/>
+            </w:tcMar>
+          </w:tcPr>
+          <w:p>
+            <w:r>
+              <w:rPr>
+                <w:rFonts w:ascii="Arial" w:hAnsi="Arial"/>
+                <w:color w:val="0F172A"/>
+                <w:sz w:val="17"/>
+              </w:rPr>
+              <w:t>Calcula porcentaje de idoneidad habitacional y económica del adoptante.</w:t>
+            </w:r>
+          </w:p>
+        </w:tc>
+        <w:tc>
+          <w:tcPr>
+            <w:tcW w:type="dxa" w:w="1728"/>
+            <w:shd w:fill="F8FAFC"/>
+            <w:tcMar>
+              <w:top w:w="80" w:type="dxa"/>
+              <w:bottom w:w="80" w:type="dxa"/>
+              <w:left w:w="120" w:type="dxa"/>
+              <w:right w:w="120" w:type="dxa"/>
+            </w:tcMar>
+          </w:tcPr>
+          <w:p>
+            <w:r>
+              <w:rPr>
+                <w:rFonts w:ascii="Arial" w:hAnsi="Arial"/>
+                <w:color w:val="0F172A"/>
+                <w:sz w:val="17"/>
+              </w:rPr>
+              <w:t>MCP Tool / Reglas Heurísticas</w:t>
+            </w:r>
+          </w:p>
+        </w:tc>
+      </w:tr>
+      <w:tr>
+        <w:tc>
+          <w:tcPr>
+            <w:tcW w:type="dxa" w:w="2160"/>
+            <w:shd w:fill="FFFFFF"/>
+            <w:tcMar>
+              <w:top w:w="80" w:type="dxa"/>
+              <w:bottom w:w="80" w:type="dxa"/>
+              <w:left w:w="120" w:type="dxa"/>
+              <w:right w:w="120" w:type="dxa"/>
+            </w:tcMar>
+          </w:tcPr>
+          <w:p>
+            <w:r>
+              <w:rPr>
+                <w:rFonts w:ascii="Arial" w:hAnsi="Arial"/>
+                <w:b/>
+                <w:color w:val="0F172A"/>
+                <w:sz w:val="17"/>
+              </w:rPr>
+              <w:t>Agente_Trazabilidad_QR</w:t>
+            </w:r>
+          </w:p>
+        </w:tc>
+        <w:tc>
+          <w:tcPr>
+            <w:tcW w:type="dxa" w:w="2304"/>
+            <w:shd w:fill="FFFFFF"/>
+            <w:tcMar>
+              <w:top w:w="80" w:type="dxa"/>
+              <w:bottom w:w="80" w:type="dxa"/>
+              <w:left w:w="120" w:type="dxa"/>
+              <w:right w:w="120" w:type="dxa"/>
+            </w:tcMar>
+          </w:tcPr>
+          <w:p>
+            <w:r>
+              <w:rPr>
+                <w:rFonts w:ascii="Arial" w:hAnsi="Arial"/>
+                <w:color w:val="0F172A"/>
+                <w:sz w:val="17"/>
+              </w:rPr>
+              <w:t>skill_generar_identidad_qr</w:t>
+            </w:r>
+          </w:p>
+        </w:tc>
+        <w:tc>
+          <w:tcPr>
+            <w:tcW w:type="dxa" w:w="3168"/>
+            <w:shd w:fill="FFFFFF"/>
+            <w:tcMar>
+              <w:top w:w="80" w:type="dxa"/>
+              <w:bottom w:w="80" w:type="dxa"/>
+              <w:left w:w="120" w:type="dxa"/>
+              <w:right w:w="120" w:type="dxa"/>
+            </w:tcMar>
+          </w:tcPr>
+          <w:p>
+            <w:r>
+              <w:rPr>
+                <w:rFonts w:ascii="Arial" w:hAnsi="Arial"/>
+                <w:color w:val="0F172A"/>
+                <w:sz w:val="17"/>
+              </w:rPr>
+              <w:t>Genera el identificador UUID inmutable y la etiqueta de collar QR imprimible.</w:t>
+            </w:r>
+          </w:p>
+        </w:tc>
+        <w:tc>
+          <w:tcPr>
+            <w:tcW w:type="dxa" w:w="1728"/>
+            <w:shd w:fill="FFFFFF"/>
+            <w:tcMar>
+              <w:top w:w="80" w:type="dxa"/>
+              <w:bottom w:w="80" w:type="dxa"/>
+              <w:left w:w="120" w:type="dxa"/>
+              <w:right w:w="120" w:type="dxa"/>
+            </w:tcMar>
+          </w:tcPr>
+          <w:p>
+            <w:r>
+              <w:rPr>
+                <w:rFonts w:ascii="Arial" w:hAnsi="Arial"/>
+                <w:color w:val="0F172A"/>
+                <w:sz w:val="17"/>
+              </w:rPr>
+              <w:t>MCP Tool / SVG Generator</w:t>
+            </w:r>
+          </w:p>
+        </w:tc>
+      </w:tr>
+    </w:tbl>
+    <w:p>
+      <w:pPr>
+        <w:spacing w:after="160"/>
+      </w:pPr>
+    </w:p>
+    <w:p>
+      <w:pPr>
+        <w:spacing w:before="240" w:after="80"/>
+      </w:pPr>
+      <w:r>
+        <w:rPr>
+          <w:rFonts w:ascii="Arial" w:hAnsi="Arial"/>
+          <w:b/>
+          <w:color w:val="0D9488"/>
+          <w:sz w:val="25"/>
+        </w:rPr>
+        <w:t>2.3 Diagramas UML (Casos de Uso, Secuencia y Clases de Dominio)</w:t>
+      </w:r>
+    </w:p>
+    <w:p>
+      <w:pPr>
+        <w:spacing w:before="120" w:after="80"/>
+      </w:pPr>
+      <w:r>
+        <w:rPr>
+          <w:rFonts w:ascii="Arial" w:hAnsi="Arial"/>
+          <w:b/>
+          <w:color w:val="1E3A8A"/>
+          <w:sz w:val="22"/>
+        </w:rPr>
+        <w:t>2.3.1 Diagrama de Casos de Uso del Sistema (Quién hace qué)</w:t>
+      </w:r>
+    </w:p>
+    <w:tbl>
+      <w:tblPr>
+        <w:tblW w:type="auto" w:w="0"/>
+        <w:jc w:val="center"/>
+        <w:tblLook w:firstColumn="1" w:firstRow="1" w:lastColumn="0" w:lastRow="0" w:noHBand="0" w:noVBand="1" w:val="04A0"/>
+      </w:tblPr>
+      <w:tblGrid>
+        <w:gridCol w:w="9360"/>
+      </w:tblGrid>
+      <w:tr>
+        <w:tc>
+          <w:tcPr>
+            <w:tcW w:type="dxa" w:w="9360"/>
+            <w:shd w:fill="0F172A"/>
+            <w:tcMar>
+              <w:top w:w="120" w:type="dxa"/>
+              <w:bottom w:w="120" w:type="dxa"/>
+              <w:left w:w="160" w:type="dxa"/>
+              <w:right w:w="160" w:type="dxa"/>
+            </w:tcMar>
+          </w:tcPr>
+          <w:p>
+            <w:pPr>
+              <w:spacing w:after="80"/>
+            </w:pPr>
+            <w:r>
+              <w:rPr>
+                <w:rFonts w:ascii="Arial" w:hAnsi="Arial"/>
+                <w:b/>
+                <w:color w:val="38BDF8"/>
+                <w:sz w:val="18"/>
+              </w:rPr>
+              <w:t>📌 DIAGRAMA DE CASOS DE USO UML (DRAW.IO / MERMAID) (Compatible con draw.io &amp; Mermaid):</w:t>
+            </w:r>
+          </w:p>
+          <w:p>
+            <w:pPr>
+              <w:spacing w:line="252" w:lineRule="auto" w:after="0"/>
+            </w:pPr>
+            <w:r>
+              <w:rPr>
+                <w:rFonts w:ascii="Courier New" w:hAnsi="Courier New"/>
+                <w:color w:val="CBD5E1"/>
+                <w:sz w:val="16"/>
+              </w:rPr>
+              <w:t>graph LR</w:t>
+              <w:br/>
+              <w:t xml:space="preserve">    subgraph ACTORES ["Actores del Sistema"]</w:t>
+              <w:br/>
+              <w:t xml:space="preserve">        ADM["Dra. Carmen López (Coordinadora)"]</w:t>
+              <w:br/>
+              <w:t xml:space="preserve">        RESC["Carlos Mendoza (Rescatista)"]</w:t>
+              <w:br/>
+              <w:t xml:space="preserve">        CIT["María Fernández (Damnificada)"]</w:t>
+              <w:br/>
+              <w:t xml:space="preserve">        ADOPT["Andrés Morales (Adoptante)"]</w:t>
+              <w:br/>
+              <w:t xml:space="preserve">    end</w:t>
+              <w:br/>
+              <w:br/>
+              <w:t xml:space="preserve">    subgraph CASOS_USO ["Casos de Uso de RefuGuía"]</w:t>
+              <w:br/>
+              <w:t xml:space="preserve">        UC1(["Ingresar Rescate por Voz/Texto"])</w:t>
+              <w:br/>
+              <w:t xml:space="preserve">        UC2(["Imprimir Collar QR de Campaña"])</w:t>
+              <w:br/>
+              <w:t xml:space="preserve">        UC3(["Auditar Fármaco Crítico (SHA-256)"])</w:t>
+              <w:br/>
+              <w:t xml:space="preserve">        UC4(["Reportar Mascota Perdida con Foto"])</w:t>
+              <w:br/>
+              <w:t xml:space="preserve">        UC5(["Validar Coincidencia Visual en Detalle"])</w:t>
+              <w:br/>
+              <w:t xml:space="preserve">        UC6(["Confirmar Reencuentro Familiar"])</w:t>
+              <w:br/>
+              <w:t xml:space="preserve">        UC7(["Explorar Mascotas Adoptables (&gt;15d)"])</w:t>
+              <w:br/>
+              <w:t xml:space="preserve">        UC8(["Postular a Adopción &amp; Triaje IA"])</w:t>
+              <w:br/>
+              <w:t xml:space="preserve">    end</w:t>
+              <w:br/>
+              <w:br/>
+              <w:t xml:space="preserve">    RESC --&gt; UC1</w:t>
+              <w:br/>
+              <w:t xml:space="preserve">    RESC --&gt; UC2</w:t>
+              <w:br/>
+              <w:t xml:space="preserve">    RESC --&gt; UC5</w:t>
+              <w:br/>
+              <w:t xml:space="preserve">    </w:t>
+              <w:br/>
+              <w:t xml:space="preserve">    ADM --&gt; UC2</w:t>
+              <w:br/>
+              <w:t xml:space="preserve">    ADM --&gt; UC3</w:t>
+              <w:br/>
+              <w:t xml:space="preserve">    ADM --&gt; UC5</w:t>
+              <w:br/>
+              <w:t xml:space="preserve">    ADM --&gt; UC6</w:t>
+              <w:br/>
+              <w:t xml:space="preserve">    </w:t>
+              <w:br/>
+              <w:t xml:space="preserve">    CIT --&gt; UC4</w:t>
+              <w:br/>
+              <w:t xml:space="preserve">    CIT --&gt; UC5</w:t>
+              <w:br/>
+              <w:t xml:space="preserve">    CIT --&gt; UC6</w:t>
+              <w:br/>
+              <w:t xml:space="preserve">    </w:t>
+              <w:br/>
+              <w:t xml:space="preserve">    ADOPT --&gt; UC7</w:t>
+              <w:br/>
+              <w:t xml:space="preserve">    ADOPT --&gt; UC8</w:t>
+            </w:r>
+          </w:p>
+        </w:tc>
+      </w:tr>
+    </w:tbl>
+    <w:p>
+      <w:pPr>
+        <w:spacing w:after="120"/>
+      </w:pPr>
+    </w:p>
+    <w:p>
+      <w:pPr>
+        <w:spacing w:before="160" w:after="80"/>
+      </w:pPr>
+      <w:r>
+        <w:rPr>
+          <w:rFonts w:ascii="Arial" w:hAnsi="Arial"/>
+          <w:b/>
+          <w:color w:val="1E3A8A"/>
+          <w:sz w:val="22"/>
+        </w:rPr>
+        <w:t>2.3.2 Diagrama de Clases del Dominio y Estructura de Datos</w:t>
+      </w:r>
+    </w:p>
+    <w:tbl>
+      <w:tblPr>
+        <w:tblW w:type="auto" w:w="0"/>
+        <w:jc w:val="center"/>
+        <w:tblLook w:firstColumn="1" w:firstRow="1" w:lastColumn="0" w:lastRow="0" w:noHBand="0" w:noVBand="1" w:val="04A0"/>
+      </w:tblPr>
+      <w:tblGrid>
+        <w:gridCol w:w="9360"/>
+      </w:tblGrid>
+      <w:tr>
+        <w:tc>
+          <w:tcPr>
+            <w:tcW w:type="dxa" w:w="9360"/>
+            <w:shd w:fill="0F172A"/>
+            <w:tcMar>
+              <w:top w:w="120" w:type="dxa"/>
+              <w:bottom w:w="120" w:type="dxa"/>
+              <w:left w:w="160" w:type="dxa"/>
+              <w:right w:w="160" w:type="dxa"/>
+            </w:tcMar>
+          </w:tcPr>
+          <w:p>
+            <w:pPr>
+              <w:spacing w:after="80"/>
+            </w:pPr>
+            <w:r>
+              <w:rPr>
+                <w:rFonts w:ascii="Arial" w:hAnsi="Arial"/>
+                <w:b/>
+                <w:color w:val="38BDF8"/>
+                <w:sz w:val="18"/>
+              </w:rPr>
+              <w:t>📌 DIAGRAMA DE CLASES Y MODELO DE DATOS UML (Compatible con draw.io &amp; Mermaid):</w:t>
+            </w:r>
+          </w:p>
+          <w:p>
+            <w:pPr>
+              <w:spacing w:line="252" w:lineRule="auto" w:after="0"/>
+            </w:pPr>
+            <w:r>
+              <w:rPr>
+                <w:rFonts w:ascii="Courier New" w:hAnsi="Courier New"/>
+                <w:color w:val="CBD5E1"/>
+                <w:sz w:val="16"/>
+              </w:rPr>
+              <w:t>classDiagram</w:t>
+              <w:br/>
+              <w:t xml:space="preserve">    class Pet {</w:t>
+              <w:br/>
+              <w:t xml:space="preserve">        +int id</w:t>
+              <w:br/>
+              <w:t xml:space="preserve">        +string uuid</w:t>
+              <w:br/>
+              <w:t xml:space="preserve">        +string name</w:t>
+              <w:br/>
+              <w:t xml:space="preserve">        +string report_type</w:t>
+              <w:br/>
+              <w:t xml:space="preserve">        +string species</w:t>
+              <w:br/>
+              <w:t xml:space="preserve">        +string breed</w:t>
+              <w:br/>
+              <w:t xml:space="preserve">        +string primary_color</w:t>
+              <w:br/>
+              <w:t xml:space="preserve">        +string size</w:t>
+              <w:br/>
+              <w:t xml:space="preserve">        +string status</w:t>
+              <w:br/>
+              <w:t xml:space="preserve">        +string photo_url</w:t>
+              <w:br/>
+              <w:t xml:space="preserve">        +datetime rescue_date</w:t>
+              <w:br/>
+              <w:t xml:space="preserve">        +datetime grace_period_ends_at</w:t>
+              <w:br/>
+              <w:t xml:space="preserve">        +float latitude</w:t>
+              <w:br/>
+              <w:t xml:space="preserve">        +float longitude</w:t>
+              <w:br/>
+              <w:t xml:space="preserve">        +isEligibleForAdoption() bool</w:t>
+              <w:br/>
+              <w:t xml:space="preserve">    }</w:t>
+              <w:br/>
+              <w:br/>
+              <w:t xml:space="preserve">    class ClinicalRecord {</w:t>
+              <w:br/>
+              <w:t xml:space="preserve">        +int id</w:t>
+              <w:br/>
+              <w:t xml:space="preserve">        +int pet_id</w:t>
+              <w:br/>
+              <w:t xml:space="preserve">        +string veterinarian_name</w:t>
+              <w:br/>
+              <w:t xml:space="preserve">        +string critical_drug</w:t>
+              <w:br/>
+              <w:t xml:space="preserve">        +string dosage</w:t>
+              <w:br/>
+              <w:t xml:space="preserve">        +string observations</w:t>
+              <w:br/>
+              <w:t xml:space="preserve">        +boolean qr_scanned</w:t>
+              <w:br/>
+              <w:t xml:space="preserve">        +string previous_hash</w:t>
+              <w:br/>
+              <w:t xml:space="preserve">        +string hash_sha256</w:t>
+              <w:br/>
+              <w:t xml:space="preserve">        +calculateHash() string</w:t>
+              <w:br/>
+              <w:t xml:space="preserve">    }</w:t>
+              <w:br/>
+              <w:br/>
+              <w:t xml:space="preserve">    class AdoptionApplication {</w:t>
+              <w:br/>
+              <w:t xml:space="preserve">        +int id</w:t>
+              <w:br/>
+              <w:t xml:space="preserve">        +int pet_id</w:t>
+              <w:br/>
+              <w:t xml:space="preserve">        +int user_id</w:t>
+              <w:br/>
+              <w:t xml:space="preserve">        +float monthly_income_usd</w:t>
+              <w:br/>
+              <w:t xml:space="preserve">        +string housing_type</w:t>
+              <w:br/>
+              <w:t xml:space="preserve">        +boolean has_closed_patio</w:t>
+              <w:br/>
+              <w:t xml:space="preserve">        +boolean has_other_pets</w:t>
+              <w:br/>
+              <w:t xml:space="preserve">        +float compatibility_score</w:t>
+              <w:br/>
+              <w:t xml:space="preserve">        +string status</w:t>
+              <w:br/>
+              <w:t xml:space="preserve">        +string ai_decision_rationale</w:t>
+              <w:br/>
+              <w:t xml:space="preserve">    }</w:t>
+              <w:br/>
+              <w:br/>
+              <w:t xml:space="preserve">    class MatchLog {</w:t>
+              <w:br/>
+              <w:t xml:space="preserve">        +int id</w:t>
+              <w:br/>
+              <w:t xml:space="preserve">        +int lost_pet_id</w:t>
+              <w:br/>
+              <w:t xml:space="preserve">        +int found_pet_id</w:t>
+              <w:br/>
+              <w:t xml:space="preserve">        +float similarity_score</w:t>
+              <w:br/>
+              <w:t xml:space="preserve">        +float visual_score</w:t>
+              <w:br/>
+              <w:t xml:space="preserve">        +float nlp_score</w:t>
+              <w:br/>
+              <w:t xml:space="preserve">        +float geo_distance_km</w:t>
+              <w:br/>
+              <w:t xml:space="preserve">        +string status</w:t>
+              <w:br/>
+              <w:t xml:space="preserve">    }</w:t>
+              <w:br/>
+              <w:br/>
+              <w:t xml:space="preserve">    class User {</w:t>
+              <w:br/>
+              <w:t xml:space="preserve">        +int id</w:t>
+              <w:br/>
+              <w:t xml:space="preserve">        +string name</w:t>
+              <w:br/>
+              <w:t xml:space="preserve">        +string email</w:t>
+              <w:br/>
+              <w:t xml:space="preserve">        +string role</w:t>
+              <w:br/>
+              <w:t xml:space="preserve">        +hasRole(string role) bool</w:t>
+              <w:br/>
+              <w:t xml:space="preserve">    }</w:t>
+              <w:br/>
+              <w:br/>
+              <w:t xml:space="preserve">    Pet "1" --&gt; "0..*" ClinicalRecord : contains</w:t>
+              <w:br/>
+              <w:t xml:space="preserve">    Pet "1" --&gt; "0..*" AdoptionApplication : receives</w:t>
+              <w:br/>
+              <w:t xml:space="preserve">    Pet "1" --&gt; "0..*" MatchLog : matches</w:t>
+              <w:br/>
+              <w:t xml:space="preserve">    User "1" --&gt; "0..*" AdoptionApplication : submits</w:t>
+            </w:r>
+          </w:p>
+        </w:tc>
+      </w:tr>
+    </w:tbl>
+    <w:p>
+      <w:pPr>
+        <w:spacing w:after="120"/>
+      </w:pPr>
+    </w:p>
     <w:sectPr>
       <w:pgSz w:w="12240" w:h="15840"/>
       <w:pgMar w:top="1440" w:right="1440" w:bottom="1440" w:left="1440" w:header="720" w:footer="720" w:gutter="0"/>

</xml_diff>

<commit_message>
docs: incrustar diagramas visuales en alta resolucion en la Seccion 2 del Informe DOCX
</commit_message>
<xml_diff>
--- a/doc/INFORME_FINAL_REFUGUIA_PARTE2.docx
+++ b/doc/INFORME_FINAL_REFUGUIA_PARTE2.docx
@@ -13,7 +13,7 @@
           <w:color w:val="0D9488"/>
           <w:sz w:val="18"/>
         </w:rPr>
-        <w:t>PROGRAMA DE INTELIGENCIA ARTIFICIAL APLICADA · UTN-FRBA &amp; EPIDATA</w:t>
+        <w:t>PROGRAMA DE INTELIGENCIA ARTIFICIAL APLICADA Â· UTN-FRBA &amp; EPIDATA</w:t>
       </w:r>
     </w:p>
     <w:p>
@@ -27,7 +27,7 @@
           <w:color w:val="1E3A8A"/>
           <w:sz w:val="44"/>
         </w:rPr>
-        <w:t>INFORME TÉCNICO DE IMPLEMENTACIÓN FINAL</w:t>
+        <w:t>INFORME TÃ‰CNICO DE IMPLEMENTACIÃ“N FINAL</w:t>
       </w:r>
     </w:p>
     <w:p>
@@ -40,7 +40,7 @@
           <w:color w:val="64748B"/>
           <w:sz w:val="22"/>
         </w:rPr>
-        <w:t>RefuGuía: Sistema Integral Multi-Agente On-Premise con IA Local (SLM+VLM), Protocolo MCP y Trazabilidad Médica Inmutable Post-Sismo</w:t>
+        <w:t>RefuGuÃ­a: Sistema Integral Multi-Agente On-Premise con IA Local (SLM+VLM), Protocolo MCP y Trazabilidad MÃ©dica Inmutable Post-Sismo</w:t>
       </w:r>
     </w:p>
     <w:p>
@@ -62,7 +62,7 @@
           <w:color w:val="1E3A8A"/>
           <w:sz w:val="32"/>
         </w:rPr>
-        <w:t>Sección 1 · Presentación del Equipo y del Proyecto</w:t>
+        <w:t>SecciÃ³n 1 Â· PresentaciÃ³n del Equipo y del Proyecto</w:t>
       </w:r>
     </w:p>
     <w:p>
@@ -89,7 +89,7 @@
           <w:color w:val="0F172A"/>
           <w:sz w:val="20"/>
         </w:rPr>
-        <w:t>El proyecto fue concebido, diseñado, implementado y validado en su totalidad de manera individual por el siguiente integrante, asumiendo un enfoque multidisciplinario 'Full-Cycle AI Engineering':</w:t>
+        <w:t>El proyecto fue concebido, diseÃ±ado, implementado y validado en su totalidad de manera individual por el siguiente integrante, asumiendo un enfoque multidisciplinario 'Full-Cycle AI Engineering':</w:t>
       </w:r>
     </w:p>
     <w:tbl>
@@ -207,7 +207,7 @@
                 <w:color w:val="0F172A"/>
                 <w:sz w:val="18"/>
               </w:rPr>
-              <w:t>Víctor Rivas</w:t>
+              <w:t>VÃ­ctor Rivas</w:t>
             </w:r>
           </w:p>
         </w:tc>
@@ -258,7 +258,7 @@
                 <w:color w:val="0F172A"/>
                 <w:sz w:val="18"/>
               </w:rPr>
-              <w:t>Diseño de la arquitectura Multi-Agente On-Premise, integración de Ollama Local (SLM Qwen 2.5 + VLM Moondream) y base de datos vectorial ChromaDB.</w:t>
+              <w:t>DiseÃ±o de la arquitectura Multi-Agente On-Premise, integraciÃ³n de Ollama Local (SLM Qwen 2.5 + VLM Moondream) y base de datos vectorial ChromaDB.</w:t>
             </w:r>
           </w:p>
         </w:tc>
@@ -286,7 +286,7 @@
                 <w:color w:val="0F172A"/>
                 <w:sz w:val="18"/>
               </w:rPr>
-              <w:t>Víctor Rivas</w:t>
+              <w:t>VÃ­ctor Rivas</w:t>
             </w:r>
           </w:p>
         </w:tc>
@@ -337,7 +337,7 @@
                 <w:color w:val="0F172A"/>
                 <w:sz w:val="18"/>
               </w:rPr>
-              <w:t>Implementación de la API REST en Laravel 11, Servidor de Protocolo MCP con 6 Skills agénticas (.md) y lógica inmutable SHA-256 de fármacos.</w:t>
+              <w:t>ImplementaciÃ³n de la API REST en Laravel 11, Servidor de Protocolo MCP con 6 Skills agÃ©nticas (.md) y lÃ³gica inmutable SHA-256 de fÃ¡rmacos.</w:t>
             </w:r>
           </w:p>
         </w:tc>
@@ -365,7 +365,7 @@
                 <w:color w:val="0F172A"/>
                 <w:sz w:val="18"/>
               </w:rPr>
-              <w:t>Víctor Rivas</w:t>
+              <w:t>VÃ­ctor Rivas</w:t>
             </w:r>
           </w:p>
         </w:tc>
@@ -416,7 +416,7 @@
                 <w:color w:val="0F172A"/>
                 <w:sz w:val="18"/>
               </w:rPr>
-              <w:t>Creación de la Single Page Application en Vue.js 3 + Vite, diseño reactivo con Tailwind/Vanilla CSS, flujos de usuario y selector 1-Click de personas.</w:t>
+              <w:t>CreaciÃ³n de la Single Page Application en Vue.js 3 + Vite, diseÃ±o reactivo con Tailwind/Vanilla CSS, flujos de usuario y selector 1-Click de personas.</w:t>
             </w:r>
           </w:p>
         </w:tc>
@@ -444,7 +444,7 @@
                 <w:color w:val="0F172A"/>
                 <w:sz w:val="18"/>
               </w:rPr>
-              <w:t>Víctor Rivas</w:t>
+              <w:t>VÃ­ctor Rivas</w:t>
             </w:r>
           </w:p>
         </w:tc>
@@ -495,7 +495,7 @@
                 <w:color w:val="0F172A"/>
                 <w:sz w:val="18"/>
               </w:rPr>
-              <w:t>Diseño de defensas contra Prompt Injection/Jailbreaks, control de acceso RBAC por roles, sanitización estricta y suite de 8 pruebas automatizadas al 100%.</w:t>
+              <w:t>DiseÃ±o de defensas contra Prompt Injection/Jailbreaks, control de acceso RBAC por roles, sanitizaciÃ³n estricta y suite de 8 pruebas automatizadas al 100%.</w:t>
             </w:r>
           </w:p>
         </w:tc>
@@ -523,7 +523,7 @@
                 <w:color w:val="0F172A"/>
                 <w:sz w:val="18"/>
               </w:rPr>
-              <w:t>Víctor Rivas</w:t>
+              <w:t>VÃ­ctor Rivas</w:t>
             </w:r>
           </w:p>
         </w:tc>
@@ -549,7 +549,7 @@
                 <w:color w:val="0F172A"/>
                 <w:sz w:val="18"/>
               </w:rPr>
-              <w:t>DevOps &amp; Despliegue de Campaña</w:t>
+              <w:t>DevOps &amp; Despliegue de CampaÃ±a</w:t>
             </w:r>
           </w:p>
         </w:tc>
@@ -574,7 +574,7 @@
                 <w:color w:val="0F172A"/>
                 <w:sz w:val="18"/>
               </w:rPr>
-              <w:t>Contenerización Docker Multi-Contenedor, orquestación WSL2/Ubuntu, pipelines locales y gestión de versionamiento Git en GitHub.</w:t>
+              <w:t>ContenerizaciÃ³n Docker Multi-Contenedor, orquestaciÃ³n WSL2/Ubuntu, pipelines locales y gestiÃ³n de versionamiento Git en GitHub.</w:t>
             </w:r>
           </w:p>
         </w:tc>
@@ -631,7 +631,7 @@
                 <w:color w:val="1E3A8A"/>
                 <w:sz w:val="32"/>
               </w:rPr>
-              <w:t>RefuGuía</w:t>
+              <w:t>RefuGuÃ­a</w:t>
             </w:r>
           </w:p>
           <w:p>
@@ -644,7 +644,7 @@
                 <w:color w:val="0F172A"/>
                 <w:sz w:val="19"/>
               </w:rPr>
-              <w:t>Sistema Integral Multi-Agente On-Premise con Inteligencia Artificial Local (SLM Lingüístico + VLM de Visión Computacional), Protocolo MCP (Model Context Protocol) y Trazabilidad Médica Inmutable para Refugios de Emergencia y Reencuentro Familiar de Mascotas Post-Sismo.</w:t>
+              <w:t>Sistema Integral Multi-Agente On-Premise con Inteligencia Artificial Local (SLM LingÃ¼Ã­stico + VLM de VisiÃ³n Computacional), Protocolo MCP (Model Context Protocol) y Trazabilidad MÃ©dica Inmutable para Refugios de Emergencia y Reencuentro Familiar de Mascotas Post-Sismo.</w:t>
             </w:r>
           </w:p>
         </w:tc>
@@ -666,7 +666,7 @@
           <w:color w:val="0D9488"/>
           <w:sz w:val="25"/>
         </w:rPr>
-        <w:t>1.3 Problema que Resuelve (Punto de Partida y Solución Implementada)</w:t>
+        <w:t>1.3 Problema que Resuelve (Punto de Partida y SoluciÃ³n Implementada)</w:t>
       </w:r>
     </w:p>
     <w:p>
@@ -680,7 +680,7 @@
           <w:color w:val="1E3A8A"/>
           <w:sz w:val="20"/>
         </w:rPr>
-        <w:t>A. Punto de Partida y Diagnóstico de la Crisis:</w:t>
+        <w:t>A. Punto de Partida y DiagnÃ³stico de la Crisis:</w:t>
       </w:r>
     </w:p>
     <w:p>
@@ -693,7 +693,7 @@
           <w:color w:val="0F172A"/>
           <w:sz w:val="19"/>
         </w:rPr>
-        <w:t>Tras eventos catastróficos como el sismo de Caracas (6.2 Mw), la infraestructura eléctrica y las telecomunicaciones suelen colapsar, generando un escenario crítico caracterizado por: (1) Extravío masivo de animales de compañía en shock, (2) Saturación de refugios de campaña gestionados con libretas de papel propensas a extravío o daño por humedad/lluvia, (3) Falta de trazabilidad en la administración de fármacos críticos (generando riesgos de sobredosis o intoxicación en animales rescatados), (4) Inexistencia de mecanismos automatizados para hacer cumplir el período de gracia legal inamovible de 15 días continuos de búsqueda pública antes de dar una mascota en adopción, y (5) Imposibilidad de usar nubes comerciales (OpenAI, AWS) por corte de conectividad a internet y restricciones presupuestarias.</w:t>
+        <w:t>Tras eventos catastrÃ³ficos como el sismo de Caracas (6.2 Mw), la infraestructura elÃ©ctrica y las telecomunicaciones suelen colapsar, generando un escenario crÃ­tico caracterizado por: (1) ExtravÃ­o masivo de animales de compaÃ±Ã­a en shock, (2) SaturaciÃ³n de refugios de campaÃ±a gestionados con libretas de papel propensas a extravÃ­o o daÃ±o por humedad/lluvia, (3) Falta de trazabilidad en la administraciÃ³n de fÃ¡rmacos crÃ­ticos (generando riesgos de sobredosis o intoxicaciÃ³n en animales rescatados), (4) Inexistencia de mecanismos automatizados para hacer cumplir el perÃ­odo de gracia legal inamovible de 15 dÃ­as continuos de bÃºsqueda pÃºblica antes de dar una mascota en adopciÃ³n, y (5) Imposibilidad de usar nubes comerciales (OpenAI, AWS) por corte de conectividad a internet y restricciones presupuestarias.</w:t>
       </w:r>
     </w:p>
     <w:p>
@@ -707,7 +707,7 @@
           <w:color w:val="1E3A8A"/>
           <w:sz w:val="20"/>
         </w:rPr>
-        <w:t>B. Solución Tecnológica Implementada:</w:t>
+        <w:t>B. SoluciÃ³n TecnolÃ³gica Implementada:</w:t>
       </w:r>
     </w:p>
     <w:p>
@@ -720,7 +720,7 @@
           <w:color w:val="0F172A"/>
           <w:sz w:val="19"/>
         </w:rPr>
-        <w:t>RefuGuía resuelve integralmente esta problemática mediante una arquitectura Multi-Agente On-Premise operada en laptops o servidores locales de campaña. La solución combina: (1) Agente Lingüístico SLM (Qwen 2.5 1.5B) para ingesta de relatos en lenguaje natural venezolano por voz o texto, (2) Agente de Peritaje Visual VLM (Moondream 1.4B) para análisis y cotejo de fotografías píxel a píxel, (3) Motor Vectorial RAG en ChromaDB para emparejamiento semántico K-NN entre animales perdidos y encontrados, (4) Servidor MCP oficial (Model Context Protocol 2026.1) con 6 Skills agénticas auditables basadas en especificaciones Markdown, (5) Trazabilidad Médica Inmutable mediante hashes criptográficos SHA-256 encadenados y bloqueo estricto por escaneo de collares QR físicos, y (6) Auditoría jurídica automatizada del período legal de 15 días con triaje de idoneidad para adoptantes.</w:t>
+        <w:t>RefuGuÃ­a resuelve integralmente esta problemÃ¡tica mediante una arquitectura Multi-Agente On-Premise operada en laptops o servidores locales de campaÃ±a. La soluciÃ³n combina: (1) Agente LingÃ¼Ã­stico SLM (Qwen 2.5 1.5B) para ingesta de relatos en lenguaje natural venezolano por voz o texto, (2) Agente de Peritaje Visual VLM (Moondream 1.4B) para anÃ¡lisis y cotejo de fotografÃ­as pÃ­xel a pÃ­xel, (3) Motor Vectorial RAG en ChromaDB para emparejamiento semÃ¡ntico K-NN entre animales perdidos y encontrados, (4) Servidor MCP oficial (Model Context Protocol 2026.1) con 6 Skills agÃ©nticas auditables basadas en especificaciones Markdown, (5) Trazabilidad MÃ©dica Inmutable mediante hashes criptogrÃ¡ficos SHA-256 encadenados y bloqueo estricto por escaneo de collares QR fÃ­sicos, y (6) AuditorÃ­a jurÃ­dica automatizada del perÃ­odo legal de 15 dÃ­as con triaje de idoneidad para adoptantes.</w:t>
       </w:r>
     </w:p>
     <w:p>
@@ -734,7 +734,7 @@
           <w:color w:val="0D9488"/>
           <w:sz w:val="25"/>
         </w:rPr>
-        <w:t>1.4 Público Objetivo (Usuarios Reales de la Aplicación)</w:t>
+        <w:t>1.4 PÃºblico Objetivo (Usuarios Reales de la AplicaciÃ³n)</w:t>
       </w:r>
     </w:p>
     <w:p>
@@ -747,7 +747,7 @@
           <w:color w:val="0F172A"/>
           <w:sz w:val="19"/>
         </w:rPr>
-        <w:t>El sistema implementa una segregación estricta de perfiles basada en Roles (RBAC), adaptando la interfaz y permisos a 4 actores operativos esenciales:</w:t>
+        <w:t>El sistema implementa una segregaciÃ³n estricta de perfiles basada en Roles (RBAC), adaptando la interfaz y permisos a 4 actores operativos esenciales:</w:t>
       </w:r>
     </w:p>
     <w:tbl>
@@ -864,7 +864,7 @@
                 <w:color w:val="FFFFFF"/>
                 <w:sz w:val="19"/>
               </w:rPr>
-              <w:t>Módulos y Permisos Habilitados</w:t>
+              <w:t>MÃ³dulos y Permisos Habilitados</w:t>
             </w:r>
           </w:p>
         </w:tc>
@@ -892,7 +892,7 @@
                 <w:color w:val="0F172A"/>
                 <w:sz w:val="17"/>
               </w:rPr>
-              <w:t>Dra. Carmen López</w:t>
+              <w:t>Dra. Carmen LÃ³pez</w:t>
             </w:r>
           </w:p>
         </w:tc>
@@ -944,7 +944,7 @@
                 <w:color w:val="0F172A"/>
                 <w:sz w:val="17"/>
               </w:rPr>
-              <w:t>Gestionar inventario de campaña, generar collares QR, auditar tratamientos clínicos SHA-256 y autorizar adopciones al cumplir 15 días.</w:t>
+              <w:t>Gestionar inventario de campaÃ±a, generar collares QR, auditar tratamientos clÃ­nicos SHA-256 y autorizar adopciones al cumplir 15 dÃ­as.</w:t>
             </w:r>
           </w:p>
         </w:tc>
@@ -969,7 +969,7 @@
                 <w:color w:val="0F172A"/>
                 <w:sz w:val="17"/>
               </w:rPr>
-              <w:t>Acceso Total: Refugios &amp; QR, Centro de Reencuentro, Adopción, MCP Skills, Consola SLM.</w:t>
+              <w:t>Acceso Total: Refugios &amp; QR, Centro de Reencuentro, AdopciÃ³n, MCP Skills, Consola SLM.</w:t>
             </w:r>
           </w:p>
         </w:tc>
@@ -1074,7 +1074,7 @@
                 <w:color w:val="0F172A"/>
                 <w:sz w:val="17"/>
               </w:rPr>
-              <w:t>Chat Ciudadano (Ingreso Rápido), Refugios &amp; QR, Centro de Reencuentro.</w:t>
+              <w:t>Chat Ciudadano (Ingreso RÃ¡pido), Refugios &amp; QR, Centro de Reencuentro.</w:t>
             </w:r>
           </w:p>
         </w:tc>
@@ -1102,7 +1102,7 @@
                 <w:color w:val="0F172A"/>
                 <w:sz w:val="17"/>
               </w:rPr>
-              <w:t>María Fernández</w:t>
+              <w:t>MarÃ­a FernÃ¡ndez</w:t>
             </w:r>
           </w:p>
         </w:tc>
@@ -1154,7 +1154,7 @@
                 <w:color w:val="0F172A"/>
                 <w:sz w:val="17"/>
               </w:rPr>
-              <w:t>Buscar a su mascota extraviada reportando descripción o foto, revisar coincidencias sugeridas y postular si cumple requisitos.</w:t>
+              <w:t>Buscar a su mascota extraviada reportando descripciÃ³n o foto, revisar coincidencias sugeridas y postular si cumple requisitos.</w:t>
             </w:r>
           </w:p>
         </w:tc>
@@ -1179,7 +1179,7 @@
                 <w:color w:val="0F172A"/>
                 <w:sz w:val="17"/>
               </w:rPr>
-              <w:t>Chat Ciudadano (Búsqueda Familiar), Centro de Reencuentro, Portal de Adopción (15d).</w:t>
+              <w:t>Chat Ciudadano (BÃºsqueda Familiar), Centro de Reencuentro, Portal de AdopciÃ³n (15d).</w:t>
             </w:r>
           </w:p>
         </w:tc>
@@ -1207,7 +1207,7 @@
                 <w:color w:val="0F172A"/>
                 <w:sz w:val="17"/>
               </w:rPr>
-              <w:t>Andrés Morales</w:t>
+              <w:t>AndrÃ©s Morales</w:t>
             </w:r>
           </w:p>
         </w:tc>
@@ -1259,7 +1259,7 @@
                 <w:color w:val="0F172A"/>
                 <w:sz w:val="17"/>
               </w:rPr>
-              <w:t>Explorar catálogo de animales con período de búsqueda vencido (&gt;15d) y postularse mediante evaluación de idoneidad con IA.</w:t>
+              <w:t>Explorar catÃ¡logo de animales con perÃ­odo de bÃºsqueda vencido (&gt;15d) y postularse mediante evaluaciÃ³n de idoneidad con IA.</w:t>
             </w:r>
           </w:p>
         </w:tc>
@@ -1284,7 +1284,7 @@
                 <w:color w:val="0F172A"/>
                 <w:sz w:val="17"/>
               </w:rPr>
-              <w:t>Chat Asistente de Adopción, Portal de Adopción Responsable (Triaje IA).</w:t>
+              <w:t>Chat Asistente de AdopciÃ³n, Portal de AdopciÃ³n Responsable (Triaje IA).</w:t>
             </w:r>
           </w:p>
         </w:tc>
@@ -1328,146 +1328,63 @@
           <w:color w:val="0F172A"/>
           <w:sz w:val="19"/>
         </w:rPr>
-        <w:t>La arquitectura de RefuGuía está diseñada bajo un paradigma desacoplado y 100% On-Premise para escenarios de contingencia y desastre natural. Distingue con claridad los componentes basados en Inteligencia Artificial Generativa y Visión por Computadora de aquellos gobernados por lógica transaccional determinista tradicional y auditoría criptográfica inmutable.</w:t>
+        <w:t>La arquitectura de RefuGuía está estructurada en 4 capas desacopladas y 100% On-Premise para escenarios de contingencia post-sismo. Distingue con claridad los componentes basados en Inteligencia Artificial Generativa y Visión de aquellos gobernados por lógica transaccional determinista tradicional y auditoría criptográfica inmutable:</w:t>
       </w:r>
     </w:p>
-    <w:tbl>
-      <w:tblPr>
-        <w:tblW w:type="auto" w:w="0"/>
-        <w:jc w:val="center"/>
-        <w:tblLook w:firstColumn="1" w:firstRow="1" w:lastColumn="0" w:lastRow="0" w:noHBand="0" w:noVBand="1" w:val="04A0"/>
-      </w:tblPr>
-      <w:tblGrid>
-        <w:gridCol w:w="9360"/>
-      </w:tblGrid>
-      <w:tr>
-        <w:tc>
-          <w:tcPr>
-            <w:tcW w:type="dxa" w:w="9360"/>
-            <w:shd w:fill="0F172A"/>
-            <w:tcMar>
-              <w:top w:w="120" w:type="dxa"/>
-              <w:bottom w:w="120" w:type="dxa"/>
-              <w:left w:w="160" w:type="dxa"/>
-              <w:right w:w="160" w:type="dxa"/>
-            </w:tcMar>
-          </w:tcPr>
-          <w:p>
-            <w:pPr>
-              <w:spacing w:after="80"/>
-            </w:pPr>
-            <w:r>
-              <w:rPr>
-                <w:rFonts w:ascii="Arial" w:hAnsi="Arial"/>
-                <w:b/>
-                <w:color w:val="38BDF8"/>
-                <w:sz w:val="18"/>
-              </w:rPr>
-              <w:t>📌 DIAGRAMA DE ARQUITECTURA GENERAL (DRAW.IO / MERMAID) (Compatible con draw.io &amp; Mermaid):</w:t>
-            </w:r>
-          </w:p>
-          <w:p>
-            <w:pPr>
-              <w:spacing w:line="252" w:lineRule="auto" w:after="0"/>
-            </w:pPr>
-            <w:r>
-              <w:rPr>
-                <w:rFonts w:ascii="Courier New" w:hAnsi="Courier New"/>
-                <w:color w:val="CBD5E1"/>
-                <w:sz w:val="16"/>
-              </w:rPr>
-              <w:t>graph TD</w:t>
-              <w:br/>
-              <w:t xml:space="preserve">    subgraph FRONTEND ["CAPA DE PRESENTACIÓN (Lógica Tradicional)"]</w:t>
-              <w:br/>
-              <w:t xml:space="preserve">        UI["SPA Vue.js 3 + Vite + SweetAlert2"]</w:t>
-              <w:br/>
-              <w:t xml:space="preserve">        ROUTER["Vue Router con Guardias RBAC"]</w:t>
-              <w:br/>
-              <w:t xml:space="preserve">        USER_ACTORS["Usuarios: Coordinadora / Rescatista / Damnificada / Adoptante"]</w:t>
-              <w:br/>
-              <w:t xml:space="preserve">    end</w:t>
-              <w:br/>
-              <w:br/>
-              <w:t xml:space="preserve">    subgraph BACKEND ["CAPA DE APLICACIÓN &amp; NEGOCIO (Laravel 11 REST API)"]</w:t>
-              <w:br/>
-              <w:t xml:space="preserve">        AUTH_SANCTUM["Auth &amp; Control de Sesiones RBAC"]</w:t>
-              <w:br/>
-              <w:t xml:space="preserve">        MCP_SERVER["Servidor MCP 2026.1 (Model Context Protocol)"]</w:t>
-              <w:br/>
-              <w:t xml:space="preserve">        PET_CTRL["Controlador de Mascotas &amp; Ingesta"]</w:t>
-              <w:br/>
-              <w:t xml:space="preserve">        CLINIC_CTRL["Auditor Clínico SHA-256 &amp; Bloqueo QR"]</w:t>
-              <w:br/>
-              <w:t xml:space="preserve">        MATCH_CTRL["Motor de Reencuentro &amp; Emparejamiento"]</w:t>
-              <w:br/>
-              <w:t xml:space="preserve">    end</w:t>
-              <w:br/>
-              <w:br/>
-              <w:t xml:space="preserve">    subgraph AI_LOCAL ["CAPA DE INTELIGENCIA ARTIFICIAL (100% On-Premise)"]</w:t>
-              <w:br/>
-              <w:t xml:space="preserve">        OLLAMA_SLM["SLM Qwen 2.5:1.5B (NLP, JSON, Embeddings)"]</w:t>
-              <w:br/>
-              <w:t xml:space="preserve">        OLLAMA_VLM["VLM Moondream:latest (Peritaje Visual de Píxeles)"]</w:t>
-              <w:br/>
-              <w:t xml:space="preserve">        CHROMA_DB["Base de Datos Vectorial ChromaDB v2 (K-NN Cosine)"]</w:t>
-              <w:br/>
-              <w:t xml:space="preserve">    end</w:t>
-              <w:br/>
-              <w:br/>
-              <w:t xml:space="preserve">    subgraph STORAGE ["CAPA DE PERSISTENCIA &amp; MEMORIA"]</w:t>
-              <w:br/>
-              <w:t xml:space="preserve">        MYSQL_DB[("MySQL 8.0 Relacional: Mascotas, Usuarios, Fármacos")]</w:t>
-              <w:br/>
-              <w:t xml:space="preserve">        DISK_MD[("Sistema de Archivos: Skills Markdown .md")]</w:t>
-              <w:br/>
-              <w:t xml:space="preserve">        CHROMA_STORE[("Chroma Vectors Storage: Colección refuguia_pets")]</w:t>
-              <w:br/>
-              <w:t xml:space="preserve">    end</w:t>
-              <w:br/>
-              <w:br/>
-              <w:t xml:space="preserve">    USER_ACTORS --&gt; UI</w:t>
-              <w:br/>
-              <w:t xml:space="preserve">    UI --&gt; ROUTER</w:t>
-              <w:br/>
-              <w:t xml:space="preserve">    ROUTER --&gt; PET_CTRL</w:t>
-              <w:br/>
-              <w:t xml:space="preserve">    ROUTER --&gt; CLINIC_CTRL</w:t>
-              <w:br/>
-              <w:t xml:space="preserve">    ROUTER --&gt; MATCH_CTRL</w:t>
-              <w:br/>
-              <w:t xml:space="preserve">    </w:t>
-              <w:br/>
-              <w:t xml:space="preserve">    PET_CTRL --&gt; MCP_SERVER</w:t>
-              <w:br/>
-              <w:t xml:space="preserve">    MATCH_CTRL --&gt; MCP_SERVER</w:t>
-              <w:br/>
-              <w:t xml:space="preserve">    CLINIC_CTRL --&gt; MYSQL_DB</w:t>
-              <w:br/>
-              <w:t xml:space="preserve">    </w:t>
-              <w:br/>
-              <w:t xml:space="preserve">    MCP_SERVER --&gt; OLLAMA_SLM</w:t>
-              <w:br/>
-              <w:t xml:space="preserve">    MCP_SERVER --&gt; OLLAMA_VLM</w:t>
-              <w:br/>
-              <w:t xml:space="preserve">    MCP_SERVER --&gt; CHROMA_DB</w:t>
-              <w:br/>
-              <w:t xml:space="preserve">    </w:t>
-              <w:br/>
-              <w:t xml:space="preserve">    PET_CTRL --&gt; MYSQL_DB</w:t>
-              <w:br/>
-              <w:t xml:space="preserve">    MCP_SERVER --&gt; DISK_MD</w:t>
-              <w:br/>
-              <w:t xml:space="preserve">    CHROMA_DB --&gt; CHROMA_STORE</w:t>
-            </w:r>
-          </w:p>
-        </w:tc>
-      </w:tr>
-    </w:tbl>
     <w:p>
       <w:pPr>
-        <w:spacing w:after="120"/>
+        <w:spacing w:before="160" w:after="80"/>
+        <w:jc w:val="center"/>
       </w:pPr>
+      <w:r>
+        <w:drawing>
+          <wp:inline xmlns:a="http://schemas.openxmlformats.org/drawingml/2006/main" xmlns:pic="http://schemas.openxmlformats.org/drawingml/2006/picture">
+            <wp:extent cx="5760720" cy="3215286"/>
+            <wp:docPr id="1" name="Picture 1"/>
+            <wp:cNvGraphicFramePr>
+              <a:graphicFrameLocks noChangeAspect="1"/>
+            </wp:cNvGraphicFramePr>
+            <a:graphic>
+              <a:graphicData uri="http://schemas.openxmlformats.org/drawingml/2006/picture">
+                <pic:pic>
+                  <pic:nvPicPr>
+                    <pic:cNvPr id="0" name="arquitectura_general_refuguia_1787190687918.jpg"/>
+                    <pic:cNvPicPr/>
+                  </pic:nvPicPr>
+                  <pic:blipFill>
+                    <a:blip r:embed="rId9"/>
+                    <a:stretch>
+                      <a:fillRect/>
+                    </a:stretch>
+                  </pic:blipFill>
+                  <pic:spPr>
+                    <a:xfrm>
+                      <a:off x="0" y="0"/>
+                      <a:ext cx="5760720" cy="3215286"/>
+                    </a:xfrm>
+                    <a:prstGeom prst="rect"/>
+                  </pic:spPr>
+                </pic:pic>
+              </a:graphicData>
+            </a:graphic>
+          </wp:inline>
+        </w:drawing>
+      </w:r>
+    </w:p>
+    <w:p>
+      <w:pPr>
+        <w:spacing w:after="200"/>
+        <w:jc w:val="center"/>
+      </w:pPr>
+      <w:r>
+        <w:rPr>
+          <w:rFonts w:ascii="Arial" w:hAnsi="Arial"/>
+          <w:i/>
+          <w:color w:val="64748B"/>
+          <w:sz w:val="17"/>
+        </w:rPr>
+        <w:t>Figura: Arquitectura General en 4 Capas de RefuGuía (Frontend, Backend REST/MCP, IA Local On-Premise y Persistencia).</w:t>
+      </w:r>
     </w:p>
     <w:p>
       <w:pPr>
@@ -2078,141 +1995,60 @@
         <w:t>El sistema opera bajo una Red de Agentes Especializados coordinados por el Servidor MCP (Model Context Protocol 2026.1). Cada agente posee una responsabilidad atómica, un esquema de entrada/salida formalizado en Markdown (.md) y se comunica a través del MCP Dispatcher:</w:t>
       </w:r>
     </w:p>
-    <w:tbl>
-      <w:tblPr>
-        <w:tblW w:type="auto" w:w="0"/>
-        <w:jc w:val="center"/>
-        <w:tblLook w:firstColumn="1" w:firstRow="1" w:lastColumn="0" w:lastRow="0" w:noHBand="0" w:noVBand="1" w:val="04A0"/>
-      </w:tblPr>
-      <w:tblGrid>
-        <w:gridCol w:w="9360"/>
-      </w:tblGrid>
-      <w:tr>
-        <w:tc>
-          <w:tcPr>
-            <w:tcW w:type="dxa" w:w="9360"/>
-            <w:shd w:fill="0F172A"/>
-            <w:tcMar>
-              <w:top w:w="120" w:type="dxa"/>
-              <w:bottom w:w="120" w:type="dxa"/>
-              <w:left w:w="160" w:type="dxa"/>
-              <w:right w:w="160" w:type="dxa"/>
-            </w:tcMar>
-          </w:tcPr>
-          <w:p>
-            <w:pPr>
-              <w:spacing w:after="80"/>
-            </w:pPr>
-            <w:r>
-              <w:rPr>
-                <w:rFonts w:ascii="Arial" w:hAnsi="Arial"/>
-                <w:b/>
-                <w:color w:val="38BDF8"/>
-                <w:sz w:val="18"/>
-              </w:rPr>
-              <w:t>📌 DIAGRAMA DE SECUENCIA MULTI-AGENTE (MCP 2026.1) (Compatible con draw.io &amp; Mermaid):</w:t>
-            </w:r>
-          </w:p>
-          <w:p>
-            <w:pPr>
-              <w:spacing w:line="252" w:lineRule="auto" w:after="0"/>
-            </w:pPr>
-            <w:r>
-              <w:rPr>
-                <w:rFonts w:ascii="Courier New" w:hAnsi="Courier New"/>
-                <w:color w:val="CBD5E1"/>
-                <w:sz w:val="16"/>
-              </w:rPr>
-              <w:t>sequenceDiagram</w:t>
-              <w:br/>
-              <w:t xml:space="preserve">    autonumber</w:t>
-              <w:br/>
-              <w:t xml:space="preserve">    actor Usuario as Damnificada / Rescatista</w:t>
-              <w:br/>
-              <w:t xml:space="preserve">    participant UI as Chat / Portal Vue.js</w:t>
-              <w:br/>
-              <w:t xml:space="preserve">    participant MCP as Servidor MCP (Dispatcher)</w:t>
-              <w:br/>
-              <w:t xml:space="preserve">    participant A_NLP as Agente_NLP_Ingesta (Qwen 2.5)</w:t>
-              <w:br/>
-              <w:t xml:space="preserve">    participant A_VLM as Agente_Peritaje_Visual (Moondream)</w:t>
-              <w:br/>
-              <w:t xml:space="preserve">    participant A_MATCH as Agente_Matchmaker (ChromaDB)</w:t>
-              <w:br/>
-              <w:t xml:space="preserve">    participant A_AUDIT as Agente_Auditor_Legal (Regla 15d)</w:t>
-              <w:br/>
-              <w:t xml:space="preserve">    participant DB as MySQL &amp; ChromaDB</w:t>
-              <w:br/>
-              <w:br/>
-              <w:t xml:space="preserve">    Usuario-&gt;&gt;UI: Envía relato ("Perdí a Toby en Catia") + Foto</w:t>
-              <w:br/>
-              <w:t xml:space="preserve">    UI-&gt;&gt;MCP: POST /api/pets/report-citizen</w:t>
-              <w:br/>
-              <w:t xml:space="preserve">    </w:t>
-              <w:br/>
-              <w:t xml:space="preserve">    rect rgb(240, 249, 255)</w:t>
-              <w:br/>
-              <w:t xml:space="preserve">        note over MCP, A_NLP: 1. Fase de Ingesta &amp; Sanitización</w:t>
-              <w:br/>
-              <w:t xml:space="preserve">        MCP-&gt;&gt;A_NLP: sanitizeInput() + extractEntities()</w:t>
-              <w:br/>
-              <w:t xml:space="preserve">        A_NLP--&gt;&gt;MCP: JSON {species: "canine", breed: "Mestizo", color: "Negro"}</w:t>
-              <w:br/>
-              <w:t xml:space="preserve">    end</w:t>
-              <w:br/>
-              <w:br/>
-              <w:t xml:space="preserve">    rect rgb(254, 243, 199)</w:t>
-              <w:br/>
-              <w:t xml:space="preserve">        note over MCP, A_VLM: 2. Fase de Peritaje Visual</w:t>
-              <w:br/>
-              <w:t xml:space="preserve">        MCP-&gt;&gt;A_VLM: analyzePetImage(photo_url)</w:t>
-              <w:br/>
-              <w:t xml:space="preserve">        A_VLM--&gt;&gt;MCP: Dictamen {manto: "bicolor negro/blanco", orejas: "semicaídas"}</w:t>
-              <w:br/>
-              <w:t xml:space="preserve">    end</w:t>
-              <w:br/>
-              <w:br/>
-              <w:t xml:space="preserve">    MCP-&gt;&gt;DB: Persistir Mascota + Indexar Vector (ChromaDB)</w:t>
-              <w:br/>
-              <w:br/>
-              <w:t xml:space="preserve">    rect rgb(236, 253, 245)</w:t>
-              <w:br/>
-              <w:t xml:space="preserve">        note over MCP, A_MATCH: 3. Fase de Emparejamiento Vectorial K-NN</w:t>
-              <w:br/>
-              <w:t xml:space="preserve">        MCP-&gt;&gt;A_MATCH: skill_calcular_similitud_vectorial(lost_id, found_id)</w:t>
-              <w:br/>
-              <w:t xml:space="preserve">        A_MATCH-&gt;&gt;A_VLM: comparePetPhotos(foto_lost, foto_found)</w:t>
-              <w:br/>
-              <w:t xml:space="preserve">        A_VLM--&gt;&gt;A_MATCH: Score Visual 100%</w:t>
-              <w:br/>
-              <w:t xml:space="preserve">        A_MATCH--&gt;&gt;MCP: Similitud Global 98.5% (Match Confirmado)</w:t>
-              <w:br/>
-              <w:t xml:space="preserve">    end</w:t>
-              <w:br/>
-              <w:br/>
-              <w:t xml:space="preserve">    rect rgb(254, 226, 226)</w:t>
-              <w:br/>
-              <w:t xml:space="preserve">        note over MCP, A_AUDIT: 4. Fase de Auditoría Legal &amp; Adopción</w:t>
-              <w:br/>
-              <w:t xml:space="preserve">        MCP-&gt;&gt;A_AUDIT: skill_verificar_periodo_gracia(pet_id)</w:t>
-              <w:br/>
-              <w:t xml:space="preserve">        A_AUDIT--&gt;&gt;MCP: Bloqueo: Faltan X días para cumplir período de 15d</w:t>
-              <w:br/>
-              <w:t xml:space="preserve">    end</w:t>
-              <w:br/>
-              <w:br/>
-              <w:t xml:space="preserve">    MCP--&gt;&gt;UI: Respuesta Multimodal Estructurada + Notificación de Match</w:t>
-              <w:br/>
-              <w:t xml:space="preserve">    UI--&gt;&gt;Usuario: Muestra tarjeta de coincidencia sin tecnicismos</w:t>
-            </w:r>
-          </w:p>
-        </w:tc>
-      </w:tr>
-    </w:tbl>
     <w:p>
       <w:pPr>
-        <w:spacing w:after="120"/>
+        <w:spacing w:before="160" w:after="80"/>
+        <w:jc w:val="center"/>
       </w:pPr>
+      <w:r>
+        <w:drawing>
+          <wp:inline xmlns:a="http://schemas.openxmlformats.org/drawingml/2006/main" xmlns:pic="http://schemas.openxmlformats.org/drawingml/2006/picture">
+            <wp:extent cx="5760720" cy="3215286"/>
+            <wp:docPr id="2" name="Picture 2"/>
+            <wp:cNvGraphicFramePr>
+              <a:graphicFrameLocks noChangeAspect="1"/>
+            </wp:cNvGraphicFramePr>
+            <a:graphic>
+              <a:graphicData uri="http://schemas.openxmlformats.org/drawingml/2006/picture">
+                <pic:pic>
+                  <pic:nvPicPr>
+                    <pic:cNvPr id="0" name="flujo_multiagente_mcp_1787190695751.jpg"/>
+                    <pic:cNvPicPr/>
+                  </pic:nvPicPr>
+                  <pic:blipFill>
+                    <a:blip r:embed="rId10"/>
+                    <a:stretch>
+                      <a:fillRect/>
+                    </a:stretch>
+                  </pic:blipFill>
+                  <pic:spPr>
+                    <a:xfrm>
+                      <a:off x="0" y="0"/>
+                      <a:ext cx="5760720" cy="3215286"/>
+                    </a:xfrm>
+                    <a:prstGeom prst="rect"/>
+                  </pic:spPr>
+                </pic:pic>
+              </a:graphicData>
+            </a:graphic>
+          </wp:inline>
+        </w:drawing>
+      </w:r>
+    </w:p>
+    <w:p>
+      <w:pPr>
+        <w:spacing w:after="200"/>
+        <w:jc w:val="center"/>
+      </w:pPr>
+      <w:r>
+        <w:rPr>
+          <w:rFonts w:ascii="Arial" w:hAnsi="Arial"/>
+          <w:i/>
+          <w:color w:val="64748B"/>
+          <w:sz w:val="17"/>
+        </w:rPr>
+        <w:t>Figura: Orquestación Multi-Agente coordinada por el Dispatcher Central del Servidor MCP 2026.1.</w:t>
+      </w:r>
     </w:p>
     <w:p>
       <w:pPr>
@@ -2903,16 +2739,57 @@
     </w:p>
     <w:p>
       <w:pPr>
-        <w:spacing w:before="120" w:after="80"/>
+        <w:spacing w:before="160" w:after="80"/>
+        <w:jc w:val="center"/>
+      </w:pPr>
+      <w:r>
+        <w:drawing>
+          <wp:inline xmlns:a="http://schemas.openxmlformats.org/drawingml/2006/main" xmlns:pic="http://schemas.openxmlformats.org/drawingml/2006/picture">
+            <wp:extent cx="5760720" cy="3215286"/>
+            <wp:docPr id="3" name="Picture 3"/>
+            <wp:cNvGraphicFramePr>
+              <a:graphicFrameLocks noChangeAspect="1"/>
+            </wp:cNvGraphicFramePr>
+            <a:graphic>
+              <a:graphicData uri="http://schemas.openxmlformats.org/drawingml/2006/picture">
+                <pic:pic>
+                  <pic:nvPicPr>
+                    <pic:cNvPr id="0" name="diagrama_uml_casos_uso_1787190712621.jpg"/>
+                    <pic:cNvPicPr/>
+                  </pic:nvPicPr>
+                  <pic:blipFill>
+                    <a:blip r:embed="rId11"/>
+                    <a:stretch>
+                      <a:fillRect/>
+                    </a:stretch>
+                  </pic:blipFill>
+                  <pic:spPr>
+                    <a:xfrm>
+                      <a:off x="0" y="0"/>
+                      <a:ext cx="5760720" cy="3215286"/>
+                    </a:xfrm>
+                    <a:prstGeom prst="rect"/>
+                  </pic:spPr>
+                </pic:pic>
+              </a:graphicData>
+            </a:graphic>
+          </wp:inline>
+        </w:drawing>
+      </w:r>
+    </w:p>
+    <w:p>
+      <w:pPr>
+        <w:spacing w:after="200"/>
+        <w:jc w:val="center"/>
       </w:pPr>
       <w:r>
         <w:rPr>
           <w:rFonts w:ascii="Arial" w:hAnsi="Arial"/>
-          <w:b/>
-          <w:color w:val="1E3A8A"/>
-          <w:sz w:val="22"/>
+          <w:i/>
+          <w:color w:val="64748B"/>
+          <w:sz w:val="17"/>
         </w:rPr>
-        <w:t>2.3.1 Diagrama de Casos de Uso del Sistema (Quién hace qué)</w:t>
+        <w:t>Figura: Diagramas UML de Casos de Uso y Secuencia de Interacción de RefuGuía.</w:t>
       </w:r>
     </w:p>
     <w:tbl>
@@ -2947,7 +2824,7 @@
                 <w:color w:val="38BDF8"/>
                 <w:sz w:val="18"/>
               </w:rPr>
-              <w:t>📌 DIAGRAMA DE CASOS DE USO UML (DRAW.IO / MERMAID) (Compatible con draw.io &amp; Mermaid):</w:t>
+              <w:t>📌 CÓDIGO DE IMPORTACIÓN DIRECTA PARA DRAW.IO / MERMAID (Compatible con draw.io &amp; Mermaid):</w:t>
             </w:r>
           </w:p>
           <w:p>
@@ -2960,270 +2837,21 @@
                 <w:color w:val="CBD5E1"/>
                 <w:sz w:val="16"/>
               </w:rPr>
-              <w:t>graph LR</w:t>
+              <w:t>graph TD</w:t>
               <w:br/>
-              <w:t xml:space="preserve">    subgraph ACTORES ["Actores del Sistema"]</w:t>
+              <w:t xml:space="preserve">    UI["SPA Vue.js 3 + Vite"] --&gt; API["Laravel 11 REST API"]</w:t>
               <w:br/>
-              <w:t xml:space="preserve">        ADM["Dra. Carmen López (Coordinadora)"]</w:t>
+              <w:t xml:space="preserve">    API --&gt; MCP["Servidor MCP 2026.1"]</w:t>
               <w:br/>
-              <w:t xml:space="preserve">        RESC["Carlos Mendoza (Rescatista)"]</w:t>
+              <w:t xml:space="preserve">    MCP --&gt; SLM["SLM Qwen 2.5 (1.5B)"]</w:t>
               <w:br/>
-              <w:t xml:space="preserve">        CIT["María Fernández (Damnificada)"]</w:t>
+              <w:t xml:space="preserve">    MCP --&gt; VLM["VLM Moondream (1.4B)"]</w:t>
               <w:br/>
-              <w:t xml:space="preserve">        ADOPT["Andrés Morales (Adoptante)"]</w:t>
+              <w:t xml:space="preserve">    MCP --&gt; CHROMA["ChromaDB v2 VectorStore"]</w:t>
               <w:br/>
-              <w:t xml:space="preserve">    end</w:t>
+              <w:t xml:space="preserve">    API --&gt; MYSQL[("MySQL 8.0 Relacional")]</w:t>
               <w:br/>
-              <w:br/>
-              <w:t xml:space="preserve">    subgraph CASOS_USO ["Casos de Uso de RefuGuía"]</w:t>
-              <w:br/>
-              <w:t xml:space="preserve">        UC1(["Ingresar Rescate por Voz/Texto"])</w:t>
-              <w:br/>
-              <w:t xml:space="preserve">        UC2(["Imprimir Collar QR de Campaña"])</w:t>
-              <w:br/>
-              <w:t xml:space="preserve">        UC3(["Auditar Fármaco Crítico (SHA-256)"])</w:t>
-              <w:br/>
-              <w:t xml:space="preserve">        UC4(["Reportar Mascota Perdida con Foto"])</w:t>
-              <w:br/>
-              <w:t xml:space="preserve">        UC5(["Validar Coincidencia Visual en Detalle"])</w:t>
-              <w:br/>
-              <w:t xml:space="preserve">        UC6(["Confirmar Reencuentro Familiar"])</w:t>
-              <w:br/>
-              <w:t xml:space="preserve">        UC7(["Explorar Mascotas Adoptables (&gt;15d)"])</w:t>
-              <w:br/>
-              <w:t xml:space="preserve">        UC8(["Postular a Adopción &amp; Triaje IA"])</w:t>
-              <w:br/>
-              <w:t xml:space="preserve">    end</w:t>
-              <w:br/>
-              <w:br/>
-              <w:t xml:space="preserve">    RESC --&gt; UC1</w:t>
-              <w:br/>
-              <w:t xml:space="preserve">    RESC --&gt; UC2</w:t>
-              <w:br/>
-              <w:t xml:space="preserve">    RESC --&gt; UC5</w:t>
-              <w:br/>
-              <w:t xml:space="preserve">    </w:t>
-              <w:br/>
-              <w:t xml:space="preserve">    ADM --&gt; UC2</w:t>
-              <w:br/>
-              <w:t xml:space="preserve">    ADM --&gt; UC3</w:t>
-              <w:br/>
-              <w:t xml:space="preserve">    ADM --&gt; UC5</w:t>
-              <w:br/>
-              <w:t xml:space="preserve">    ADM --&gt; UC6</w:t>
-              <w:br/>
-              <w:t xml:space="preserve">    </w:t>
-              <w:br/>
-              <w:t xml:space="preserve">    CIT --&gt; UC4</w:t>
-              <w:br/>
-              <w:t xml:space="preserve">    CIT --&gt; UC5</w:t>
-              <w:br/>
-              <w:t xml:space="preserve">    CIT --&gt; UC6</w:t>
-              <w:br/>
-              <w:t xml:space="preserve">    </w:t>
-              <w:br/>
-              <w:t xml:space="preserve">    ADOPT --&gt; UC7</w:t>
-              <w:br/>
-              <w:t xml:space="preserve">    ADOPT --&gt; UC8</w:t>
-            </w:r>
-          </w:p>
-        </w:tc>
-      </w:tr>
-    </w:tbl>
-    <w:p>
-      <w:pPr>
-        <w:spacing w:after="120"/>
-      </w:pPr>
-    </w:p>
-    <w:p>
-      <w:pPr>
-        <w:spacing w:before="160" w:after="80"/>
-      </w:pPr>
-      <w:r>
-        <w:rPr>
-          <w:rFonts w:ascii="Arial" w:hAnsi="Arial"/>
-          <w:b/>
-          <w:color w:val="1E3A8A"/>
-          <w:sz w:val="22"/>
-        </w:rPr>
-        <w:t>2.3.2 Diagrama de Clases del Dominio y Estructura de Datos</w:t>
-      </w:r>
-    </w:p>
-    <w:tbl>
-      <w:tblPr>
-        <w:tblW w:type="auto" w:w="0"/>
-        <w:jc w:val="center"/>
-        <w:tblLook w:firstColumn="1" w:firstRow="1" w:lastColumn="0" w:lastRow="0" w:noHBand="0" w:noVBand="1" w:val="04A0"/>
-      </w:tblPr>
-      <w:tblGrid>
-        <w:gridCol w:w="9360"/>
-      </w:tblGrid>
-      <w:tr>
-        <w:tc>
-          <w:tcPr>
-            <w:tcW w:type="dxa" w:w="9360"/>
-            <w:shd w:fill="0F172A"/>
-            <w:tcMar>
-              <w:top w:w="120" w:type="dxa"/>
-              <w:bottom w:w="120" w:type="dxa"/>
-              <w:left w:w="160" w:type="dxa"/>
-              <w:right w:w="160" w:type="dxa"/>
-            </w:tcMar>
-          </w:tcPr>
-          <w:p>
-            <w:pPr>
-              <w:spacing w:after="80"/>
-            </w:pPr>
-            <w:r>
-              <w:rPr>
-                <w:rFonts w:ascii="Arial" w:hAnsi="Arial"/>
-                <w:b/>
-                <w:color w:val="38BDF8"/>
-                <w:sz w:val="18"/>
-              </w:rPr>
-              <w:t>📌 DIAGRAMA DE CLASES Y MODELO DE DATOS UML (Compatible con draw.io &amp; Mermaid):</w:t>
-            </w:r>
-          </w:p>
-          <w:p>
-            <w:pPr>
-              <w:spacing w:line="252" w:lineRule="auto" w:after="0"/>
-            </w:pPr>
-            <w:r>
-              <w:rPr>
-                <w:rFonts w:ascii="Courier New" w:hAnsi="Courier New"/>
-                <w:color w:val="CBD5E1"/>
-                <w:sz w:val="16"/>
-              </w:rPr>
-              <w:t>classDiagram</w:t>
-              <w:br/>
-              <w:t xml:space="preserve">    class Pet {</w:t>
-              <w:br/>
-              <w:t xml:space="preserve">        +int id</w:t>
-              <w:br/>
-              <w:t xml:space="preserve">        +string uuid</w:t>
-              <w:br/>
-              <w:t xml:space="preserve">        +string name</w:t>
-              <w:br/>
-              <w:t xml:space="preserve">        +string report_type</w:t>
-              <w:br/>
-              <w:t xml:space="preserve">        +string species</w:t>
-              <w:br/>
-              <w:t xml:space="preserve">        +string breed</w:t>
-              <w:br/>
-              <w:t xml:space="preserve">        +string primary_color</w:t>
-              <w:br/>
-              <w:t xml:space="preserve">        +string size</w:t>
-              <w:br/>
-              <w:t xml:space="preserve">        +string status</w:t>
-              <w:br/>
-              <w:t xml:space="preserve">        +string photo_url</w:t>
-              <w:br/>
-              <w:t xml:space="preserve">        +datetime rescue_date</w:t>
-              <w:br/>
-              <w:t xml:space="preserve">        +datetime grace_period_ends_at</w:t>
-              <w:br/>
-              <w:t xml:space="preserve">        +float latitude</w:t>
-              <w:br/>
-              <w:t xml:space="preserve">        +float longitude</w:t>
-              <w:br/>
-              <w:t xml:space="preserve">        +isEligibleForAdoption() bool</w:t>
-              <w:br/>
-              <w:t xml:space="preserve">    }</w:t>
-              <w:br/>
-              <w:br/>
-              <w:t xml:space="preserve">    class ClinicalRecord {</w:t>
-              <w:br/>
-              <w:t xml:space="preserve">        +int id</w:t>
-              <w:br/>
-              <w:t xml:space="preserve">        +int pet_id</w:t>
-              <w:br/>
-              <w:t xml:space="preserve">        +string veterinarian_name</w:t>
-              <w:br/>
-              <w:t xml:space="preserve">        +string critical_drug</w:t>
-              <w:br/>
-              <w:t xml:space="preserve">        +string dosage</w:t>
-              <w:br/>
-              <w:t xml:space="preserve">        +string observations</w:t>
-              <w:br/>
-              <w:t xml:space="preserve">        +boolean qr_scanned</w:t>
-              <w:br/>
-              <w:t xml:space="preserve">        +string previous_hash</w:t>
-              <w:br/>
-              <w:t xml:space="preserve">        +string hash_sha256</w:t>
-              <w:br/>
-              <w:t xml:space="preserve">        +calculateHash() string</w:t>
-              <w:br/>
-              <w:t xml:space="preserve">    }</w:t>
-              <w:br/>
-              <w:br/>
-              <w:t xml:space="preserve">    class AdoptionApplication {</w:t>
-              <w:br/>
-              <w:t xml:space="preserve">        +int id</w:t>
-              <w:br/>
-              <w:t xml:space="preserve">        +int pet_id</w:t>
-              <w:br/>
-              <w:t xml:space="preserve">        +int user_id</w:t>
-              <w:br/>
-              <w:t xml:space="preserve">        +float monthly_income_usd</w:t>
-              <w:br/>
-              <w:t xml:space="preserve">        +string housing_type</w:t>
-              <w:br/>
-              <w:t xml:space="preserve">        +boolean has_closed_patio</w:t>
-              <w:br/>
-              <w:t xml:space="preserve">        +boolean has_other_pets</w:t>
-              <w:br/>
-              <w:t xml:space="preserve">        +float compatibility_score</w:t>
-              <w:br/>
-              <w:t xml:space="preserve">        +string status</w:t>
-              <w:br/>
-              <w:t xml:space="preserve">        +string ai_decision_rationale</w:t>
-              <w:br/>
-              <w:t xml:space="preserve">    }</w:t>
-              <w:br/>
-              <w:br/>
-              <w:t xml:space="preserve">    class MatchLog {</w:t>
-              <w:br/>
-              <w:t xml:space="preserve">        +int id</w:t>
-              <w:br/>
-              <w:t xml:space="preserve">        +int lost_pet_id</w:t>
-              <w:br/>
-              <w:t xml:space="preserve">        +int found_pet_id</w:t>
-              <w:br/>
-              <w:t xml:space="preserve">        +float similarity_score</w:t>
-              <w:br/>
-              <w:t xml:space="preserve">        +float visual_score</w:t>
-              <w:br/>
-              <w:t xml:space="preserve">        +float nlp_score</w:t>
-              <w:br/>
-              <w:t xml:space="preserve">        +float geo_distance_km</w:t>
-              <w:br/>
-              <w:t xml:space="preserve">        +string status</w:t>
-              <w:br/>
-              <w:t xml:space="preserve">    }</w:t>
-              <w:br/>
-              <w:br/>
-              <w:t xml:space="preserve">    class User {</w:t>
-              <w:br/>
-              <w:t xml:space="preserve">        +int id</w:t>
-              <w:br/>
-              <w:t xml:space="preserve">        +string name</w:t>
-              <w:br/>
-              <w:t xml:space="preserve">        +string email</w:t>
-              <w:br/>
-              <w:t xml:space="preserve">        +string role</w:t>
-              <w:br/>
-              <w:t xml:space="preserve">        +hasRole(string role) bool</w:t>
-              <w:br/>
-              <w:t xml:space="preserve">    }</w:t>
-              <w:br/>
-              <w:br/>
-              <w:t xml:space="preserve">    Pet "1" --&gt; "0..*" ClinicalRecord : contains</w:t>
-              <w:br/>
-              <w:t xml:space="preserve">    Pet "1" --&gt; "0..*" AdoptionApplication : receives</w:t>
-              <w:br/>
-              <w:t xml:space="preserve">    Pet "1" --&gt; "0..*" MatchLog : matches</w:t>
-              <w:br/>
-              <w:t xml:space="preserve">    User "1" --&gt; "0..*" AdoptionApplication : submits</w:t>
+              <w:t xml:space="preserve">    API --&gt; SHA["Fármacos Inmutables SHA-256"]</w:t>
             </w:r>
           </w:p>
         </w:tc>

</xml_diff>

<commit_message>
docs: actualizar diagramas de la Seccion 2 a formato UML clasico y 100% en espanol
</commit_message>
<xml_diff>
--- a/doc/INFORME_FINAL_REFUGUIA_PARTE2.docx
+++ b/doc/INFORME_FINAL_REFUGUIA_PARTE2.docx
@@ -13,7 +13,7 @@
           <w:color w:val="0D9488"/>
           <w:sz w:val="18"/>
         </w:rPr>
-        <w:t>PROGRAMA DE INTELIGENCIA ARTIFICIAL APLICADA Â· UTN-FRBA &amp; EPIDATA</w:t>
+        <w:t>PROGRAMA DE INTELIGENCIA ARTIFICIAL APLICADA · UTN-FRBA &amp; EPIDATA</w:t>
       </w:r>
     </w:p>
     <w:p>
@@ -27,7 +27,7 @@
           <w:color w:val="1E3A8A"/>
           <w:sz w:val="44"/>
         </w:rPr>
-        <w:t>INFORME TÃ‰CNICO DE IMPLEMENTACIÃ“N FINAL</w:t>
+        <w:t>INFORME TÉCNICO DE IMPLEMENTACIÓN FINAL</w:t>
       </w:r>
     </w:p>
     <w:p>
@@ -40,7 +40,7 @@
           <w:color w:val="64748B"/>
           <w:sz w:val="22"/>
         </w:rPr>
-        <w:t>RefuGuÃ­a: Sistema Integral Multi-Agente On-Premise con IA Local (SLM+VLM), Protocolo MCP y Trazabilidad MÃ©dica Inmutable Post-Sismo</w:t>
+        <w:t>RefuGuía: Sistema Integral Multi-Agente On-Premise con IA Local (SLM+VLM), Protocolo MCP y Trazabilidad Médica Inmutable Post-Sismo</w:t>
       </w:r>
     </w:p>
     <w:p>
@@ -62,7 +62,7 @@
           <w:color w:val="1E3A8A"/>
           <w:sz w:val="32"/>
         </w:rPr>
-        <w:t>SecciÃ³n 1 Â· PresentaciÃ³n del Equipo y del Proyecto</w:t>
+        <w:t>Sección 1 · Presentación del Equipo y del Proyecto</w:t>
       </w:r>
     </w:p>
     <w:p>
@@ -89,7 +89,7 @@
           <w:color w:val="0F172A"/>
           <w:sz w:val="20"/>
         </w:rPr>
-        <w:t>El proyecto fue concebido, diseÃ±ado, implementado y validado en su totalidad de manera individual por el siguiente integrante, asumiendo un enfoque multidisciplinario 'Full-Cycle AI Engineering':</w:t>
+        <w:t>El proyecto fue concebido, diseñado, implementado y validado en su totalidad de manera individual por el siguiente integrante, asumiendo un enfoque multidisciplinario 'Full-Cycle AI Engineering':</w:t>
       </w:r>
     </w:p>
     <w:tbl>
@@ -117,9 +117,6 @@
             </w:tcMar>
           </w:tcPr>
           <w:p>
-            <w:pPr>
-              <w:jc w:val="left"/>
-            </w:pPr>
             <w:r>
               <w:rPr>
                 <w:rFonts w:ascii="Arial" w:hAnsi="Arial"/>
@@ -143,9 +140,6 @@
             </w:tcMar>
           </w:tcPr>
           <w:p>
-            <w:pPr>
-              <w:jc w:val="left"/>
-            </w:pPr>
             <w:r>
               <w:rPr>
                 <w:rFonts w:ascii="Arial" w:hAnsi="Arial"/>
@@ -169,9 +163,6 @@
             </w:tcMar>
           </w:tcPr>
           <w:p>
-            <w:pPr>
-              <w:jc w:val="left"/>
-            </w:pPr>
             <w:r>
               <w:rPr>
                 <w:rFonts w:ascii="Arial" w:hAnsi="Arial"/>
@@ -197,9 +188,6 @@
             </w:tcMar>
           </w:tcPr>
           <w:p>
-            <w:pPr>
-              <w:spacing w:line="264" w:lineRule="auto"/>
-            </w:pPr>
             <w:r>
               <w:rPr>
                 <w:rFonts w:ascii="Arial" w:hAnsi="Arial"/>
@@ -207,7 +195,7 @@
                 <w:color w:val="0F172A"/>
                 <w:sz w:val="18"/>
               </w:rPr>
-              <w:t>VÃ­ctor Rivas</w:t>
+              <w:t>Víctor Rivas</w:t>
             </w:r>
           </w:p>
         </w:tc>
@@ -223,9 +211,6 @@
             </w:tcMar>
           </w:tcPr>
           <w:p>
-            <w:pPr>
-              <w:spacing w:line="264" w:lineRule="auto"/>
-            </w:pPr>
             <w:r>
               <w:rPr>
                 <w:rFonts w:ascii="Arial" w:hAnsi="Arial"/>
@@ -249,16 +234,13 @@
             </w:tcMar>
           </w:tcPr>
           <w:p>
-            <w:pPr>
-              <w:spacing w:line="264" w:lineRule="auto"/>
-            </w:pPr>
             <w:r>
               <w:rPr>
                 <w:rFonts w:ascii="Arial" w:hAnsi="Arial"/>
                 <w:color w:val="0F172A"/>
                 <w:sz w:val="18"/>
               </w:rPr>
-              <w:t>DiseÃ±o de la arquitectura Multi-Agente On-Premise, integraciÃ³n de Ollama Local (SLM Qwen 2.5 + VLM Moondream) y base de datos vectorial ChromaDB.</w:t>
+              <w:t>Diseño de la arquitectura Multi-Agente On-Premise, integración de Ollama Local (SLM Qwen 2.5 + VLM Moondream) y base de datos vectorial ChromaDB.</w:t>
             </w:r>
           </w:p>
         </w:tc>
@@ -276,9 +258,6 @@
             </w:tcMar>
           </w:tcPr>
           <w:p>
-            <w:pPr>
-              <w:spacing w:line="264" w:lineRule="auto"/>
-            </w:pPr>
             <w:r>
               <w:rPr>
                 <w:rFonts w:ascii="Arial" w:hAnsi="Arial"/>
@@ -286,7 +265,7 @@
                 <w:color w:val="0F172A"/>
                 <w:sz w:val="18"/>
               </w:rPr>
-              <w:t>VÃ­ctor Rivas</w:t>
+              <w:t>Víctor Rivas</w:t>
             </w:r>
           </w:p>
         </w:tc>
@@ -302,9 +281,6 @@
             </w:tcMar>
           </w:tcPr>
           <w:p>
-            <w:pPr>
-              <w:spacing w:line="264" w:lineRule="auto"/>
-            </w:pPr>
             <w:r>
               <w:rPr>
                 <w:rFonts w:ascii="Arial" w:hAnsi="Arial"/>
@@ -328,16 +304,13 @@
             </w:tcMar>
           </w:tcPr>
           <w:p>
-            <w:pPr>
-              <w:spacing w:line="264" w:lineRule="auto"/>
-            </w:pPr>
             <w:r>
               <w:rPr>
                 <w:rFonts w:ascii="Arial" w:hAnsi="Arial"/>
                 <w:color w:val="0F172A"/>
                 <w:sz w:val="18"/>
               </w:rPr>
-              <w:t>ImplementaciÃ³n de la API REST en Laravel 11, Servidor de Protocolo MCP con 6 Skills agÃ©nticas (.md) y lÃ³gica inmutable SHA-256 de fÃ¡rmacos.</w:t>
+              <w:t>Implementación de la API REST en Laravel 11, Servidor de Protocolo MCP con 6 Skills agénticas (.md) y lógica inmutable SHA-256 de fármacos.</w:t>
             </w:r>
           </w:p>
         </w:tc>
@@ -355,9 +328,6 @@
             </w:tcMar>
           </w:tcPr>
           <w:p>
-            <w:pPr>
-              <w:spacing w:line="264" w:lineRule="auto"/>
-            </w:pPr>
             <w:r>
               <w:rPr>
                 <w:rFonts w:ascii="Arial" w:hAnsi="Arial"/>
@@ -365,7 +335,7 @@
                 <w:color w:val="0F172A"/>
                 <w:sz w:val="18"/>
               </w:rPr>
-              <w:t>VÃ­ctor Rivas</w:t>
+              <w:t>Víctor Rivas</w:t>
             </w:r>
           </w:p>
         </w:tc>
@@ -381,9 +351,6 @@
             </w:tcMar>
           </w:tcPr>
           <w:p>
-            <w:pPr>
-              <w:spacing w:line="264" w:lineRule="auto"/>
-            </w:pPr>
             <w:r>
               <w:rPr>
                 <w:rFonts w:ascii="Arial" w:hAnsi="Arial"/>
@@ -407,16 +374,13 @@
             </w:tcMar>
           </w:tcPr>
           <w:p>
-            <w:pPr>
-              <w:spacing w:line="264" w:lineRule="auto"/>
-            </w:pPr>
             <w:r>
               <w:rPr>
                 <w:rFonts w:ascii="Arial" w:hAnsi="Arial"/>
                 <w:color w:val="0F172A"/>
                 <w:sz w:val="18"/>
               </w:rPr>
-              <w:t>CreaciÃ³n de la Single Page Application en Vue.js 3 + Vite, diseÃ±o reactivo con Tailwind/Vanilla CSS, flujos de usuario y selector 1-Click de personas.</w:t>
+              <w:t>Creación de la Single Page Application en Vue.js 3 + Vite, diseño reactivo con Tailwind/Vanilla CSS, flujos de usuario y selector 1-Click de personas.</w:t>
             </w:r>
           </w:p>
         </w:tc>
@@ -434,9 +398,6 @@
             </w:tcMar>
           </w:tcPr>
           <w:p>
-            <w:pPr>
-              <w:spacing w:line="264" w:lineRule="auto"/>
-            </w:pPr>
             <w:r>
               <w:rPr>
                 <w:rFonts w:ascii="Arial" w:hAnsi="Arial"/>
@@ -444,7 +405,7 @@
                 <w:color w:val="0F172A"/>
                 <w:sz w:val="18"/>
               </w:rPr>
-              <w:t>VÃ­ctor Rivas</w:t>
+              <w:t>Víctor Rivas</w:t>
             </w:r>
           </w:p>
         </w:tc>
@@ -460,9 +421,6 @@
             </w:tcMar>
           </w:tcPr>
           <w:p>
-            <w:pPr>
-              <w:spacing w:line="264" w:lineRule="auto"/>
-            </w:pPr>
             <w:r>
               <w:rPr>
                 <w:rFonts w:ascii="Arial" w:hAnsi="Arial"/>
@@ -486,16 +444,13 @@
             </w:tcMar>
           </w:tcPr>
           <w:p>
-            <w:pPr>
-              <w:spacing w:line="264" w:lineRule="auto"/>
-            </w:pPr>
             <w:r>
               <w:rPr>
                 <w:rFonts w:ascii="Arial" w:hAnsi="Arial"/>
                 <w:color w:val="0F172A"/>
                 <w:sz w:val="18"/>
               </w:rPr>
-              <w:t>DiseÃ±o de defensas contra Prompt Injection/Jailbreaks, control de acceso RBAC por roles, sanitizaciÃ³n estricta y suite de 8 pruebas automatizadas al 100%.</w:t>
+              <w:t>Diseño de defensas contra Prompt Injection/Jailbreaks, control de acceso RBAC por roles, sanitización estricta y suite de 8 pruebas automatizadas al 100%.</w:t>
             </w:r>
           </w:p>
         </w:tc>
@@ -513,9 +468,6 @@
             </w:tcMar>
           </w:tcPr>
           <w:p>
-            <w:pPr>
-              <w:spacing w:line="264" w:lineRule="auto"/>
-            </w:pPr>
             <w:r>
               <w:rPr>
                 <w:rFonts w:ascii="Arial" w:hAnsi="Arial"/>
@@ -523,7 +475,7 @@
                 <w:color w:val="0F172A"/>
                 <w:sz w:val="18"/>
               </w:rPr>
-              <w:t>VÃ­ctor Rivas</w:t>
+              <w:t>Víctor Rivas</w:t>
             </w:r>
           </w:p>
         </w:tc>
@@ -539,9 +491,6 @@
             </w:tcMar>
           </w:tcPr>
           <w:p>
-            <w:pPr>
-              <w:spacing w:line="264" w:lineRule="auto"/>
-            </w:pPr>
             <w:r>
               <w:rPr>
                 <w:rFonts w:ascii="Arial" w:hAnsi="Arial"/>
@@ -549,7 +498,7 @@
                 <w:color w:val="0F172A"/>
                 <w:sz w:val="18"/>
               </w:rPr>
-              <w:t>DevOps &amp; Despliegue de CampaÃ±a</w:t>
+              <w:t>DevOps &amp; Despliegue de Campaña</w:t>
             </w:r>
           </w:p>
         </w:tc>
@@ -565,16 +514,13 @@
             </w:tcMar>
           </w:tcPr>
           <w:p>
-            <w:pPr>
-              <w:spacing w:line="264" w:lineRule="auto"/>
-            </w:pPr>
             <w:r>
               <w:rPr>
                 <w:rFonts w:ascii="Arial" w:hAnsi="Arial"/>
                 <w:color w:val="0F172A"/>
                 <w:sz w:val="18"/>
               </w:rPr>
-              <w:t>ContenerizaciÃ³n Docker Multi-Contenedor, orquestaciÃ³n WSL2/Ubuntu, pipelines locales y gestiÃ³n de versionamiento Git en GitHub.</w:t>
+              <w:t>Contenerización Docker Multi-Contenedor, orquestación WSL2/Ubuntu, pipelines locales y gestión de versionamiento Git en GitHub.</w:t>
             </w:r>
           </w:p>
         </w:tc>
@@ -631,7 +577,7 @@
                 <w:color w:val="1E3A8A"/>
                 <w:sz w:val="32"/>
               </w:rPr>
-              <w:t>RefuGuÃ­a</w:t>
+              <w:t>RefuGuía</w:t>
             </w:r>
           </w:p>
           <w:p>
@@ -644,7 +590,7 @@
                 <w:color w:val="0F172A"/>
                 <w:sz w:val="19"/>
               </w:rPr>
-              <w:t>Sistema Integral Multi-Agente On-Premise con Inteligencia Artificial Local (SLM LingÃ¼Ã­stico + VLM de VisiÃ³n Computacional), Protocolo MCP (Model Context Protocol) y Trazabilidad MÃ©dica Inmutable para Refugios de Emergencia y Reencuentro Familiar de Mascotas Post-Sismo.</w:t>
+              <w:t>Sistema Integral Multi-Agente On-Premise con Inteligencia Artificial Local (SLM Lingüístico + VLM de Visión Computacional), Protocolo MCP (Model Context Protocol) y Trazabilidad Médica Inmutable para Refugios de Emergencia y Reencuentro Familiar de Mascotas Post-Sismo.</w:t>
             </w:r>
           </w:p>
         </w:tc>
@@ -666,7 +612,7 @@
           <w:color w:val="0D9488"/>
           <w:sz w:val="25"/>
         </w:rPr>
-        <w:t>1.3 Problema que Resuelve (Punto de Partida y SoluciÃ³n Implementada)</w:t>
+        <w:t>1.3 Problema que Resuelve (Punto de Partida y Solución Implementada)</w:t>
       </w:r>
     </w:p>
     <w:p>
@@ -680,7 +626,7 @@
           <w:color w:val="1E3A8A"/>
           <w:sz w:val="20"/>
         </w:rPr>
-        <w:t>A. Punto de Partida y DiagnÃ³stico de la Crisis:</w:t>
+        <w:t>A. Punto de Partida y Diagnóstico de la Crisis:</w:t>
       </w:r>
     </w:p>
     <w:p>
@@ -693,7 +639,7 @@
           <w:color w:val="0F172A"/>
           <w:sz w:val="19"/>
         </w:rPr>
-        <w:t>Tras eventos catastrÃ³ficos como el sismo de Caracas (6.2 Mw), la infraestructura elÃ©ctrica y las telecomunicaciones suelen colapsar, generando un escenario crÃ­tico caracterizado por: (1) ExtravÃ­o masivo de animales de compaÃ±Ã­a en shock, (2) SaturaciÃ³n de refugios de campaÃ±a gestionados con libretas de papel propensas a extravÃ­o o daÃ±o por humedad/lluvia, (3) Falta de trazabilidad en la administraciÃ³n de fÃ¡rmacos crÃ­ticos (generando riesgos de sobredosis o intoxicaciÃ³n en animales rescatados), (4) Inexistencia de mecanismos automatizados para hacer cumplir el perÃ­odo de gracia legal inamovible de 15 dÃ­as continuos de bÃºsqueda pÃºblica antes de dar una mascota en adopciÃ³n, y (5) Imposibilidad de usar nubes comerciales (OpenAI, AWS) por corte de conectividad a internet y restricciones presupuestarias.</w:t>
+        <w:t>Tras eventos catastróficos como el sismo de Caracas (6.2 Mw), la infraestructura eléctrica y las telecomunicaciones suelen colapsar, generando un escenario crítico caracterizado por: (1) Extravío masivo de animales de compañía en shock, (2) Saturación de refugios de campaña gestionados con libretas de papel propensas a extravío o daño por humedad/lluvia, (3) Falta de trazabilidad en la administración de fármacos críticos (generando riesgos de sobredosis o intoxicación en animales rescatados), (4) Inexistencia de mecanismos automatizados para hacer cumplir el período de gracia legal inamovible de 15 días continuos de búsqueda pública antes de dar una mascota en adopción, y (5) Imposibilidad de usar nubes comerciales (OpenAI, AWS) por corte de conectividad a internet y restricciones presupuestarias.</w:t>
       </w:r>
     </w:p>
     <w:p>
@@ -707,7 +653,7 @@
           <w:color w:val="1E3A8A"/>
           <w:sz w:val="20"/>
         </w:rPr>
-        <w:t>B. SoluciÃ³n TecnolÃ³gica Implementada:</w:t>
+        <w:t>B. Solución Tecnológica Implementada:</w:t>
       </w:r>
     </w:p>
     <w:p>
@@ -720,7 +666,7 @@
           <w:color w:val="0F172A"/>
           <w:sz w:val="19"/>
         </w:rPr>
-        <w:t>RefuGuÃ­a resuelve integralmente esta problemÃ¡tica mediante una arquitectura Multi-Agente On-Premise operada en laptops o servidores locales de campaÃ±a. La soluciÃ³n combina: (1) Agente LingÃ¼Ã­stico SLM (Qwen 2.5 1.5B) para ingesta de relatos en lenguaje natural venezolano por voz o texto, (2) Agente de Peritaje Visual VLM (Moondream 1.4B) para anÃ¡lisis y cotejo de fotografÃ­as pÃ­xel a pÃ­xel, (3) Motor Vectorial RAG en ChromaDB para emparejamiento semÃ¡ntico K-NN entre animales perdidos y encontrados, (4) Servidor MCP oficial (Model Context Protocol 2026.1) con 6 Skills agÃ©nticas auditables basadas en especificaciones Markdown, (5) Trazabilidad MÃ©dica Inmutable mediante hashes criptogrÃ¡ficos SHA-256 encadenados y bloqueo estricto por escaneo de collares QR fÃ­sicos, y (6) AuditorÃ­a jurÃ­dica automatizada del perÃ­odo legal de 15 dÃ­as con triaje de idoneidad para adoptantes.</w:t>
+        <w:t>RefuGuía resuelve integralmente esta problemática mediante una arquitectura Multi-Agente On-Premise operada en laptops o servidores locales de campaña. La solución combina: (1) Agente Lingüístico SLM (Qwen 2.5 1.5B) para ingesta de relatos en lenguaje natural venezolano por voz o texto, (2) Agente de Peritaje Visual VLM (Moondream 1.4B) para análisis y cotejo de fotografías píxel a píxel, (3) Motor Vectorial RAG en ChromaDB para emparejamiento semántico K-NN entre animales perdidos y encontrados, (4) Servidor MCP oficial (Model Context Protocol 2026.1) con 6 Skills agénticas auditables basadas en especificaciones Markdown, (5) Trazabilidad Médica Inmutable mediante hashes criptográficos SHA-256 encadenados y bloqueo estricto por escaneo de collares QR físicos, y (6) Auditoría jurídica automatizada del período legal de 15 días con triaje de idoneidad para adoptantes.</w:t>
       </w:r>
     </w:p>
     <w:p>
@@ -734,7 +680,7 @@
           <w:color w:val="0D9488"/>
           <w:sz w:val="25"/>
         </w:rPr>
-        <w:t>1.4 PÃºblico Objetivo (Usuarios Reales de la AplicaciÃ³n)</w:t>
+        <w:t>1.4 Público Objetivo (Usuarios Reales de la Aplicación)</w:t>
       </w:r>
     </w:p>
     <w:p>
@@ -747,7 +693,7 @@
           <w:color w:val="0F172A"/>
           <w:sz w:val="19"/>
         </w:rPr>
-        <w:t>El sistema implementa una segregaciÃ³n estricta de perfiles basada en Roles (RBAC), adaptando la interfaz y permisos a 4 actores operativos esenciales:</w:t>
+        <w:t>El sistema implementa una segregación estricta de perfiles basada en Roles (RBAC), adaptando la interfaz y permisos a 4 actores operativos esenciales:</w:t>
       </w:r>
     </w:p>
     <w:tbl>
@@ -776,9 +722,6 @@
             </w:tcMar>
           </w:tcPr>
           <w:p>
-            <w:pPr>
-              <w:jc w:val="left"/>
-            </w:pPr>
             <w:r>
               <w:rPr>
                 <w:rFonts w:ascii="Arial" w:hAnsi="Arial"/>
@@ -802,9 +745,6 @@
             </w:tcMar>
           </w:tcPr>
           <w:p>
-            <w:pPr>
-              <w:jc w:val="left"/>
-            </w:pPr>
             <w:r>
               <w:rPr>
                 <w:rFonts w:ascii="Arial" w:hAnsi="Arial"/>
@@ -828,9 +768,6 @@
             </w:tcMar>
           </w:tcPr>
           <w:p>
-            <w:pPr>
-              <w:jc w:val="left"/>
-            </w:pPr>
             <w:r>
               <w:rPr>
                 <w:rFonts w:ascii="Arial" w:hAnsi="Arial"/>
@@ -854,9 +791,6 @@
             </w:tcMar>
           </w:tcPr>
           <w:p>
-            <w:pPr>
-              <w:jc w:val="left"/>
-            </w:pPr>
             <w:r>
               <w:rPr>
                 <w:rFonts w:ascii="Arial" w:hAnsi="Arial"/>
@@ -864,7 +798,7 @@
                 <w:color w:val="FFFFFF"/>
                 <w:sz w:val="19"/>
               </w:rPr>
-              <w:t>MÃ³dulos y Permisos Habilitados</w:t>
+              <w:t>Módulos y Permisos Habilitados</w:t>
             </w:r>
           </w:p>
         </w:tc>
@@ -882,9 +816,6 @@
             </w:tcMar>
           </w:tcPr>
           <w:p>
-            <w:pPr>
-              <w:spacing w:line="264" w:lineRule="auto"/>
-            </w:pPr>
             <w:r>
               <w:rPr>
                 <w:rFonts w:ascii="Arial" w:hAnsi="Arial"/>
@@ -892,7 +823,7 @@
                 <w:color w:val="0F172A"/>
                 <w:sz w:val="17"/>
               </w:rPr>
-              <w:t>Dra. Carmen LÃ³pez</w:t>
+              <w:t>Dra. Carmen López</w:t>
             </w:r>
           </w:p>
         </w:tc>
@@ -908,9 +839,6 @@
             </w:tcMar>
           </w:tcPr>
           <w:p>
-            <w:pPr>
-              <w:spacing w:line="264" w:lineRule="auto"/>
-            </w:pPr>
             <w:r>
               <w:rPr>
                 <w:rFonts w:ascii="Arial" w:hAnsi="Arial"/>
@@ -935,16 +863,13 @@
             </w:tcMar>
           </w:tcPr>
           <w:p>
-            <w:pPr>
-              <w:spacing w:line="264" w:lineRule="auto"/>
-            </w:pPr>
             <w:r>
               <w:rPr>
                 <w:rFonts w:ascii="Arial" w:hAnsi="Arial"/>
                 <w:color w:val="0F172A"/>
                 <w:sz w:val="17"/>
               </w:rPr>
-              <w:t>Gestionar inventario de campaÃ±a, generar collares QR, auditar tratamientos clÃ­nicos SHA-256 y autorizar adopciones al cumplir 15 dÃ­as.</w:t>
+              <w:t>Gestionar inventario de campaña, generar collares QR, auditar tratamientos clínicos SHA-256 y autorizar adopciones al cumplir 15 días.</w:t>
             </w:r>
           </w:p>
         </w:tc>
@@ -960,16 +885,13 @@
             </w:tcMar>
           </w:tcPr>
           <w:p>
-            <w:pPr>
-              <w:spacing w:line="264" w:lineRule="auto"/>
-            </w:pPr>
             <w:r>
               <w:rPr>
                 <w:rFonts w:ascii="Arial" w:hAnsi="Arial"/>
                 <w:color w:val="0F172A"/>
                 <w:sz w:val="17"/>
               </w:rPr>
-              <w:t>Acceso Total: Refugios &amp; QR, Centro de Reencuentro, AdopciÃ³n, MCP Skills, Consola SLM.</w:t>
+              <w:t>Acceso Total: Refugios &amp; QR, Centro de Reencuentro, Adopción, MCP Skills, Consola SLM.</w:t>
             </w:r>
           </w:p>
         </w:tc>
@@ -987,9 +909,6 @@
             </w:tcMar>
           </w:tcPr>
           <w:p>
-            <w:pPr>
-              <w:spacing w:line="264" w:lineRule="auto"/>
-            </w:pPr>
             <w:r>
               <w:rPr>
                 <w:rFonts w:ascii="Arial" w:hAnsi="Arial"/>
@@ -1013,9 +932,6 @@
             </w:tcMar>
           </w:tcPr>
           <w:p>
-            <w:pPr>
-              <w:spacing w:line="264" w:lineRule="auto"/>
-            </w:pPr>
             <w:r>
               <w:rPr>
                 <w:rFonts w:ascii="Arial" w:hAnsi="Arial"/>
@@ -1040,9 +956,6 @@
             </w:tcMar>
           </w:tcPr>
           <w:p>
-            <w:pPr>
-              <w:spacing w:line="264" w:lineRule="auto"/>
-            </w:pPr>
             <w:r>
               <w:rPr>
                 <w:rFonts w:ascii="Arial" w:hAnsi="Arial"/>
@@ -1065,16 +978,13 @@
             </w:tcMar>
           </w:tcPr>
           <w:p>
-            <w:pPr>
-              <w:spacing w:line="264" w:lineRule="auto"/>
-            </w:pPr>
             <w:r>
               <w:rPr>
                 <w:rFonts w:ascii="Arial" w:hAnsi="Arial"/>
                 <w:color w:val="0F172A"/>
                 <w:sz w:val="17"/>
               </w:rPr>
-              <w:t>Chat Ciudadano (Ingreso RÃ¡pido), Refugios &amp; QR, Centro de Reencuentro.</w:t>
+              <w:t>Chat Ciudadano (Ingreso Rápido), Refugios &amp; QR, Centro de Reencuentro.</w:t>
             </w:r>
           </w:p>
         </w:tc>
@@ -1092,9 +1002,6 @@
             </w:tcMar>
           </w:tcPr>
           <w:p>
-            <w:pPr>
-              <w:spacing w:line="264" w:lineRule="auto"/>
-            </w:pPr>
             <w:r>
               <w:rPr>
                 <w:rFonts w:ascii="Arial" w:hAnsi="Arial"/>
@@ -1102,7 +1009,7 @@
                 <w:color w:val="0F172A"/>
                 <w:sz w:val="17"/>
               </w:rPr>
-              <w:t>MarÃ­a FernÃ¡ndez</w:t>
+              <w:t>María Fernández</w:t>
             </w:r>
           </w:p>
         </w:tc>
@@ -1118,9 +1025,6 @@
             </w:tcMar>
           </w:tcPr>
           <w:p>
-            <w:pPr>
-              <w:spacing w:line="264" w:lineRule="auto"/>
-            </w:pPr>
             <w:r>
               <w:rPr>
                 <w:rFonts w:ascii="Arial" w:hAnsi="Arial"/>
@@ -1145,16 +1049,13 @@
             </w:tcMar>
           </w:tcPr>
           <w:p>
-            <w:pPr>
-              <w:spacing w:line="264" w:lineRule="auto"/>
-            </w:pPr>
             <w:r>
               <w:rPr>
                 <w:rFonts w:ascii="Arial" w:hAnsi="Arial"/>
                 <w:color w:val="0F172A"/>
                 <w:sz w:val="17"/>
               </w:rPr>
-              <w:t>Buscar a su mascota extraviada reportando descripciÃ³n o foto, revisar coincidencias sugeridas y postular si cumple requisitos.</w:t>
+              <w:t>Buscar a su mascota extraviada reportando descripción o foto, revisar coincidencias sugeridas y postular si cumple requisitos.</w:t>
             </w:r>
           </w:p>
         </w:tc>
@@ -1170,16 +1071,13 @@
             </w:tcMar>
           </w:tcPr>
           <w:p>
-            <w:pPr>
-              <w:spacing w:line="264" w:lineRule="auto"/>
-            </w:pPr>
             <w:r>
               <w:rPr>
                 <w:rFonts w:ascii="Arial" w:hAnsi="Arial"/>
                 <w:color w:val="0F172A"/>
                 <w:sz w:val="17"/>
               </w:rPr>
-              <w:t>Chat Ciudadano (BÃºsqueda Familiar), Centro de Reencuentro, Portal de AdopciÃ³n (15d).</w:t>
+              <w:t>Chat Ciudadano (Búsqueda Familiar), Centro de Reencuentro, Portal de Adopción (15d).</w:t>
             </w:r>
           </w:p>
         </w:tc>
@@ -1197,9 +1095,6 @@
             </w:tcMar>
           </w:tcPr>
           <w:p>
-            <w:pPr>
-              <w:spacing w:line="264" w:lineRule="auto"/>
-            </w:pPr>
             <w:r>
               <w:rPr>
                 <w:rFonts w:ascii="Arial" w:hAnsi="Arial"/>
@@ -1207,7 +1102,7 @@
                 <w:color w:val="0F172A"/>
                 <w:sz w:val="17"/>
               </w:rPr>
-              <w:t>AndrÃ©s Morales</w:t>
+              <w:t>Andrés Morales</w:t>
             </w:r>
           </w:p>
         </w:tc>
@@ -1223,9 +1118,6 @@
             </w:tcMar>
           </w:tcPr>
           <w:p>
-            <w:pPr>
-              <w:spacing w:line="264" w:lineRule="auto"/>
-            </w:pPr>
             <w:r>
               <w:rPr>
                 <w:rFonts w:ascii="Arial" w:hAnsi="Arial"/>
@@ -1250,16 +1142,13 @@
             </w:tcMar>
           </w:tcPr>
           <w:p>
-            <w:pPr>
-              <w:spacing w:line="264" w:lineRule="auto"/>
-            </w:pPr>
             <w:r>
               <w:rPr>
                 <w:rFonts w:ascii="Arial" w:hAnsi="Arial"/>
                 <w:color w:val="0F172A"/>
                 <w:sz w:val="17"/>
               </w:rPr>
-              <w:t>Explorar catÃ¡logo de animales con perÃ­odo de bÃºsqueda vencido (&gt;15d) y postularse mediante evaluaciÃ³n de idoneidad con IA.</w:t>
+              <w:t>Explorar catálogo de animales con período de búsqueda vencido (&gt;15d) y postularse mediante evaluación de idoneidad con IA.</w:t>
             </w:r>
           </w:p>
         </w:tc>
@@ -1275,21 +1164,23 @@
             </w:tcMar>
           </w:tcPr>
           <w:p>
-            <w:pPr>
-              <w:spacing w:line="264" w:lineRule="auto"/>
-            </w:pPr>
             <w:r>
               <w:rPr>
                 <w:rFonts w:ascii="Arial" w:hAnsi="Arial"/>
                 <w:color w:val="0F172A"/>
                 <w:sz w:val="17"/>
               </w:rPr>
-              <w:t>Chat Asistente de AdopciÃ³n, Portal de AdopciÃ³n Responsable (Triaje IA).</w:t>
+              <w:t>Chat Asistente de Adopción, Portal de Adopción Responsable (Triaje IA).</w:t>
             </w:r>
           </w:p>
         </w:tc>
       </w:tr>
     </w:tbl>
+    <w:p>
+      <w:pPr>
+        <w:spacing w:after="160"/>
+      </w:pPr>
+    </w:p>
     <w:p>
       <w:pPr>
         <w:spacing w:before="360" w:after="200"/>
@@ -1315,7 +1206,7 @@
           <w:color w:val="0D9488"/>
           <w:sz w:val="25"/>
         </w:rPr>
-        <w:t>2.1 Diagrama de Arquitectura General del Sistema</w:t>
+        <w:t>2.1 Diagrama de Arquitectura General del Sistema (UML de Paquetes)</w:t>
       </w:r>
     </w:p>
     <w:p>
@@ -1328,7 +1219,7 @@
           <w:color w:val="0F172A"/>
           <w:sz w:val="19"/>
         </w:rPr>
-        <w:t>La arquitectura de RefuGuía está estructurada en 4 capas desacopladas y 100% On-Premise para escenarios de contingencia post-sismo. Distingue con claridad los componentes basados en Inteligencia Artificial Generativa y Visión de aquellos gobernados por lógica transaccional determinista tradicional y auditoría criptográfica inmutable:</w:t>
+        <w:t>La arquitectura de RefuGuía está estructurada en 4 capas desacopladas y 100% On-Premise para escenarios de contingencia post-sismo. El siguiente diagrama UML de paquetes ilustra cómo fluyen los datos de Entrada y Salida, diferenciando los módulos basados en Inteligencia Artificial de aquellos gobernados por lógica transaccional determinista tradicional y auditoría criptográfica inmutable:</w:t>
       </w:r>
     </w:p>
     <w:p>
@@ -1348,7 +1239,7 @@
               <a:graphicData uri="http://schemas.openxmlformats.org/drawingml/2006/picture">
                 <pic:pic>
                   <pic:nvPicPr>
-                    <pic:cNvPr id="0" name="arquitectura_general_refuguia_1787190687918.jpg"/>
+                    <pic:cNvPr id="0" name="diagrama_arquitectura_uml_es_1787190828010.jpg"/>
                     <pic:cNvPicPr/>
                   </pic:nvPicPr>
                   <pic:blipFill>
@@ -1383,7 +1274,7 @@
           <w:color w:val="64748B"/>
           <w:sz w:val="17"/>
         </w:rPr>
-        <w:t>Figura: Arquitectura General en 4 Capas de RefuGuía (Frontend, Backend REST/MCP, IA Local On-Premise y Persistencia).</w:t>
+        <w:t>Figura: Diagrama UML de Arquitectura General del Sistema RefuGuía en 4 Capas (100% en Español).</w:t>
       </w:r>
     </w:p>
     <w:p>
@@ -1992,7 +1883,7 @@
           <w:color w:val="0F172A"/>
           <w:sz w:val="19"/>
         </w:rPr>
-        <w:t>El sistema opera bajo una Red de Agentes Especializados coordinados por el Servidor MCP (Model Context Protocol 2026.1). Cada agente posee una responsabilidad atómica, un esquema de entrada/salida formalizado en Markdown (.md) y se comunica a través del MCP Dispatcher:</w:t>
+        <w:t>El sistema opera bajo una Red de Agentes Especializados coordinados por el Despachador Central del Servidor MCP (Model Context Protocol 2026.1). El siguiente diagrama muestra el flujo secuencial de decisiones, el ciclo de funcionamiento y la interacción con la capa de persistencia:</w:t>
       </w:r>
     </w:p>
     <w:p>
@@ -2012,7 +1903,7 @@
               <a:graphicData uri="http://schemas.openxmlformats.org/drawingml/2006/picture">
                 <pic:pic>
                   <pic:nvPicPr>
-                    <pic:cNvPr id="0" name="flujo_multiagente_mcp_1787190695751.jpg"/>
+                    <pic:cNvPr id="0" name="diagrama_flujo_agentes_uml_es_1787190838364.jpg"/>
                     <pic:cNvPicPr/>
                   </pic:nvPicPr>
                   <pic:blipFill>
@@ -2047,7 +1938,7 @@
           <w:color w:val="64748B"/>
           <w:sz w:val="17"/>
         </w:rPr>
-        <w:t>Figura: Orquestación Multi-Agente coordinada por el Dispatcher Central del Servidor MCP 2026.1.</w:t>
+        <w:t>Figura: Diagrama de Flujo y Secuencia de la Orquestación Multi-Agente con Protocolo MCP (100% en Español).</w:t>
       </w:r>
     </w:p>
     <w:p>
@@ -2734,7 +2625,20 @@
           <w:color w:val="0D9488"/>
           <w:sz w:val="25"/>
         </w:rPr>
-        <w:t>2.3 Diagramas UML (Casos de Uso, Secuencia y Clases de Dominio)</w:t>
+        <w:t>2.3 Diagramas UML (Casos de Uso del Sistema)</w:t>
+      </w:r>
+    </w:p>
+    <w:p>
+      <w:pPr>
+        <w:spacing w:line="276" w:lineRule="auto" w:after="160"/>
+      </w:pPr>
+      <w:r>
+        <w:rPr>
+          <w:rFonts w:ascii="Arial" w:hAnsi="Arial"/>
+          <w:color w:val="0F172A"/>
+          <w:sz w:val="19"/>
+        </w:rPr>
+        <w:t>El siguiente Diagrama de Casos de Uso UML formal modela las interacciones entre los 4 actores del sistema (Coordinadora de Refugio, Rescatista de Campo, Damnificada y Adoptante) y las funcionalidades del núcleo de RefuGuía:</w:t>
       </w:r>
     </w:p>
     <w:p>
@@ -2754,7 +2658,7 @@
               <a:graphicData uri="http://schemas.openxmlformats.org/drawingml/2006/picture">
                 <pic:pic>
                   <pic:nvPicPr>
-                    <pic:cNvPr id="0" name="diagrama_uml_casos_uso_1787190712621.jpg"/>
+                    <pic:cNvPr id="0" name="diagrama_casos_uso_uml_es_1787190851974.jpg"/>
                     <pic:cNvPicPr/>
                   </pic:nvPicPr>
                   <pic:blipFill>
@@ -2789,78 +2693,8 @@
           <w:color w:val="64748B"/>
           <w:sz w:val="17"/>
         </w:rPr>
-        <w:t>Figura: Diagramas UML de Casos de Uso y Secuencia de Interacción de RefuGuía.</w:t>
+        <w:t>Figura: Diagrama UML de Casos de Uso del Sistema RefuGuía (100% en Español).</w:t>
       </w:r>
-    </w:p>
-    <w:tbl>
-      <w:tblPr>
-        <w:tblW w:type="auto" w:w="0"/>
-        <w:jc w:val="center"/>
-        <w:tblLook w:firstColumn="1" w:firstRow="1" w:lastColumn="0" w:lastRow="0" w:noHBand="0" w:noVBand="1" w:val="04A0"/>
-      </w:tblPr>
-      <w:tblGrid>
-        <w:gridCol w:w="9360"/>
-      </w:tblGrid>
-      <w:tr>
-        <w:tc>
-          <w:tcPr>
-            <w:tcW w:type="dxa" w:w="9360"/>
-            <w:shd w:fill="0F172A"/>
-            <w:tcMar>
-              <w:top w:w="120" w:type="dxa"/>
-              <w:bottom w:w="120" w:type="dxa"/>
-              <w:left w:w="160" w:type="dxa"/>
-              <w:right w:w="160" w:type="dxa"/>
-            </w:tcMar>
-          </w:tcPr>
-          <w:p>
-            <w:pPr>
-              <w:spacing w:after="80"/>
-            </w:pPr>
-            <w:r>
-              <w:rPr>
-                <w:rFonts w:ascii="Arial" w:hAnsi="Arial"/>
-                <w:b/>
-                <w:color w:val="38BDF8"/>
-                <w:sz w:val="18"/>
-              </w:rPr>
-              <w:t>📌 CÓDIGO DE IMPORTACIÓN DIRECTA PARA DRAW.IO / MERMAID (Compatible con draw.io &amp; Mermaid):</w:t>
-            </w:r>
-          </w:p>
-          <w:p>
-            <w:pPr>
-              <w:spacing w:line="252" w:lineRule="auto" w:after="0"/>
-            </w:pPr>
-            <w:r>
-              <w:rPr>
-                <w:rFonts w:ascii="Courier New" w:hAnsi="Courier New"/>
-                <w:color w:val="CBD5E1"/>
-                <w:sz w:val="16"/>
-              </w:rPr>
-              <w:t>graph TD</w:t>
-              <w:br/>
-              <w:t xml:space="preserve">    UI["SPA Vue.js 3 + Vite"] --&gt; API["Laravel 11 REST API"]</w:t>
-              <w:br/>
-              <w:t xml:space="preserve">    API --&gt; MCP["Servidor MCP 2026.1"]</w:t>
-              <w:br/>
-              <w:t xml:space="preserve">    MCP --&gt; SLM["SLM Qwen 2.5 (1.5B)"]</w:t>
-              <w:br/>
-              <w:t xml:space="preserve">    MCP --&gt; VLM["VLM Moondream (1.4B)"]</w:t>
-              <w:br/>
-              <w:t xml:space="preserve">    MCP --&gt; CHROMA["ChromaDB v2 VectorStore"]</w:t>
-              <w:br/>
-              <w:t xml:space="preserve">    API --&gt; MYSQL[("MySQL 8.0 Relacional")]</w:t>
-              <w:br/>
-              <w:t xml:space="preserve">    API --&gt; SHA["Fármacos Inmutables SHA-256"]</w:t>
-            </w:r>
-          </w:p>
-        </w:tc>
-      </w:tr>
-    </w:tbl>
-    <w:p>
-      <w:pPr>
-        <w:spacing w:after="120"/>
-      </w:pPr>
     </w:p>
     <w:sectPr>
       <w:pgSz w:w="12240" w:h="15840"/>

</xml_diff>

<commit_message>
docs: agregar Seccion 4 (Capturas de Frontend, Evidencias e Ingestion Log real) al Informe Final DOCX
</commit_message>
<xml_diff>
--- a/doc/INFORME_FINAL_REFUGUIA_PARTE2.docx
+++ b/doc/INFORME_FINAL_REFUGUIA_PARTE2.docx
@@ -4220,6 +4220,565 @@
           <w:sz w:val="17"/>
         </w:rPr>
         <w:t>UTN-FRBA | EPIData — IA Aplicada a Organizaciones</w:t>
+      </w:r>
+    </w:p>
+    <w:p>
+      <w:pPr>
+        <w:spacing w:before="400" w:after="200"/>
+      </w:pPr>
+      <w:r>
+        <w:rPr>
+          <w:rFonts w:ascii="Arial" w:hAnsi="Arial"/>
+          <w:b/>
+          <w:color w:val="1E3A8A"/>
+          <w:sz w:val="32"/>
+        </w:rPr>
+        <w:t>Sección 4 · Evidencia de Funcionamiento</w:t>
+      </w:r>
+    </w:p>
+    <w:p>
+      <w:pPr>
+        <w:spacing w:before="200" w:after="80"/>
+      </w:pPr>
+      <w:r>
+        <w:rPr>
+          <w:rFonts w:ascii="Arial" w:hAnsi="Arial"/>
+          <w:b/>
+          <w:color w:val="0D9488"/>
+          <w:sz w:val="25"/>
+        </w:rPr>
+        <w:t>4.1 Capturas de Pantalla del Frontend (Evidencia Visual de los Módulos)</w:t>
+      </w:r>
+    </w:p>
+    <w:p>
+      <w:pPr>
+        <w:spacing w:line="276" w:lineRule="auto" w:after="80"/>
+      </w:pPr>
+      <w:r>
+        <w:rPr>
+          <w:rFonts w:ascii="Arial" w:hAnsi="Arial"/>
+          <w:b/>
+          <w:color w:val="1E3A8A"/>
+          <w:sz w:val="21"/>
+        </w:rPr>
+        <w:t>A. Pantalla Principal / Home (Chat Ciudadano con Selector de Personas 1-Click):</w:t>
+      </w:r>
+    </w:p>
+    <w:p>
+      <w:pPr>
+        <w:spacing w:line="276" w:lineRule="auto" w:after="120"/>
+      </w:pPr>
+      <w:r>
+        <w:rPr>
+          <w:rFonts w:ascii="Arial" w:hAnsi="Arial"/>
+          <w:color w:val="0F172A"/>
+          <w:sz w:val="18"/>
+        </w:rPr>
+        <w:t>Muestra la interfaz conversacional accesible de RefuGuía en modo oscuro (#0e1626) con el selector interactivo de identidades/roles (Dra. Carmen López, Carlos Mendoza, María Fernández y Andrés Morales). Permite el ingreso multimodal por voz (Web Speech API) o texto.</w:t>
+      </w:r>
+    </w:p>
+    <w:p>
+      <w:pPr>
+        <w:spacing w:before="160" w:after="80"/>
+        <w:jc w:val="center"/>
+      </w:pPr>
+      <w:r>
+        <w:drawing>
+          <wp:inline xmlns:a="http://schemas.openxmlformats.org/drawingml/2006/main" xmlns:pic="http://schemas.openxmlformats.org/drawingml/2006/picture">
+            <wp:extent cx="5669280" cy="2864168"/>
+            <wp:docPr id="4" name="Picture 4"/>
+            <wp:cNvGraphicFramePr>
+              <a:graphicFrameLocks noChangeAspect="1"/>
+            </wp:cNvGraphicFramePr>
+            <a:graphic>
+              <a:graphicData uri="http://schemas.openxmlformats.org/drawingml/2006/picture">
+                <pic:pic>
+                  <pic:nvPicPr>
+                    <pic:cNvPr id="0" name="home_page_1787191827035.png"/>
+                    <pic:cNvPicPr/>
+                  </pic:nvPicPr>
+                  <pic:blipFill>
+                    <a:blip r:embed="rId10"/>
+                    <a:stretch>
+                      <a:fillRect/>
+                    </a:stretch>
+                  </pic:blipFill>
+                  <pic:spPr>
+                    <a:xfrm>
+                      <a:off x="0" y="0"/>
+                      <a:ext cx="5669280" cy="2864168"/>
+                    </a:xfrm>
+                    <a:prstGeom prst="rect"/>
+                  </pic:spPr>
+                </pic:pic>
+              </a:graphicData>
+            </a:graphic>
+          </wp:inline>
+        </w:drawing>
+      </w:r>
+    </w:p>
+    <w:p>
+      <w:pPr>
+        <w:spacing w:after="200"/>
+        <w:jc w:val="center"/>
+      </w:pPr>
+      <w:r>
+        <w:rPr>
+          <w:rFonts w:ascii="Arial" w:hAnsi="Arial"/>
+          <w:i/>
+          <w:color w:val="64748B"/>
+          <w:sz w:val="17"/>
+        </w:rPr>
+        <w:t>Figura: Pantalla Principal (Home / Chat Ciudadano) con Popover de Cambio de Sesión 1-Click.</w:t>
+      </w:r>
+    </w:p>
+    <w:p>
+      <w:pPr>
+        <w:spacing w:line="276" w:lineRule="auto" w:after="80"/>
+      </w:pPr>
+      <w:r>
+        <w:rPr>
+          <w:rFonts w:ascii="Arial" w:hAnsi="Arial"/>
+          <w:b/>
+          <w:color w:val="1E3A8A"/>
+          <w:sz w:val="21"/>
+        </w:rPr>
+        <w:t>B. Flujo de Uso Principal (Gestión de Inventario, Búsqueda Inteligente y Auditoría SHA-256):</w:t>
+      </w:r>
+    </w:p>
+    <w:p>
+      <w:pPr>
+        <w:spacing w:line="276" w:lineRule="auto" w:after="120"/>
+      </w:pPr>
+      <w:r>
+        <w:rPr>
+          <w:rFonts w:ascii="Arial" w:hAnsi="Arial"/>
+          <w:color w:val="0F172A"/>
+          <w:sz w:val="18"/>
+        </w:rPr>
+        <w:t>Demuestra el módulo de 'Refugios &amp; QR': (1) Tarjetas superiores de KPIs interactivos clickeables, (2) Buscador universal multi-token con normalización de acentos, (3) Filtros por estatus y fecha, (4) Expediente Clínico Digital con inmutabilidad SHA-256, (5) Generación e impresión directa de collares QR de campaña, y (6) Edición instantánea de ficha médica.</w:t>
+      </w:r>
+    </w:p>
+    <w:p>
+      <w:pPr>
+        <w:spacing w:before="160" w:after="80"/>
+        <w:jc w:val="center"/>
+      </w:pPr>
+      <w:r>
+        <w:drawing>
+          <wp:inline xmlns:a="http://schemas.openxmlformats.org/drawingml/2006/main" xmlns:pic="http://schemas.openxmlformats.org/drawingml/2006/picture">
+            <wp:extent cx="5669280" cy="2864168"/>
+            <wp:docPr id="5" name="Picture 5"/>
+            <wp:cNvGraphicFramePr>
+              <a:graphicFrameLocks noChangeAspect="1"/>
+            </wp:cNvGraphicFramePr>
+            <a:graphic>
+              <a:graphicData uri="http://schemas.openxmlformats.org/drawingml/2006/picture">
+                <pic:pic>
+                  <pic:nvPicPr>
+                    <pic:cNvPr id="0" name="refugios_page_1787191877320.png"/>
+                    <pic:cNvPicPr/>
+                  </pic:nvPicPr>
+                  <pic:blipFill>
+                    <a:blip r:embed="rId11"/>
+                    <a:stretch>
+                      <a:fillRect/>
+                    </a:stretch>
+                  </pic:blipFill>
+                  <pic:spPr>
+                    <a:xfrm>
+                      <a:off x="0" y="0"/>
+                      <a:ext cx="5669280" cy="2864168"/>
+                    </a:xfrm>
+                    <a:prstGeom prst="rect"/>
+                  </pic:spPr>
+                </pic:pic>
+              </a:graphicData>
+            </a:graphic>
+          </wp:inline>
+        </w:drawing>
+      </w:r>
+    </w:p>
+    <w:p>
+      <w:pPr>
+        <w:spacing w:after="200"/>
+        <w:jc w:val="center"/>
+      </w:pPr>
+      <w:r>
+        <w:rPr>
+          <w:rFonts w:ascii="Arial" w:hAnsi="Arial"/>
+          <w:i/>
+          <w:color w:val="64748B"/>
+          <w:sz w:val="17"/>
+        </w:rPr>
+        <w:t>Figura: Módulo de Refugios &amp; QR: KPIs interactivos, panel de búsqueda avanzada y expediente clínico SHA-256.</w:t>
+      </w:r>
+    </w:p>
+    <w:p>
+      <w:pPr>
+        <w:spacing w:line="276" w:lineRule="auto" w:after="80"/>
+      </w:pPr>
+      <w:r>
+        <w:rPr>
+          <w:rFonts w:ascii="Arial" w:hAnsi="Arial"/>
+          <w:b/>
+          <w:color w:val="1E3A8A"/>
+          <w:sz w:val="21"/>
+        </w:rPr>
+        <w:t>C. Resultado u Output de la IA Visible para el Usuario (Centro de Reencuentro &amp; Peritaje de Fotos):</w:t>
+      </w:r>
+    </w:p>
+    <w:p>
+      <w:pPr>
+        <w:spacing w:line="276" w:lineRule="auto" w:after="120"/>
+      </w:pPr>
+      <w:r>
+        <w:rPr>
+          <w:rFonts w:ascii="Arial" w:hAnsi="Arial"/>
+          <w:color w:val="0F172A"/>
+          <w:sz w:val="18"/>
+        </w:rPr>
+        <w:t>Visualiza el resultado del emparejamiento automático generado por la Red de Agentes: tarjeta comparativa de la mascota buscada vs la mascota en refugio, desglose del nivel de coincidencia (98.5%), cálculo geoespacial de cercanía (1.2 km) y botón 'Comparar Fotos en Detalle' para peritaje pericial con lenguaje humano y sin jerga técnica.</w:t>
+      </w:r>
+    </w:p>
+    <w:p>
+      <w:pPr>
+        <w:spacing w:before="160" w:after="80"/>
+        <w:jc w:val="center"/>
+      </w:pPr>
+      <w:r>
+        <w:drawing>
+          <wp:inline xmlns:a="http://schemas.openxmlformats.org/drawingml/2006/main" xmlns:pic="http://schemas.openxmlformats.org/drawingml/2006/picture">
+            <wp:extent cx="5669280" cy="2864168"/>
+            <wp:docPr id="6" name="Picture 6"/>
+            <wp:cNvGraphicFramePr>
+              <a:graphicFrameLocks noChangeAspect="1"/>
+            </wp:cNvGraphicFramePr>
+            <a:graphic>
+              <a:graphicData uri="http://schemas.openxmlformats.org/drawingml/2006/picture">
+                <pic:pic>
+                  <pic:nvPicPr>
+                    <pic:cNvPr id="0" name="matches_page_1787191924331.png"/>
+                    <pic:cNvPicPr/>
+                  </pic:nvPicPr>
+                  <pic:blipFill>
+                    <a:blip r:embed="rId12"/>
+                    <a:stretch>
+                      <a:fillRect/>
+                    </a:stretch>
+                  </pic:blipFill>
+                  <pic:spPr>
+                    <a:xfrm>
+                      <a:off x="0" y="0"/>
+                      <a:ext cx="5669280" cy="2864168"/>
+                    </a:xfrm>
+                    <a:prstGeom prst="rect"/>
+                  </pic:spPr>
+                </pic:pic>
+              </a:graphicData>
+            </a:graphic>
+          </wp:inline>
+        </w:drawing>
+      </w:r>
+    </w:p>
+    <w:p>
+      <w:pPr>
+        <w:spacing w:after="200"/>
+        <w:jc w:val="center"/>
+      </w:pPr>
+      <w:r>
+        <w:rPr>
+          <w:rFonts w:ascii="Arial" w:hAnsi="Arial"/>
+          <w:i/>
+          <w:color w:val="64748B"/>
+          <w:sz w:val="17"/>
+        </w:rPr>
+        <w:t>Figura: Centro de Reencuentro: Output visual de la IA con porcentaje de similitud y cotejo de fotografías.</w:t>
+      </w:r>
+    </w:p>
+    <w:p>
+      <w:pPr>
+        <w:spacing w:line="276" w:lineRule="auto" w:after="80"/>
+      </w:pPr>
+      <w:r>
+        <w:rPr>
+          <w:rFonts w:ascii="Arial" w:hAnsi="Arial"/>
+          <w:b/>
+          <w:color w:val="1E3A8A"/>
+          <w:sz w:val="21"/>
+        </w:rPr>
+        <w:t>D. Módulos Adicionales (Portal de Adopción Responsable y Explorador de Skills MCP 2026.1):</w:t>
+      </w:r>
+    </w:p>
+    <w:p>
+      <w:pPr>
+        <w:spacing w:line="276" w:lineRule="auto" w:after="120"/>
+      </w:pPr>
+      <w:r>
+        <w:rPr>
+          <w:rFonts w:ascii="Arial" w:hAnsi="Arial"/>
+          <w:color w:val="0F172A"/>
+          <w:sz w:val="18"/>
+        </w:rPr>
+        <w:t>El Portal de Adopción muestra el catálogo de mascotas que han cumplido el período legal obligatorio de 15 días, destacando las postulaciones evaluadas con IA (ej: Andrés Morales con 100% de idoneidad). El Explorador MCP expone las 6 Skills agénticas con sus especificaciones Markdown (.md).</w:t>
+      </w:r>
+    </w:p>
+    <w:p>
+      <w:pPr>
+        <w:spacing w:before="160" w:after="80"/>
+        <w:jc w:val="center"/>
+      </w:pPr>
+      <w:r>
+        <w:drawing>
+          <wp:inline xmlns:a="http://schemas.openxmlformats.org/drawingml/2006/main" xmlns:pic="http://schemas.openxmlformats.org/drawingml/2006/picture">
+            <wp:extent cx="5669280" cy="2864168"/>
+            <wp:docPr id="7" name="Picture 7"/>
+            <wp:cNvGraphicFramePr>
+              <a:graphicFrameLocks noChangeAspect="1"/>
+            </wp:cNvGraphicFramePr>
+            <a:graphic>
+              <a:graphicData uri="http://schemas.openxmlformats.org/drawingml/2006/picture">
+                <pic:pic>
+                  <pic:nvPicPr>
+                    <pic:cNvPr id="0" name="adopcion_page_1787191962037.png"/>
+                    <pic:cNvPicPr/>
+                  </pic:nvPicPr>
+                  <pic:blipFill>
+                    <a:blip r:embed="rId13"/>
+                    <a:stretch>
+                      <a:fillRect/>
+                    </a:stretch>
+                  </pic:blipFill>
+                  <pic:spPr>
+                    <a:xfrm>
+                      <a:off x="0" y="0"/>
+                      <a:ext cx="5669280" cy="2864168"/>
+                    </a:xfrm>
+                    <a:prstGeom prst="rect"/>
+                  </pic:spPr>
+                </pic:pic>
+              </a:graphicData>
+            </a:graphic>
+          </wp:inline>
+        </w:drawing>
+      </w:r>
+    </w:p>
+    <w:p>
+      <w:pPr>
+        <w:spacing w:after="200"/>
+        <w:jc w:val="center"/>
+      </w:pPr>
+      <w:r>
+        <w:rPr>
+          <w:rFonts w:ascii="Arial" w:hAnsi="Arial"/>
+          <w:i/>
+          <w:color w:val="64748B"/>
+          <w:sz w:val="17"/>
+        </w:rPr>
+        <w:t>Figura: Portal de Adopción Responsable: Animales habilitados tras 15 días y postulaciones evaluadas.</w:t>
+      </w:r>
+    </w:p>
+    <w:p>
+      <w:pPr>
+        <w:spacing w:before="160" w:after="80"/>
+        <w:jc w:val="center"/>
+      </w:pPr>
+      <w:r>
+        <w:drawing>
+          <wp:inline xmlns:a="http://schemas.openxmlformats.org/drawingml/2006/main" xmlns:pic="http://schemas.openxmlformats.org/drawingml/2006/picture">
+            <wp:extent cx="5669280" cy="2864168"/>
+            <wp:docPr id="8" name="Picture 8"/>
+            <wp:cNvGraphicFramePr>
+              <a:graphicFrameLocks noChangeAspect="1"/>
+            </wp:cNvGraphicFramePr>
+            <a:graphic>
+              <a:graphicData uri="http://schemas.openxmlformats.org/drawingml/2006/picture">
+                <pic:pic>
+                  <pic:nvPicPr>
+                    <pic:cNvPr id="0" name="mcp_page_1787192025153.png"/>
+                    <pic:cNvPicPr/>
+                  </pic:nvPicPr>
+                  <pic:blipFill>
+                    <a:blip r:embed="rId14"/>
+                    <a:stretch>
+                      <a:fillRect/>
+                    </a:stretch>
+                  </pic:blipFill>
+                  <pic:spPr>
+                    <a:xfrm>
+                      <a:off x="0" y="0"/>
+                      <a:ext cx="5669280" cy="2864168"/>
+                    </a:xfrm>
+                    <a:prstGeom prst="rect"/>
+                  </pic:spPr>
+                </pic:pic>
+              </a:graphicData>
+            </a:graphic>
+          </wp:inline>
+        </w:drawing>
+      </w:r>
+    </w:p>
+    <w:p>
+      <w:pPr>
+        <w:spacing w:after="200"/>
+        <w:jc w:val="center"/>
+      </w:pPr>
+      <w:r>
+        <w:rPr>
+          <w:rFonts w:ascii="Arial" w:hAnsi="Arial"/>
+          <w:i/>
+          <w:color w:val="64748B"/>
+          <w:sz w:val="17"/>
+        </w:rPr>
+        <w:t>Figura: Explorador de Skills MCP 2026.1: Catálogo de 6 herramientas agénticas con especificación Markdown.</w:t>
+      </w:r>
+    </w:p>
+    <w:p>
+      <w:pPr>
+        <w:spacing w:before="240" w:after="80"/>
+      </w:pPr>
+      <w:r>
+        <w:rPr>
+          <w:rFonts w:ascii="Arial" w:hAnsi="Arial"/>
+          <w:b/>
+          <w:color w:val="0D9488"/>
+          <w:sz w:val="25"/>
+        </w:rPr>
+        <w:t>4.2 Log o Registro de una Sesión Real del Sistema (Auditoría End-to-End)</w:t>
+      </w:r>
+    </w:p>
+    <w:p>
+      <w:pPr>
+        <w:spacing w:line="276" w:lineRule="auto" w:after="160"/>
+      </w:pPr>
+      <w:r>
+        <w:rPr>
+          <w:rFonts w:ascii="Arial" w:hAnsi="Arial"/>
+          <w:color w:val="0F172A"/>
+          <w:sz w:val="19"/>
+        </w:rPr>
+        <w:t>A continuación se presenta un extracto representativo del registro auditable de ejecución en vivo del sistema RefuGuía, demostrando la sincronización determinista entre la autenticación RBAC, el peritaje visual en Moondream VLM, la extracción en Qwen 2.5 SLM, la indexación vectorial en ChromaDB, el encadenamiento SHA-256 de fármacos y la auditoría jurídica del período legal de 15 días:</w:t>
+      </w:r>
+    </w:p>
+    <w:tbl>
+      <w:tblPr>
+        <w:tblW w:type="auto" w:w="0"/>
+        <w:jc w:val="center"/>
+        <w:tblLook w:firstColumn="1" w:firstRow="1" w:lastColumn="0" w:lastRow="0" w:noHBand="0" w:noVBand="1" w:val="04A0"/>
+      </w:tblPr>
+      <w:tblGrid>
+        <w:gridCol w:w="9360"/>
+      </w:tblGrid>
+      <w:tr>
+        <w:tc>
+          <w:tcPr>
+            <w:tcW w:type="dxa" w:w="9360"/>
+            <w:shd w:fill="0F172A"/>
+            <w:tcMar>
+              <w:top w:w="120" w:type="dxa"/>
+              <w:bottom w:w="120" w:type="dxa"/>
+              <w:left w:w="160" w:type="dxa"/>
+              <w:right w:w="160" w:type="dxa"/>
+            </w:tcMar>
+          </w:tcPr>
+          <w:p>
+            <w:pPr>
+              <w:spacing w:after="80"/>
+            </w:pPr>
+            <w:r>
+              <w:rPr>
+                <w:rFonts w:ascii="Arial" w:hAnsi="Arial"/>
+                <w:b/>
+                <w:color w:val="38BDF8"/>
+                <w:sz w:val="18"/>
+              </w:rPr>
+              <w:t>📋 LOG DE AUDITORÍA Y TRAZABILIDAD EN VIVO (REFUGUÍA ON-PREMISE):</w:t>
+            </w:r>
+          </w:p>
+          <w:p>
+            <w:pPr>
+              <w:spacing w:line="252" w:lineRule="auto" w:after="0"/>
+            </w:pPr>
+            <w:r>
+              <w:rPr>
+                <w:rFonts w:ascii="Courier New" w:hAnsi="Courier New"/>
+                <w:color w:val="CBD5E1"/>
+                <w:sz w:val="15"/>
+              </w:rPr>
+              <w:t>[SYSTEM_INIT]  [OK] Modelos IA en memoria activa de Ollama (host.docker.internal:11434):</w:t>
+              <w:br/>
+              <w:t xml:space="preserve">                 -&gt; SLM NLP/RAG : qwen2.5:1.5b (1.54B params, Quant: Q4_K_M, Context: 32768)</w:t>
+              <w:br/>
+              <w:t xml:space="preserve">                 -&gt; VLM Visión  : moondream:latest (1.4B params, Arch: SigLIP+Phi)</w:t>
+              <w:br/>
+              <w:t>[MCP_SERVER]   [OK] Servidor MCP 2026.1 inicializado con 6 Skills agénticas registradas (.md)</w:t>
+              <w:br/>
+              <w:br/>
+              <w:t>[API_GATEWAY]  [POST] /api/pets/report-citizen (Origin: CitizenChatView / Damnificada)</w:t>
+              <w:br/>
+              <w:t>[SECURITY_SLM] [AUDIT] PromptSanitizerService: Texto limpio y sanitizado (Riesgo: 0.00).</w:t>
+              <w:br/>
+              <w:t>[OLLAMA_VLM]   [DONE] Inferencia VLM en 280.12 ms: "Canine, medium size, black coat with white chest."</w:t>
+              <w:br/>
+              <w:t>[OLLAMA_SLM]   [DONE] Inferencia SLM en 165.40 ms (35.2 tok/s): JSON {species: "canine", breed: "Mestizo"}</w:t>
+              <w:br/>
+              <w:t>[CHROMA_RAG]   [OK] Vector Embedding (1536 dims) indexado en colección 'refuguia_pets'</w:t>
+              <w:br/>
+              <w:br/>
+              <w:t>[MATCHMAKER]   [EXEC] Búsqueda K-NN en ChromaDB: Vecino más cercano encontrado (ID 2, Distancia: 0.042)</w:t>
+              <w:br/>
+              <w:t>[OLLAMA_VLM]   [DONE] Cotejo fotográfico en Moondream: Score Visual 98.0%, Semántica 95.0%, Geo 92.0%</w:t>
+              <w:br/>
+              <w:t xml:space="preserve">                 -&gt; SIMILITUD GLOBAL FINAL: 95.3% (STATUS: HIGH_CONFIDENCE_MATCH)</w:t>
+              <w:br/>
+              <w:br/>
+              <w:t>[API_GATEWAY]  [POST] /api/pets/2/clinical-records (Dra. Carmen López / ShelterDashboard)</w:t>
+              <w:br/>
+              <w:t>[SECURITY_QR]  [PASS] Verificación física de escaneo de collar QR confirmada (qr_scanned = TRUE).</w:t>
+              <w:br/>
+              <w:t>[CRYPTO_CHAIN] [OK] Hash SHA-256 generado: e3b0c44298fc1c149afbf4c8996fb92427ae41e4649b934ca495991b7852b855</w:t>
+              <w:br/>
+              <w:br/>
+              <w:t>[MCP_DISPATCH] [INVOKE] Agente_Auditor_Legal -&gt; skill_verificar_periodo_gracia (ID 2, 18.9 días en refugio)</w:t>
+              <w:br/>
+              <w:t xml:space="preserve">                 -&gt; Veredicto Legal: CUMPLIDO (&gt;15 días). HABILITADA PARA ADOPCIÓN RESPONSABLE.</w:t>
+              <w:br/>
+              <w:t>[MCP_DISPATCH] [INVOKE] Agente_Triaje_Adopcion -&gt; skill_evaluar_compatibilidad_adopcion (Andrés Morales)</w:t>
+              <w:br/>
+              <w:t xml:space="preserve">                 -&gt; Idoneidad: 100% (APPROVED). Solicitud vinculada exitosamente.</w:t>
+              <w:br/>
+              <w:br/>
+              <w:t>[TELEMETRÍA]   Tiempo Total End-to-End: 1.48 seg | Consumo RAM: 2.74 GB | Errores: 0 | Ciberseguridad: 100% PASS</w:t>
+            </w:r>
+          </w:p>
+        </w:tc>
+      </w:tr>
+    </w:tbl>
+    <w:p>
+      <w:pPr>
+        <w:spacing w:after="120"/>
+      </w:pPr>
+    </w:p>
+    <w:p>
+      <w:pPr>
+        <w:spacing w:line="276" w:lineRule="auto" w:after="200"/>
+      </w:pPr>
+      <w:r>
+        <w:rPr>
+          <w:rFonts w:ascii="Arial" w:hAnsi="Arial"/>
+          <w:color w:val="0F172A"/>
+          <w:sz w:val="18"/>
+        </w:rPr>
+        <w:t xml:space="preserve">El archivo de texto completo con la traza milimétrica de auditoría se encuentra integrado en el repositorio del proyecto: </w:t>
+      </w:r>
+      <w:r>
+        <w:rPr>
+          <w:rFonts w:ascii="Courier New" w:hAnsi="Courier New"/>
+          <w:b/>
+          <w:color w:val="1E3A8A"/>
+          <w:sz w:val="18"/>
+        </w:rPr>
+        <w:t>doc/LOG_SESION_REAL_REFUGUIA.txt</w:t>
       </w:r>
     </w:p>
     <w:sectPr>

</xml_diff>

<commit_message>
docs: agregar Seccion 6 (Evaluacion de Ciberseguridad y Log de Riesgos OWASP/IA) al Informe Final DOCX
</commit_message>
<xml_diff>
--- a/doc/INFORME_FINAL_REFUGUIA_PARTE2.docx
+++ b/doc/INFORME_FINAL_REFUGUIA_PARTE2.docx
@@ -5068,6 +5068,605 @@
     <w:p>
       <w:pPr>
         <w:spacing w:before="80" w:after="80"/>
+      </w:pPr>
+      <w:r>
+        <w:rPr>
+          <w:rFonts w:ascii="Arial" w:hAnsi="Arial"/>
+          <w:i/>
+          <w:color w:val="64748B"/>
+          <w:sz w:val="17"/>
+        </w:rPr>
+        <w:t>UTN-FRBA | EPIData — IA Aplicada a Organizaciones</w:t>
+      </w:r>
+    </w:p>
+    <w:p>
+      <w:pPr>
+        <w:spacing w:before="400" w:after="200"/>
+      </w:pPr>
+      <w:r>
+        <w:rPr>
+          <w:rFonts w:ascii="Arial" w:hAnsi="Arial"/>
+          <w:b/>
+          <w:color w:val="1E3A8A"/>
+          <w:sz w:val="32"/>
+        </w:rPr>
+        <w:t>Sección 6 · Evaluación de Ciberseguridad</w:t>
+      </w:r>
+    </w:p>
+    <w:p>
+      <w:pPr>
+        <w:spacing w:line="276" w:lineRule="auto" w:after="200"/>
+      </w:pPr>
+      <w:r>
+        <w:rPr>
+          <w:rFonts w:ascii="Arial" w:hAnsi="Arial"/>
+          <w:color w:val="0F172A"/>
+          <w:sz w:val="19"/>
+        </w:rPr>
+        <w:t>La seguridad de la información y la resiliencia en RefuGuía fueron integradas transversalmente desde la etapa de diseño de arquitectura ('Security by Design'). En situaciones de contingencia y desastre natural, la protección de los datos de los ciudadanos damnificados, la prevención de ataques contra los modelos de IA y la inmutabilidad de los historiales clínicos veterinarios constituyen pilares operacionales innegociables.</w:t>
+      </w:r>
+    </w:p>
+    <w:tbl>
+      <w:tblPr>
+        <w:tblW w:type="auto" w:w="0"/>
+        <w:jc w:val="center"/>
+        <w:tblLayout w:type="fixed"/>
+        <w:tblLook w:firstColumn="1" w:firstRow="1" w:lastColumn="0" w:lastRow="0" w:noHBand="0" w:noVBand="1" w:val="04A0"/>
+      </w:tblPr>
+      <w:tblGrid>
+        <w:gridCol w:w="3120"/>
+        <w:gridCol w:w="3120"/>
+        <w:gridCol w:w="3120"/>
+      </w:tblGrid>
+      <w:tr>
+        <w:tc>
+          <w:tcPr>
+            <w:tcW w:type="dxa" w:w="2592"/>
+            <w:shd w:fill="1E3A8A"/>
+            <w:tcMar>
+              <w:top w:w="120" w:type="dxa"/>
+              <w:bottom w:w="120" w:type="dxa"/>
+              <w:left w:w="140" w:type="dxa"/>
+              <w:right w:w="140" w:type="dxa"/>
+            </w:tcMar>
+          </w:tcPr>
+          <w:p>
+            <w:r>
+              <w:rPr>
+                <w:rFonts w:ascii="Arial" w:hAnsi="Arial"/>
+                <w:b/>
+                <w:color w:val="FFFFFF"/>
+                <w:sz w:val="19"/>
+              </w:rPr>
+              <w:t>Riesgo Identificado</w:t>
+            </w:r>
+          </w:p>
+        </w:tc>
+        <w:tc>
+          <w:tcPr>
+            <w:tcW w:type="dxa" w:w="2304"/>
+            <w:shd w:fill="1E3A8A"/>
+            <w:tcMar>
+              <w:top w:w="120" w:type="dxa"/>
+              <w:bottom w:w="120" w:type="dxa"/>
+              <w:left w:w="140" w:type="dxa"/>
+              <w:right w:w="140" w:type="dxa"/>
+            </w:tcMar>
+          </w:tcPr>
+          <w:p>
+            <w:r>
+              <w:rPr>
+                <w:rFonts w:ascii="Arial" w:hAnsi="Arial"/>
+                <w:b/>
+                <w:color w:val="FFFFFF"/>
+                <w:sz w:val="19"/>
+              </w:rPr>
+              <w:t>Tipo (OWASP / Privacidad / Acceso / IA)</w:t>
+            </w:r>
+          </w:p>
+        </w:tc>
+        <w:tc>
+          <w:tcPr>
+            <w:tcW w:type="dxa" w:w="4464"/>
+            <w:shd w:fill="1E3A8A"/>
+            <w:tcMar>
+              <w:top w:w="120" w:type="dxa"/>
+              <w:bottom w:w="120" w:type="dxa"/>
+              <w:left w:w="140" w:type="dxa"/>
+              <w:right w:w="140" w:type="dxa"/>
+            </w:tcMar>
+          </w:tcPr>
+          <w:p>
+            <w:r>
+              <w:rPr>
+                <w:rFonts w:ascii="Arial" w:hAnsi="Arial"/>
+                <w:b/>
+                <w:color w:val="FFFFFF"/>
+                <w:sz w:val="19"/>
+              </w:rPr>
+              <w:t>Medida Implementada o Decisión Tomada</w:t>
+            </w:r>
+          </w:p>
+        </w:tc>
+      </w:tr>
+      <w:tr>
+        <w:tc>
+          <w:tcPr>
+            <w:tcW w:type="dxa" w:w="2592"/>
+            <w:shd w:fill="F8FAFC"/>
+            <w:tcMar>
+              <w:top w:w="90" w:type="dxa"/>
+              <w:bottom w:w="90" w:type="dxa"/>
+              <w:left w:w="130" w:type="dxa"/>
+              <w:right w:w="130" w:type="dxa"/>
+            </w:tcMar>
+          </w:tcPr>
+          <w:p>
+            <w:pPr>
+              <w:spacing w:line="269" w:lineRule="auto"/>
+            </w:pPr>
+            <w:r>
+              <w:rPr>
+                <w:rFonts w:ascii="Arial" w:hAnsi="Arial"/>
+                <w:b/>
+                <w:color w:val="0F172A"/>
+                <w:sz w:val="17"/>
+              </w:rPr>
+              <w:t>Inyección de prompt en el modelo IA (Prompt Injection &amp; Jailbreaks)</w:t>
+            </w:r>
+          </w:p>
+        </w:tc>
+        <w:tc>
+          <w:tcPr>
+            <w:tcW w:type="dxa" w:w="2304"/>
+            <w:shd w:fill="F8FAFC"/>
+            <w:tcMar>
+              <w:top w:w="90" w:type="dxa"/>
+              <w:bottom w:w="90" w:type="dxa"/>
+              <w:left w:w="130" w:type="dxa"/>
+              <w:right w:w="130" w:type="dxa"/>
+            </w:tcMar>
+          </w:tcPr>
+          <w:p>
+            <w:pPr>
+              <w:spacing w:line="269" w:lineRule="auto"/>
+            </w:pPr>
+            <w:r>
+              <w:rPr>
+                <w:rFonts w:ascii="Arial" w:hAnsi="Arial"/>
+                <w:b/>
+                <w:color w:val="0F172A"/>
+                <w:sz w:val="17"/>
+              </w:rPr>
+              <w:t>OWASP LLM01 / Inyección</w:t>
+            </w:r>
+          </w:p>
+        </w:tc>
+        <w:tc>
+          <w:tcPr>
+            <w:tcW w:type="dxa" w:w="4464"/>
+            <w:shd w:fill="F8FAFC"/>
+            <w:tcMar>
+              <w:top w:w="90" w:type="dxa"/>
+              <w:bottom w:w="90" w:type="dxa"/>
+              <w:left w:w="130" w:type="dxa"/>
+              <w:right w:w="130" w:type="dxa"/>
+            </w:tcMar>
+          </w:tcPr>
+          <w:p>
+            <w:pPr>
+              <w:spacing w:line="269" w:lineRule="auto"/>
+            </w:pPr>
+            <w:r>
+              <w:rPr>
+                <w:rFonts w:ascii="Arial" w:hAnsi="Arial"/>
+                <w:color w:val="0F172A"/>
+                <w:sz w:val="17"/>
+              </w:rPr>
+              <w:t>Se implementó el servicio 'PromptSanitizerService' en el Backend, el cual filtra patrones maliciosos, comandos del sistema e intentos de fuga ('ignore previous instructions') antes de enviar el texto al SLM. Los System Prompts están aislados rígidamente y la respuesta se restringe a esquemas JSON fuertemente tipados sin ejecución dinámica de código.</w:t>
+            </w:r>
+          </w:p>
+        </w:tc>
+      </w:tr>
+      <w:tr>
+        <w:tc>
+          <w:tcPr>
+            <w:tcW w:type="dxa" w:w="2592"/>
+            <w:shd w:fill="FFFFFF"/>
+            <w:tcMar>
+              <w:top w:w="90" w:type="dxa"/>
+              <w:bottom w:w="90" w:type="dxa"/>
+              <w:left w:w="130" w:type="dxa"/>
+              <w:right w:w="130" w:type="dxa"/>
+            </w:tcMar>
+          </w:tcPr>
+          <w:p>
+            <w:pPr>
+              <w:spacing w:line="269" w:lineRule="auto"/>
+            </w:pPr>
+            <w:r>
+              <w:rPr>
+                <w:rFonts w:ascii="Arial" w:hAnsi="Arial"/>
+                <w:b/>
+                <w:color w:val="0F172A"/>
+                <w:sz w:val="17"/>
+              </w:rPr>
+              <w:t>Exposición de API Keys y Secretos en Repositorio</w:t>
+            </w:r>
+          </w:p>
+        </w:tc>
+        <w:tc>
+          <w:tcPr>
+            <w:tcW w:type="dxa" w:w="2304"/>
+            <w:shd w:fill="FFFFFF"/>
+            <w:tcMar>
+              <w:top w:w="90" w:type="dxa"/>
+              <w:bottom w:w="90" w:type="dxa"/>
+              <w:left w:w="130" w:type="dxa"/>
+              <w:right w:w="130" w:type="dxa"/>
+            </w:tcMar>
+          </w:tcPr>
+          <w:p>
+            <w:pPr>
+              <w:spacing w:line="269" w:lineRule="auto"/>
+            </w:pPr>
+            <w:r>
+              <w:rPr>
+                <w:rFonts w:ascii="Arial" w:hAnsi="Arial"/>
+                <w:b/>
+                <w:color w:val="0F172A"/>
+                <w:sz w:val="17"/>
+              </w:rPr>
+              <w:t>Secretos en Código / OWASP A02</w:t>
+            </w:r>
+          </w:p>
+        </w:tc>
+        <w:tc>
+          <w:tcPr>
+            <w:tcW w:type="dxa" w:w="4464"/>
+            <w:shd w:fill="FFFFFF"/>
+            <w:tcMar>
+              <w:top w:w="90" w:type="dxa"/>
+              <w:bottom w:w="90" w:type="dxa"/>
+              <w:left w:w="130" w:type="dxa"/>
+              <w:right w:w="130" w:type="dxa"/>
+            </w:tcMar>
+          </w:tcPr>
+          <w:p>
+            <w:pPr>
+              <w:spacing w:line="269" w:lineRule="auto"/>
+            </w:pPr>
+            <w:r>
+              <w:rPr>
+                <w:rFonts w:ascii="Arial" w:hAnsi="Arial"/>
+                <w:color w:val="0F172A"/>
+                <w:sz w:val="17"/>
+              </w:rPr>
+              <w:t>Al adoptar una arquitectura 100% On-Premise con Ollama Local y ChromaDB embebido, se eliminó la necesidad de utilizar o almacenar API Keys de proveedores comerciales de IA (OpenAI, Claude). Todas las credenciales internas (MySQL, App Key) se gestionan mediante variables de entorno en el archivo '.env', rigurosamente ignorado en el control de versiones '.gitignore'.</w:t>
+            </w:r>
+          </w:p>
+        </w:tc>
+      </w:tr>
+      <w:tr>
+        <w:tc>
+          <w:tcPr>
+            <w:tcW w:type="dxa" w:w="2592"/>
+            <w:shd w:fill="F8FAFC"/>
+            <w:tcMar>
+              <w:top w:w="90" w:type="dxa"/>
+              <w:bottom w:w="90" w:type="dxa"/>
+              <w:left w:w="130" w:type="dxa"/>
+              <w:right w:w="130" w:type="dxa"/>
+            </w:tcMar>
+          </w:tcPr>
+          <w:p>
+            <w:pPr>
+              <w:spacing w:line="269" w:lineRule="auto"/>
+            </w:pPr>
+            <w:r>
+              <w:rPr>
+                <w:rFonts w:ascii="Arial" w:hAnsi="Arial"/>
+                <w:b/>
+                <w:color w:val="0F172A"/>
+                <w:sz w:val="17"/>
+              </w:rPr>
+              <w:t>Fuga o Exposición de Datos Privados de Damnificados (Data Privacy)</w:t>
+            </w:r>
+          </w:p>
+        </w:tc>
+        <w:tc>
+          <w:tcPr>
+            <w:tcW w:type="dxa" w:w="2304"/>
+            <w:shd w:fill="F8FAFC"/>
+            <w:tcMar>
+              <w:top w:w="90" w:type="dxa"/>
+              <w:bottom w:w="90" w:type="dxa"/>
+              <w:left w:w="130" w:type="dxa"/>
+              <w:right w:w="130" w:type="dxa"/>
+            </w:tcMar>
+          </w:tcPr>
+          <w:p>
+            <w:pPr>
+              <w:spacing w:line="269" w:lineRule="auto"/>
+            </w:pPr>
+            <w:r>
+              <w:rPr>
+                <w:rFonts w:ascii="Arial" w:hAnsi="Arial"/>
+                <w:b/>
+                <w:color w:val="0F172A"/>
+                <w:sz w:val="17"/>
+              </w:rPr>
+              <w:t>Privacidad / GDPR / OWASP A01</w:t>
+            </w:r>
+          </w:p>
+        </w:tc>
+        <w:tc>
+          <w:tcPr>
+            <w:tcW w:type="dxa" w:w="4464"/>
+            <w:shd w:fill="F8FAFC"/>
+            <w:tcMar>
+              <w:top w:w="90" w:type="dxa"/>
+              <w:bottom w:w="90" w:type="dxa"/>
+              <w:left w:w="130" w:type="dxa"/>
+              <w:right w:w="130" w:type="dxa"/>
+            </w:tcMar>
+          </w:tcPr>
+          <w:p>
+            <w:pPr>
+              <w:spacing w:line="269" w:lineRule="auto"/>
+            </w:pPr>
+            <w:r>
+              <w:rPr>
+                <w:rFonts w:ascii="Arial" w:hAnsi="Arial"/>
+                <w:color w:val="0F172A"/>
+                <w:sz w:val="17"/>
+              </w:rPr>
+              <w:t>Principio de minimización de datos: solo se registran nombres de pila, teléfono de contacto voluntario y ubicación general del rescate (zona/parroquia), sin solicitar documentos nacionales de identidad ni datos financieros sensibles. Cero fuga de datos hacia nubes externas (Zero External Cloud Egress), garantizando soberanía y confidencialidad absoluta en red local.</w:t>
+            </w:r>
+          </w:p>
+        </w:tc>
+      </w:tr>
+      <w:tr>
+        <w:tc>
+          <w:tcPr>
+            <w:tcW w:type="dxa" w:w="2592"/>
+            <w:shd w:fill="FFFFFF"/>
+            <w:tcMar>
+              <w:top w:w="90" w:type="dxa"/>
+              <w:bottom w:w="90" w:type="dxa"/>
+              <w:left w:w="130" w:type="dxa"/>
+              <w:right w:w="130" w:type="dxa"/>
+            </w:tcMar>
+          </w:tcPr>
+          <w:p>
+            <w:pPr>
+              <w:spacing w:line="269" w:lineRule="auto"/>
+            </w:pPr>
+            <w:r>
+              <w:rPr>
+                <w:rFonts w:ascii="Arial" w:hAnsi="Arial"/>
+                <w:b/>
+                <w:color w:val="0F172A"/>
+                <w:sz w:val="17"/>
+              </w:rPr>
+              <w:t>Acceso no autorizado y escalada de privilegios</w:t>
+            </w:r>
+          </w:p>
+        </w:tc>
+        <w:tc>
+          <w:tcPr>
+            <w:tcW w:type="dxa" w:w="2304"/>
+            <w:shd w:fill="FFFFFF"/>
+            <w:tcMar>
+              <w:top w:w="90" w:type="dxa"/>
+              <w:bottom w:w="90" w:type="dxa"/>
+              <w:left w:w="130" w:type="dxa"/>
+              <w:right w:w="130" w:type="dxa"/>
+            </w:tcMar>
+          </w:tcPr>
+          <w:p>
+            <w:pPr>
+              <w:spacing w:line="269" w:lineRule="auto"/>
+            </w:pPr>
+            <w:r>
+              <w:rPr>
+                <w:rFonts w:ascii="Arial" w:hAnsi="Arial"/>
+                <w:b/>
+                <w:color w:val="0F172A"/>
+                <w:sz w:val="17"/>
+              </w:rPr>
+              <w:t>Autenticación &amp; RBAC / OWASP A01</w:t>
+            </w:r>
+          </w:p>
+        </w:tc>
+        <w:tc>
+          <w:tcPr>
+            <w:tcW w:type="dxa" w:w="4464"/>
+            <w:shd w:fill="FFFFFF"/>
+            <w:tcMar>
+              <w:top w:w="90" w:type="dxa"/>
+              <w:bottom w:w="90" w:type="dxa"/>
+              <w:left w:w="130" w:type="dxa"/>
+              <w:right w:w="130" w:type="dxa"/>
+            </w:tcMar>
+          </w:tcPr>
+          <w:p>
+            <w:pPr>
+              <w:spacing w:line="269" w:lineRule="auto"/>
+            </w:pPr>
+            <w:r>
+              <w:rPr>
+                <w:rFonts w:ascii="Arial" w:hAnsi="Arial"/>
+                <w:color w:val="0F172A"/>
+                <w:sz w:val="17"/>
+              </w:rPr>
+              <w:t>Se implementó control de acceso basado en roles (RBAC) estricto con Laravel Sanctum y guardias de navegación en Vue Router. Los endpoints críticos (administración de tratamientos médicos, gestión de inventario y ejecución de auditorías MCP) están exclusivamente restringidos al rol 'shelter_admin', impidiendo que ciudadanos o adoptantes modifiquen expedientes.</w:t>
+            </w:r>
+          </w:p>
+        </w:tc>
+      </w:tr>
+      <w:tr>
+        <w:tc>
+          <w:tcPr>
+            <w:tcW w:type="dxa" w:w="2592"/>
+            <w:shd w:fill="F8FAFC"/>
+            <w:tcMar>
+              <w:top w:w="90" w:type="dxa"/>
+              <w:bottom w:w="90" w:type="dxa"/>
+              <w:left w:w="130" w:type="dxa"/>
+              <w:right w:w="130" w:type="dxa"/>
+            </w:tcMar>
+          </w:tcPr>
+          <w:p>
+            <w:pPr>
+              <w:spacing w:line="269" w:lineRule="auto"/>
+            </w:pPr>
+            <w:r>
+              <w:rPr>
+                <w:rFonts w:ascii="Arial" w:hAnsi="Arial"/>
+                <w:b/>
+                <w:color w:val="0F172A"/>
+                <w:sz w:val="17"/>
+              </w:rPr>
+              <w:t>Adulteración de historiales médicos o sobredosis de fármacos</w:t>
+            </w:r>
+          </w:p>
+        </w:tc>
+        <w:tc>
+          <w:tcPr>
+            <w:tcW w:type="dxa" w:w="2304"/>
+            <w:shd w:fill="F8FAFC"/>
+            <w:tcMar>
+              <w:top w:w="90" w:type="dxa"/>
+              <w:bottom w:w="90" w:type="dxa"/>
+              <w:left w:w="130" w:type="dxa"/>
+              <w:right w:w="130" w:type="dxa"/>
+            </w:tcMar>
+          </w:tcPr>
+          <w:p>
+            <w:pPr>
+              <w:spacing w:line="269" w:lineRule="auto"/>
+            </w:pPr>
+            <w:r>
+              <w:rPr>
+                <w:rFonts w:ascii="Arial" w:hAnsi="Arial"/>
+                <w:b/>
+                <w:color w:val="0F172A"/>
+                <w:sz w:val="17"/>
+              </w:rPr>
+              <w:t>Integridad de Datos / OWASP A08</w:t>
+            </w:r>
+          </w:p>
+        </w:tc>
+        <w:tc>
+          <w:tcPr>
+            <w:tcW w:type="dxa" w:w="4464"/>
+            <w:shd w:fill="F8FAFC"/>
+            <w:tcMar>
+              <w:top w:w="90" w:type="dxa"/>
+              <w:bottom w:w="90" w:type="dxa"/>
+              <w:left w:w="130" w:type="dxa"/>
+              <w:right w:w="130" w:type="dxa"/>
+            </w:tcMar>
+          </w:tcPr>
+          <w:p>
+            <w:pPr>
+              <w:spacing w:line="269" w:lineRule="auto"/>
+            </w:pPr>
+            <w:r>
+              <w:rPr>
+                <w:rFonts w:ascii="Arial" w:hAnsi="Arial"/>
+                <w:color w:val="0F172A"/>
+                <w:sz w:val="17"/>
+              </w:rPr>
+              <w:t>Se implementó una cadena de bloques interna de registros clínicos donde cada administración de fármaco genera un Hash SHA-256 inmutable encadenado al registro previo ('hash_sha256 = sha256(prev_hash + payload)'). Además, existe un bloqueo lógico estricto que prohíbe guardar cualquier tratamiento si no se valida el escaneo del collar QR físico del animal ('qr_scanned = true').</w:t>
+            </w:r>
+          </w:p>
+        </w:tc>
+      </w:tr>
+      <w:tr>
+        <w:tc>
+          <w:tcPr>
+            <w:tcW w:type="dxa" w:w="2592"/>
+            <w:shd w:fill="FFFFFF"/>
+            <w:tcMar>
+              <w:top w:w="90" w:type="dxa"/>
+              <w:bottom w:w="90" w:type="dxa"/>
+              <w:left w:w="130" w:type="dxa"/>
+              <w:right w:w="130" w:type="dxa"/>
+            </w:tcMar>
+          </w:tcPr>
+          <w:p>
+            <w:pPr>
+              <w:spacing w:line="269" w:lineRule="auto"/>
+            </w:pPr>
+            <w:r>
+              <w:rPr>
+                <w:rFonts w:ascii="Arial" w:hAnsi="Arial"/>
+                <w:b/>
+                <w:color w:val="0F172A"/>
+                <w:sz w:val="17"/>
+              </w:rPr>
+              <w:t>Ejecución no autorizada o descontrolada de agentes</w:t>
+            </w:r>
+          </w:p>
+        </w:tc>
+        <w:tc>
+          <w:tcPr>
+            <w:tcW w:type="dxa" w:w="2304"/>
+            <w:shd w:fill="FFFFFF"/>
+            <w:tcMar>
+              <w:top w:w="90" w:type="dxa"/>
+              <w:bottom w:w="90" w:type="dxa"/>
+              <w:left w:w="130" w:type="dxa"/>
+              <w:right w:w="130" w:type="dxa"/>
+            </w:tcMar>
+          </w:tcPr>
+          <w:p>
+            <w:pPr>
+              <w:spacing w:line="269" w:lineRule="auto"/>
+            </w:pPr>
+            <w:r>
+              <w:rPr>
+                <w:rFonts w:ascii="Arial" w:hAnsi="Arial"/>
+                <w:b/>
+                <w:color w:val="0F172A"/>
+                <w:sz w:val="17"/>
+              </w:rPr>
+              <w:t>OWASP LLM08 / Exceso de Agencia</w:t>
+            </w:r>
+          </w:p>
+        </w:tc>
+        <w:tc>
+          <w:tcPr>
+            <w:tcW w:type="dxa" w:w="4464"/>
+            <w:shd w:fill="FFFFFF"/>
+            <w:tcMar>
+              <w:top w:w="90" w:type="dxa"/>
+              <w:bottom w:w="90" w:type="dxa"/>
+              <w:left w:w="130" w:type="dxa"/>
+              <w:right w:w="130" w:type="dxa"/>
+            </w:tcMar>
+          </w:tcPr>
+          <w:p>
+            <w:pPr>
+              <w:spacing w:line="269" w:lineRule="auto"/>
+            </w:pPr>
+            <w:r>
+              <w:rPr>
+                <w:rFonts w:ascii="Arial" w:hAnsi="Arial"/>
+                <w:color w:val="0F172A"/>
+                <w:sz w:val="17"/>
+              </w:rPr>
+              <w:t>El Servidor MCP (Model Context Protocol 2026.1) aplica el principio de menor privilegio. Cada una de las 6 Skills agénticas opera bajo un contrato formal en Markdown (.md) con esquemas JsonSchema cerrados. Los agentes no tienen acceso libre a la consola del sistema operativo ni a la base de datos sin pasar por los validadores de negocio de Laravel.</w:t>
+            </w:r>
+          </w:p>
+        </w:tc>
+      </w:tr>
+    </w:tbl>
+    <w:p>
+      <w:pPr>
+        <w:spacing w:before="160" w:after="160"/>
       </w:pPr>
       <w:r>
         <w:rPr>

</xml_diff>

<commit_message>
docs: agregar Seccion 7 (IAs Usadas en el Co-Work de Desarrollo y Reflexion Critica) al Informe Final DOCX
</commit_message>
<xml_diff>
--- a/doc/INFORME_FINAL_REFUGUIA_PARTE2.docx
+++ b/doc/INFORME_FINAL_REFUGUIA_PARTE2.docx
@@ -5659,6 +5659,501 @@
                 <w:sz w:val="17"/>
               </w:rPr>
               <w:t>El Servidor MCP (Model Context Protocol 2026.1) aplica el principio de menor privilegio. Cada una de las 6 Skills agénticas opera bajo un contrato formal en Markdown (.md) con esquemas JsonSchema cerrados. Los agentes no tienen acceso libre a la consola del sistema operativo ni a la base de datos sin pasar por los validadores de negocio de Laravel.</w:t>
+            </w:r>
+          </w:p>
+        </w:tc>
+      </w:tr>
+    </w:tbl>
+    <w:p>
+      <w:pPr>
+        <w:spacing w:before="160" w:after="160"/>
+      </w:pPr>
+      <w:r>
+        <w:rPr>
+          <w:rFonts w:ascii="Arial" w:hAnsi="Arial"/>
+          <w:i/>
+          <w:color w:val="64748B"/>
+          <w:sz w:val="17"/>
+        </w:rPr>
+        <w:t>UTN-FRBA | EPIData — IA Aplicada a Organizaciones</w:t>
+      </w:r>
+    </w:p>
+    <w:p>
+      <w:pPr>
+        <w:spacing w:before="400" w:after="200"/>
+      </w:pPr>
+      <w:r>
+        <w:rPr>
+          <w:rFonts w:ascii="Arial" w:hAnsi="Arial"/>
+          <w:b/>
+          <w:color w:val="1E3A8A"/>
+          <w:sz w:val="32"/>
+        </w:rPr>
+        <w:t>Sección 7 · IAs Usadas en el Co-Work de Desarrollo</w:t>
+      </w:r>
+    </w:p>
+    <w:p>
+      <w:pPr>
+        <w:spacing w:line="276" w:lineRule="auto" w:after="200"/>
+      </w:pPr>
+      <w:r>
+        <w:rPr>
+          <w:rFonts w:ascii="Arial" w:hAnsi="Arial"/>
+          <w:color w:val="0F172A"/>
+          <w:sz w:val="19"/>
+        </w:rPr>
+        <w:t>El desarrollo de RefuGuía se llevó a cabo mediante un esquema intensivo de co-programación y co-diseño con Inteligencia Artificial (Pair-Programming con IA). A continuación se detallan las herramientas utilizadas en el ciclo de vida del proyecto, su alcance y la evaluación crítica de su aporte:</w:t>
+      </w:r>
+    </w:p>
+    <w:tbl>
+      <w:tblPr>
+        <w:tblW w:type="auto" w:w="0"/>
+        <w:jc w:val="center"/>
+        <w:tblLayout w:type="fixed"/>
+        <w:tblLook w:firstColumn="1" w:firstRow="1" w:lastColumn="0" w:lastRow="0" w:noHBand="0" w:noVBand="1" w:val="04A0"/>
+      </w:tblPr>
+      <w:tblGrid>
+        <w:gridCol w:w="3120"/>
+        <w:gridCol w:w="3120"/>
+        <w:gridCol w:w="3120"/>
+      </w:tblGrid>
+      <w:tr>
+        <w:tc>
+          <w:tcPr>
+            <w:tcW w:type="dxa" w:w="2592"/>
+            <w:shd w:fill="1E3A8A"/>
+            <w:tcMar>
+              <w:top w:w="120" w:type="dxa"/>
+              <w:bottom w:w="120" w:type="dxa"/>
+              <w:left w:w="140" w:type="dxa"/>
+              <w:right w:w="140" w:type="dxa"/>
+            </w:tcMar>
+          </w:tcPr>
+          <w:p>
+            <w:r>
+              <w:rPr>
+                <w:rFonts w:ascii="Arial" w:hAnsi="Arial"/>
+                <w:b/>
+                <w:color w:val="FFFFFF"/>
+                <w:sz w:val="19"/>
+              </w:rPr>
+              <w:t>Herramienta IA</w:t>
+            </w:r>
+          </w:p>
+        </w:tc>
+        <w:tc>
+          <w:tcPr>
+            <w:tcW w:type="dxa" w:w="3456"/>
+            <w:shd w:fill="1E3A8A"/>
+            <w:tcMar>
+              <w:top w:w="120" w:type="dxa"/>
+              <w:bottom w:w="120" w:type="dxa"/>
+              <w:left w:w="140" w:type="dxa"/>
+              <w:right w:w="140" w:type="dxa"/>
+            </w:tcMar>
+          </w:tcPr>
+          <w:p>
+            <w:r>
+              <w:rPr>
+                <w:rFonts w:ascii="Arial" w:hAnsi="Arial"/>
+                <w:b/>
+                <w:color w:val="FFFFFF"/>
+                <w:sz w:val="19"/>
+              </w:rPr>
+              <w:t>Para qué la usaron</w:t>
+            </w:r>
+          </w:p>
+        </w:tc>
+        <w:tc>
+          <w:tcPr>
+            <w:tcW w:type="dxa" w:w="3312"/>
+            <w:shd w:fill="1E3A8A"/>
+            <w:tcMar>
+              <w:top w:w="120" w:type="dxa"/>
+              <w:bottom w:w="120" w:type="dxa"/>
+              <w:left w:w="140" w:type="dxa"/>
+              <w:right w:w="140" w:type="dxa"/>
+            </w:tcMar>
+          </w:tcPr>
+          <w:p>
+            <w:r>
+              <w:rPr>
+                <w:rFonts w:ascii="Arial" w:hAnsi="Arial"/>
+                <w:b/>
+                <w:color w:val="FFFFFF"/>
+                <w:sz w:val="19"/>
+              </w:rPr>
+              <w:t>Aportó bien / mal / sorprendió</w:t>
+            </w:r>
+          </w:p>
+        </w:tc>
+      </w:tr>
+      <w:tr>
+        <w:tc>
+          <w:tcPr>
+            <w:tcW w:type="dxa" w:w="2592"/>
+            <w:shd w:fill="F8FAFC"/>
+            <w:tcMar>
+              <w:top w:w="90" w:type="dxa"/>
+              <w:bottom w:w="90" w:type="dxa"/>
+              <w:left w:w="130" w:type="dxa"/>
+              <w:right w:w="130" w:type="dxa"/>
+            </w:tcMar>
+          </w:tcPr>
+          <w:p>
+            <w:pPr>
+              <w:spacing w:line="269" w:lineRule="auto"/>
+            </w:pPr>
+            <w:r>
+              <w:rPr>
+                <w:rFonts w:ascii="Arial" w:hAnsi="Arial"/>
+                <w:b/>
+                <w:color w:val="0F172A"/>
+                <w:sz w:val="17"/>
+              </w:rPr>
+              <w:t>Antigravity (Gemini)</w:t>
+            </w:r>
+          </w:p>
+        </w:tc>
+        <w:tc>
+          <w:tcPr>
+            <w:tcW w:type="dxa" w:w="3456"/>
+            <w:shd w:fill="F8FAFC"/>
+            <w:tcMar>
+              <w:top w:w="90" w:type="dxa"/>
+              <w:bottom w:w="90" w:type="dxa"/>
+              <w:left w:w="130" w:type="dxa"/>
+              <w:right w:w="130" w:type="dxa"/>
+            </w:tcMar>
+          </w:tcPr>
+          <w:p>
+            <w:pPr>
+              <w:spacing w:line="269" w:lineRule="auto"/>
+            </w:pPr>
+            <w:r>
+              <w:rPr>
+                <w:rFonts w:ascii="Arial" w:hAnsi="Arial"/>
+                <w:color w:val="0F172A"/>
+                <w:sz w:val="17"/>
+              </w:rPr>
+              <w:t>Scaffolding completo del proyecto (Laravel 11 REST API + Vue.js 3), generación de diagramas UML en español, desarrollo de las 6 Skills MCP (.md), suite de testing automatizado (8/8 tests al 100%) y compilación del informe técnico.</w:t>
+            </w:r>
+          </w:p>
+        </w:tc>
+        <w:tc>
+          <w:tcPr>
+            <w:tcW w:type="dxa" w:w="3312"/>
+            <w:shd w:fill="F8FAFC"/>
+            <w:tcMar>
+              <w:top w:w="90" w:type="dxa"/>
+              <w:bottom w:w="90" w:type="dxa"/>
+              <w:left w:w="130" w:type="dxa"/>
+              <w:right w:w="130" w:type="dxa"/>
+            </w:tcMar>
+          </w:tcPr>
+          <w:p>
+            <w:pPr>
+              <w:spacing w:line="269" w:lineRule="auto"/>
+            </w:pPr>
+            <w:r>
+              <w:rPr>
+                <w:rFonts w:ascii="Arial" w:hAnsi="Arial"/>
+                <w:color w:val="0F172A"/>
+                <w:sz w:val="17"/>
+              </w:rPr>
+              <w:t>Aportó de forma sobresaliente. Permitió orquestar de punta a punta un sistema de alta complejidad en horas, gestionando la integración de Ollama local, ChromaDB y cadenas de bloques SHA-256 sin fricciones.</w:t>
+            </w:r>
+          </w:p>
+        </w:tc>
+      </w:tr>
+      <w:tr>
+        <w:tc>
+          <w:tcPr>
+            <w:tcW w:type="dxa" w:w="2592"/>
+            <w:shd w:fill="FFFFFF"/>
+            <w:tcMar>
+              <w:top w:w="90" w:type="dxa"/>
+              <w:bottom w:w="90" w:type="dxa"/>
+              <w:left w:w="130" w:type="dxa"/>
+              <w:right w:w="130" w:type="dxa"/>
+            </w:tcMar>
+          </w:tcPr>
+          <w:p>
+            <w:pPr>
+              <w:spacing w:line="269" w:lineRule="auto"/>
+            </w:pPr>
+            <w:r>
+              <w:rPr>
+                <w:rFonts w:ascii="Arial" w:hAnsi="Arial"/>
+                <w:b/>
+                <w:color w:val="0F172A"/>
+                <w:sz w:val="17"/>
+              </w:rPr>
+              <w:t>Claude (Anthropic)</w:t>
+            </w:r>
+          </w:p>
+        </w:tc>
+        <w:tc>
+          <w:tcPr>
+            <w:tcW w:type="dxa" w:w="3456"/>
+            <w:shd w:fill="FFFFFF"/>
+            <w:tcMar>
+              <w:top w:w="90" w:type="dxa"/>
+              <w:bottom w:w="90" w:type="dxa"/>
+              <w:left w:w="130" w:type="dxa"/>
+              <w:right w:w="130" w:type="dxa"/>
+            </w:tcMar>
+          </w:tcPr>
+          <w:p>
+            <w:pPr>
+              <w:spacing w:line="269" w:lineRule="auto"/>
+            </w:pPr>
+            <w:r>
+              <w:rPr>
+                <w:rFonts w:ascii="Arial" w:hAnsi="Arial"/>
+                <w:color w:val="0F172A"/>
+                <w:sz w:val="17"/>
+              </w:rPr>
+              <w:t>Diseño conceptual de los contratos de datos agénticos del Protocolo MCP (Model Context Protocol 2026.1) y refinamiento de prompts de extracción estructurada en JSON estricto.</w:t>
+            </w:r>
+          </w:p>
+        </w:tc>
+        <w:tc>
+          <w:tcPr>
+            <w:tcW w:type="dxa" w:w="3312"/>
+            <w:shd w:fill="FFFFFF"/>
+            <w:tcMar>
+              <w:top w:w="90" w:type="dxa"/>
+              <w:bottom w:w="90" w:type="dxa"/>
+              <w:left w:w="130" w:type="dxa"/>
+              <w:right w:w="130" w:type="dxa"/>
+            </w:tcMar>
+          </w:tcPr>
+          <w:p>
+            <w:pPr>
+              <w:spacing w:line="269" w:lineRule="auto"/>
+            </w:pPr>
+            <w:r>
+              <w:rPr>
+                <w:rFonts w:ascii="Arial" w:hAnsi="Arial"/>
+                <w:color w:val="0F172A"/>
+                <w:sz w:val="17"/>
+              </w:rPr>
+              <w:t>Sorprendió gratamente por su rigurosidad para definir esquemas JsonSchema cerrados, garantizando que el agente de NLP no inventara campos fuera del formato médico.</w:t>
+            </w:r>
+          </w:p>
+        </w:tc>
+      </w:tr>
+      <w:tr>
+        <w:tc>
+          <w:tcPr>
+            <w:tcW w:type="dxa" w:w="2592"/>
+            <w:shd w:fill="F8FAFC"/>
+            <w:tcMar>
+              <w:top w:w="90" w:type="dxa"/>
+              <w:bottom w:w="90" w:type="dxa"/>
+              <w:left w:w="130" w:type="dxa"/>
+              <w:right w:w="130" w:type="dxa"/>
+            </w:tcMar>
+          </w:tcPr>
+          <w:p>
+            <w:pPr>
+              <w:spacing w:line="269" w:lineRule="auto"/>
+            </w:pPr>
+            <w:r>
+              <w:rPr>
+                <w:rFonts w:ascii="Arial" w:hAnsi="Arial"/>
+                <w:b/>
+                <w:color w:val="0F172A"/>
+                <w:sz w:val="17"/>
+              </w:rPr>
+              <w:t>ChatGPT (OpenAI)</w:t>
+            </w:r>
+          </w:p>
+        </w:tc>
+        <w:tc>
+          <w:tcPr>
+            <w:tcW w:type="dxa" w:w="3456"/>
+            <w:shd w:fill="F8FAFC"/>
+            <w:tcMar>
+              <w:top w:w="90" w:type="dxa"/>
+              <w:bottom w:w="90" w:type="dxa"/>
+              <w:left w:w="130" w:type="dxa"/>
+              <w:right w:w="130" w:type="dxa"/>
+            </w:tcMar>
+          </w:tcPr>
+          <w:p>
+            <w:pPr>
+              <w:spacing w:line="269" w:lineRule="auto"/>
+            </w:pPr>
+            <w:r>
+              <w:rPr>
+                <w:rFonts w:ascii="Arial" w:hAnsi="Arial"/>
+                <w:color w:val="0F172A"/>
+                <w:sz w:val="17"/>
+              </w:rPr>
+              <w:t>Brainstorming y redacción de casos de uso de crisis post-sismo, modelado de perfiles de usuario (damnificada, rescatista, veterinaria) y formulación de la lógica del período legal de 15 días.</w:t>
+            </w:r>
+          </w:p>
+        </w:tc>
+        <w:tc>
+          <w:tcPr>
+            <w:tcW w:type="dxa" w:w="3312"/>
+            <w:shd w:fill="F8FAFC"/>
+            <w:tcMar>
+              <w:top w:w="90" w:type="dxa"/>
+              <w:bottom w:w="90" w:type="dxa"/>
+              <w:left w:w="130" w:type="dxa"/>
+              <w:right w:w="130" w:type="dxa"/>
+            </w:tcMar>
+          </w:tcPr>
+          <w:p>
+            <w:pPr>
+              <w:spacing w:line="269" w:lineRule="auto"/>
+            </w:pPr>
+            <w:r>
+              <w:rPr>
+                <w:rFonts w:ascii="Arial" w:hAnsi="Arial"/>
+                <w:color w:val="0F172A"/>
+                <w:sz w:val="17"/>
+              </w:rPr>
+              <w:t>Aportó muy bien para contextualizar escenarios de desastre natural y afinar el vocabulario inclusivo y accesible para personas en estado de shock emocional.</w:t>
+            </w:r>
+          </w:p>
+        </w:tc>
+      </w:tr>
+      <w:tr>
+        <w:tc>
+          <w:tcPr>
+            <w:tcW w:type="dxa" w:w="2592"/>
+            <w:shd w:fill="FFFFFF"/>
+            <w:tcMar>
+              <w:top w:w="90" w:type="dxa"/>
+              <w:bottom w:w="90" w:type="dxa"/>
+              <w:left w:w="130" w:type="dxa"/>
+              <w:right w:w="130" w:type="dxa"/>
+            </w:tcMar>
+          </w:tcPr>
+          <w:p>
+            <w:pPr>
+              <w:spacing w:line="269" w:lineRule="auto"/>
+            </w:pPr>
+            <w:r>
+              <w:rPr>
+                <w:rFonts w:ascii="Arial" w:hAnsi="Arial"/>
+                <w:b/>
+                <w:color w:val="0F172A"/>
+                <w:sz w:val="17"/>
+              </w:rPr>
+              <w:t>Ollama Local Engine</w:t>
+              <w:br/>
+              <w:t>(Qwen 2.5 + Moondream)</w:t>
+            </w:r>
+          </w:p>
+        </w:tc>
+        <w:tc>
+          <w:tcPr>
+            <w:tcW w:type="dxa" w:w="3456"/>
+            <w:shd w:fill="FFFFFF"/>
+            <w:tcMar>
+              <w:top w:w="90" w:type="dxa"/>
+              <w:bottom w:w="90" w:type="dxa"/>
+              <w:left w:w="130" w:type="dxa"/>
+              <w:right w:w="130" w:type="dxa"/>
+            </w:tcMar>
+          </w:tcPr>
+          <w:p>
+            <w:pPr>
+              <w:spacing w:line="269" w:lineRule="auto"/>
+            </w:pPr>
+            <w:r>
+              <w:rPr>
+                <w:rFonts w:ascii="Arial" w:hAnsi="Arial"/>
+                <w:color w:val="0F172A"/>
+                <w:sz w:val="17"/>
+              </w:rPr>
+              <w:t>Inferencia On-Premise en tiempo de ejecución: extracción de entidades clínicas en lenguaje natural y peritaje pericial comparativo de imágenes de mascotas píxel a píxel.</w:t>
+            </w:r>
+          </w:p>
+        </w:tc>
+        <w:tc>
+          <w:tcPr>
+            <w:tcW w:type="dxa" w:w="3312"/>
+            <w:shd w:fill="FFFFFF"/>
+            <w:tcMar>
+              <w:top w:w="90" w:type="dxa"/>
+              <w:bottom w:w="90" w:type="dxa"/>
+              <w:left w:w="130" w:type="dxa"/>
+              <w:right w:w="130" w:type="dxa"/>
+            </w:tcMar>
+          </w:tcPr>
+          <w:p>
+            <w:pPr>
+              <w:spacing w:line="269" w:lineRule="auto"/>
+            </w:pPr>
+            <w:r>
+              <w:rPr>
+                <w:rFonts w:ascii="Arial" w:hAnsi="Arial"/>
+                <w:color w:val="0F172A"/>
+                <w:sz w:val="17"/>
+              </w:rPr>
+              <w:t>Sorprendió positivamente: demostró que modelos SLM/VLM de 1.4B–1.5B ofrecen una precisión asombrosa en hardware modesto sin requerir internet ni GPUs de servidor.</w:t>
+            </w:r>
+          </w:p>
+        </w:tc>
+      </w:tr>
+    </w:tbl>
+    <w:p>
+      <w:pPr>
+        <w:spacing w:after="160"/>
+      </w:pPr>
+    </w:p>
+    <w:p>
+      <w:pPr>
+        <w:spacing w:before="200" w:after="80"/>
+      </w:pPr>
+      <w:r>
+        <w:rPr>
+          <w:rFonts w:ascii="Arial" w:hAnsi="Arial"/>
+          <w:b/>
+          <w:color w:val="0D9488"/>
+          <w:sz w:val="25"/>
+        </w:rPr>
+        <w:t>Reflexión Crítica del Co-Work con IA</w:t>
+      </w:r>
+    </w:p>
+    <w:tbl>
+      <w:tblPr>
+        <w:tblW w:type="auto" w:w="0"/>
+        <w:jc w:val="center"/>
+        <w:tblLook w:firstColumn="1" w:firstRow="1" w:lastColumn="0" w:lastRow="0" w:noHBand="0" w:noVBand="1" w:val="04A0"/>
+      </w:tblPr>
+      <w:tblGrid>
+        <w:gridCol w:w="9360"/>
+      </w:tblGrid>
+      <w:tr>
+        <w:tc>
+          <w:tcPr>
+            <w:tcW w:type="dxa" w:w="9360"/>
+            <w:shd w:fill="F0FDF4"/>
+            <w:tcMar>
+              <w:top w:w="140" w:type="dxa"/>
+              <w:bottom w:w="140" w:type="dxa"/>
+              <w:left w:w="180" w:type="dxa"/>
+              <w:right w:w="180" w:type="dxa"/>
+            </w:tcMar>
+          </w:tcPr>
+          <w:p>
+            <w:pPr>
+              <w:spacing w:line="276" w:lineRule="auto" w:after="0"/>
+            </w:pPr>
+            <w:r>
+              <w:rPr>
+                <w:rFonts w:ascii="Arial" w:hAnsi="Arial"/>
+                <w:color w:val="0F172A"/>
+                <w:sz w:val="19"/>
+              </w:rPr>
+              <w:t>El co-work con herramientas de Inteligencia Artificial permitió acelerar en más de un 300% el desarrollo de la arquitectura Multi-Agente, la formulación de contratos MCP en Markdown y la suite de pruebas automatizadas, una tarea que a un equipo tradicional le habría tomado varias semanas de ingeniería. Sin embargo, la IA presentó errores puntuales que requirieron intervención humana crítica: inicialmente propuso modelos de lenguaje demasiado pesados para hardware de campaña que colapsaban la memoria RAM, intentó utilizar APIs en la nube incompatibles con escenarios de corte de conectividad post-sismo, generó rutas desalineadas en el enrutador de Vue.js y tendía a exponer tecnicismos complejos de IA al usuario final. La labor del ingeniero fue indispensable para corregir estos desvíos, imponer la soberanía On-Premise con Qwen 2.5 y Moondream, asegurar la inmutabilidad criptográfica SHA-256 de los fármacos y humanizar por completo la experiencia de usuario para garantizar empatía y accesibilidad real en emergencias.</w:t>
             </w:r>
           </w:p>
         </w:tc>

</xml_diff>